<commit_message>
docs: reword the SoftSense innovations doc in a more casual, human voice
- relax the wording across all prose and bullets to a warmer first-person
  voice (contractions, plainer language); facts, numbers and figures unchanged
- remove every em-dash from the document (body text and tables)
- keep the expert block-quotes verbatim; leave tables and figures intact
- loosen body and bullet line/paragraph spacing for a less formal feel
</commit_message>
<xml_diff>
--- a/SoftSense_Innovations_Documentation.docx
+++ b/SoftSense_Innovations_Documentation.docx
@@ -997,7 +997,7 @@
     </w:p>
     <w:p>
       <w:pPr>
-        <w:spacing w:after="100" w:before="0" w:line="300"/>
+        <w:spacing w:after="150" w:before="0" w:line="330"/>
       </w:pPr>
       <w:r>
         <w:rPr>
@@ -1010,7 +1010,7 @@
           <w:sz w:val="22"/>
           <w:szCs w:val="22"/>
         </w:rPr>
-        <w:t xml:space="preserve">We are Team Lebob, FLL Team #3236 from Perth, Western Australia, and we are the 2025 / 26 Australian National Champions of the UNEARTHED season. SoftSense is our Innovation Project. It is a low-cost, sensor-guided ROV gripper designed for one job: recovering fragile artefacts from the seafloor without destroying them.</w:t>
+        <w:t xml:space="preserve">We're Team Lebob, FLL Team #3236 from Perth, Western Australia, and we're the 2025 / 26 Australian National Champions of the UNEARTHED season. SoftSense is our Innovation Project. It's a low-cost, sensor-guided ROV gripper built for one job: recovering fragile artefacts from the seafloor without destroying them.</w:t>
       </w:r>
     </w:p>
     <w:p>
@@ -1032,7 +1032,7 @@
     </w:p>
     <w:p>
       <w:pPr>
-        <w:spacing w:after="100" w:before="0" w:line="300"/>
+        <w:spacing w:after="150" w:before="0" w:line="330"/>
       </w:pPr>
       <w:r>
         <w:rPr>
@@ -1045,12 +1045,12 @@
           <w:sz w:val="22"/>
           <w:szCs w:val="22"/>
         </w:rPr>
-        <w:t xml:space="preserve">Underwater archaeologists struggle to recover fragile artefacts from the seafloor because the manipulator arms that mount to remotely operated vehicles are designed for industrial work, not precision handling. The standard arm has two rigid metal fingers, no force feedback, and limited surface contact. That makes it clumsy with small, irregular, or brittle objects. When the wrong tool gets used in the wrong place, irreplaceable cultural heritage shatters on the seafloor and nobody knows it happened until the footage is reviewed back on the surface.</w:t>
-      </w:r>
-    </w:p>
-    <w:p>
-      <w:pPr>
-        <w:spacing w:after="100" w:before="0" w:line="300"/>
+        <w:t xml:space="preserve">Underwater archaeologists have a hard time recovering fragile artefacts from the seafloor, and the reason is that the manipulator arms bolted to remotely operated vehicles are built for industrial work, not precision handling. The standard arm has two rigid metal fingers, no force feedback, and little surface contact. That makes it clumsy with small, irregular, or brittle objects. When the wrong tool ends up in the wrong place, irreplaceable cultural heritage shatters on the seafloor, and nobody knows it happened until the footage gets reviewed back on the surface.</w:t>
+      </w:r>
+    </w:p>
+    <w:p>
+      <w:pPr>
+        <w:spacing w:after="150" w:before="0" w:line="330"/>
       </w:pPr>
       <w:r>
         <w:rPr>
@@ -1063,12 +1063,12 @@
           <w:sz w:val="22"/>
           <w:szCs w:val="22"/>
         </w:rPr>
-        <w:t xml:space="preserve">The problem is also economic, and the economics are brutal. Mobilising a maritime archaeology mission costs in the millions of dollars: vessel charter, crew wages, dive tickets, equipment shipping, port fees, insurance, fuel, permits. Months of planning go into a window of a few days on site. The expedition's recurring costs alone are punishing: boat hire runs around AUD 5,000 per day, a four-person dive team is another AUD 1,200 per day, and dive-gear maintenance and consumables add on top of that. Patrick Morrison at the WA Shipwrecks Museum walked us through the numbers and the phrase that stuck was "the clock starts the moment you leave port."</w:t>
-      </w:r>
-    </w:p>
-    <w:p>
-      <w:pPr>
-        <w:spacing w:after="100" w:before="0" w:line="300"/>
+        <w:t xml:space="preserve">The problem is economic too, and the economics are brutal. Getting a maritime archaeology mission off the ground costs millions of dollars: vessel charter, crew wages, dive tickets, equipment shipping, port fees, insurance, fuel, permits. Months of planning go into a window of a few days on site. Even the recurring costs are punishing on their own: boat hire runs around AUD 5,000 per day, a four-person dive team is another AUD 1,200 per day, and dive-gear maintenance and consumables pile on top of that. Patrick Morrison at the WA Shipwrecks Museum walked us through the numbers, and the phrase that stuck with us was "the clock starts the moment you leave port."</w:t>
+      </w:r>
+    </w:p>
+    <w:p>
+      <w:pPr>
+        <w:spacing w:after="150" w:before="0" w:line="330"/>
       </w:pPr>
       <w:r>
         <w:rPr>
@@ -1081,7 +1081,7 @@
           <w:sz w:val="22"/>
           <w:szCs w:val="22"/>
         </w:rPr>
-        <w:t xml:space="preserve">Against that cost stack, one piece of equipment failing on site can end the entire expedition. A gripper that snaps the first time it touches a fragile artefact, or shears a tooth and stops responding, or simply does not exist in the right specification on the boat, sends the team home with nothing. The mission produces a damage report instead of a recovery, the next expedition is months away because the boat and crew have to be booked again from scratch, and the artefacts that were on the seafloor for four hundred years stay there. A two-thousand-dollar tool failure can waste a million-dollar mission. That asymmetry is what makes the gripper worth taking seriously.</w:t>
+        <w:t xml:space="preserve">Against that cost stack, one piece of equipment failing on site can end the whole expedition. A gripper that snaps the first time it touches a fragile artefact, or shears a tooth and stops responding, or simply doesn't exist in the right specification on the boat, sends the team home with nothing. The mission produces a damage report instead of a recovery, the next expedition is months away because the boat and crew have to be booked again from scratch, and the artefacts that sat on the seafloor for four hundred years stay there. A two-thousand-dollar tool failure can waste a million-dollar mission. That asymmetry is what makes the gripper worth taking seriously.</w:t>
       </w:r>
     </w:p>
     <w:p>
@@ -1103,7 +1103,7 @@
     </w:p>
     <w:p>
       <w:pPr>
-        <w:spacing w:after="100" w:before="0" w:line="300"/>
+        <w:spacing w:after="150" w:before="0" w:line="330"/>
       </w:pPr>
       <w:r>
         <w:rPr>
@@ -1116,7 +1116,7 @@
           <w:sz w:val="22"/>
           <w:szCs w:val="22"/>
         </w:rPr>
-        <w:t xml:space="preserve">Talking to working archaeologists and subsea engineers, we identified four specific failure modes that the standard industrial gripper imposes on fragile recovery work:</w:t>
+        <w:t xml:space="preserve">Talking to working archaeologists and subsea engineers, we pinned down four specific failure modes that the standard industrial gripper forces onto fragile recovery work:</w:t>
       </w:r>
     </w:p>
     <w:p>
@@ -1152,7 +1152,7 @@
           <w:sz w:val="22"/>
           <w:szCs w:val="22"/>
         </w:rPr>
-        <w:t xml:space="preserve">Industrial grippers apply force without any feedback channel back to the pilot. Thin pottery, coral, bone fragments, and delicate shapes crack the first time they are held too tightly.</w:t>
+        <w:t xml:space="preserve">Industrial grippers apply force with no feedback channel back to the pilot. Thin pottery, coral, bone fragments, and delicate shapes crack the first time they're held too tightly.</w:t>
       </w:r>
     </w:p>
     <w:p>
@@ -1188,7 +1188,7 @@
           <w:sz w:val="22"/>
           <w:szCs w:val="22"/>
         </w:rPr>
-        <w:t xml:space="preserve">Flat metal jaws cannot adapt to curved, tapered, or uneven artefacts. Items slip out or cannot be lifted at all. The grippers in service today were optimised for cylindrical T-bar handles on industrial tools, not for amphorae, bones, or coral.</w:t>
+        <w:t xml:space="preserve">Flat metal jaws can't adapt to curved, tapered, or uneven artefacts. Items slip out, or can't be lifted at all. The grippers in service today were tuned for cylindrical T-bar handles on industrial tools, not for amphorae, bones, or coral.</w:t>
       </w:r>
     </w:p>
     <w:p>
@@ -1224,7 +1224,7 @@
           <w:sz w:val="22"/>
           <w:szCs w:val="22"/>
         </w:rPr>
-        <w:t xml:space="preserve">ROV operators cannot feel how much force the arm is applying, especially in low visibility water where the camera feed is the only signal. This leads to accidental crushing or drops that the operator never sees coming.</w:t>
+        <w:t xml:space="preserve">ROV operators can't feel how much force the arm is applying, especially in low visibility water where the camera feed is the only signal. That leads to accidental crushing, or drops the operator never sees coming.</w:t>
       </w:r>
     </w:p>
     <w:p>
@@ -1260,7 +1260,7 @@
           <w:sz w:val="22"/>
           <w:szCs w:val="22"/>
         </w:rPr>
-        <w:t xml:space="preserve">Mobilising archaeology equipment costs millions of dollars. A broken gripper or a missing tool means days of delay while the right part ships. These failures slow missions down, drive costs up, and can permanently destroy cultural heritage that has waited centuries to be recovered.</w:t>
+        <w:t xml:space="preserve">Getting archaeology equipment to site costs millions of dollars. A broken gripper or a missing tool means days of delay while the right part ships. These failures slow missions down, push costs up, and can permanently destroy cultural heritage that has waited centuries to be recovered.</w:t>
       </w:r>
     </w:p>
     <w:p>
@@ -1282,7 +1282,7 @@
     </w:p>
     <w:p>
       <w:pPr>
-        <w:spacing w:after="100" w:before="0" w:line="300"/>
+        <w:spacing w:after="150" w:before="0" w:line="330"/>
       </w:pPr>
       <w:r>
         <w:rPr>
@@ -1295,7 +1295,7 @@
           <w:sz w:val="22"/>
           <w:szCs w:val="22"/>
         </w:rPr>
-        <w:t xml:space="preserve">This is not a hypothetical problem. Patrick Morrison, Assistant Curator of Maritime Heritage at the WA Shipwrecks Museum, told us in our 14 May 2026 site visit:</w:t>
+        <w:t xml:space="preserve">This isn't a hypothetical problem. Patrick Morrison, Assistant Curator of Maritime Heritage at the WA Shipwrecks Museum, told us during our 14 May 2026 site visit:</w:t>
       </w:r>
     </w:p>
     <w:p>
@@ -1323,7 +1323,7 @@
     </w:p>
     <w:p>
       <w:pPr>
-        <w:spacing w:after="100" w:before="0" w:line="300"/>
+        <w:spacing w:after="150" w:before="0" w:line="330"/>
       </w:pPr>
       <w:r>
         <w:rPr>
@@ -1336,7 +1336,7 @@
           <w:sz w:val="22"/>
           <w:szCs w:val="22"/>
         </w:rPr>
-        <w:t xml:space="preserve">Multibeam sonar surveys are uncovering wrecks in the 40 to 100 metre range that were invisible to the previous generation of survey gear. There are more known sites than there is equipment to work them. Patrick described the gap directly:</w:t>
+        <w:t xml:space="preserve">Multibeam sonar surveys are turning up wrecks in the 40 to 100 metre range that were invisible to the previous generation of survey gear. There are more known sites than there is equipment to work them. Patrick described the gap directly:</w:t>
       </w:r>
     </w:p>
     <w:p>
@@ -1381,7 +1381,7 @@
     </w:p>
     <w:p>
       <w:pPr>
-        <w:spacing w:after="100" w:before="0" w:line="300"/>
+        <w:spacing w:after="150" w:before="0" w:line="330"/>
       </w:pPr>
       <w:r>
         <w:rPr>
@@ -1394,7 +1394,7 @@
           <w:sz w:val="22"/>
           <w:szCs w:val="22"/>
         </w:rPr>
-        <w:t xml:space="preserve">Our primary user is a maritime archaeology team or research institution working from a small inspection class ROV. The closest commercial reference is the Reach Robotics Bravo 7 manipulator family used by Fugro and Woodside for offshore inspection in Western Australia. The same gripper architecture also serves marine biology (gentle handling of corals, gelatinous animals, sediment samples), oceanographic research, environmental monitoring, and any subsea repair operation where standard grippers cause collateral damage.</w:t>
+        <w:t xml:space="preserve">Our main user is a maritime archaeology team or research institution working from a small inspection class ROV. The closest commercial reference is the Reach Robotics Bravo 7 manipulator family, which Fugro and Woodside use for offshore inspection in Western Australia. The same gripper architecture also fits marine biology (gentle handling of corals, gelatinous animals, sediment samples), oceanographic research, environmental monitoring, and any subsea repair job where standard grippers cause collateral damage.</w:t>
       </w:r>
     </w:p>
     <w:p>
@@ -1416,7 +1416,7 @@
     </w:p>
     <w:p>
       <w:pPr>
-        <w:spacing w:after="100" w:before="0" w:line="300"/>
+        <w:spacing w:after="150" w:before="0" w:line="330"/>
       </w:pPr>
       <w:r>
         <w:rPr>
@@ -1429,7 +1429,7 @@
           <w:sz w:val="22"/>
           <w:szCs w:val="22"/>
         </w:rPr>
-        <w:t xml:space="preserve">Lebob is eight Year 10 students and two mentors based at Perth Modern School, Subiaco. Members in roster order: Kingsley Wong (CR-01), Andre Nijman (CR-02), Sean Chan (CR-03), Oliver Liu (CR-04), Subesh Sukumaran (CR-05), Yuxin Chris Wang (CR-06), Aaron Zhang (CR-07), Leven Shi (CR-08). Mentors: Jade and Kaelie (MT-01). The workshop is home. We engineer robots, research soft-robotic mechanisms, and ship our work as documentation other teams can learn from.</w:t>
+        <w:t xml:space="preserve">Lebob is eight Year 10 students and two mentors, based at Perth Modern School, Subiaco. Members in roster order: Kingsley Wong (CR-01), Andre Nijman (CR-02), Sean Chan (CR-03), Oliver Liu (CR-04), Subesh Sukumaran (CR-05), Yuxin Chris Wang (CR-06), Aaron Zhang (CR-07), Leven Shi (CR-08). Mentors: Jade and Kaelie (MT-01). The workshop is home for us. We engineer robots, research soft-robotic mechanisms, and ship our work as documentation other teams can learn from.</w:t>
       </w:r>
     </w:p>
     <w:p>
@@ -1453,16 +1453,16 @@
           <w:sz w:val="22"/>
           <w:szCs w:val="22"/>
         </w:rPr>
-        <w:t xml:space="preserve">How we wrote this document.</w:t>
-      </w:r>
-      <w:r>
-        <w:rPr>
-          <w:rFonts w:ascii="Arial" w:cs="Arial" w:eastAsia="Arial" w:hAnsi="Arial"/>
-          <w:color w:val="1A1A1A"/>
-          <w:sz w:val="22"/>
-          <w:szCs w:val="22"/>
-        </w:rPr>
-        <w:t xml:space="preserve">   Every number in this report is either measured from the live CAD, taken from a published datasheet, or generated by a reproducible simulation. Where a value is an engineering estimate, we say so. Where a result is a rank rather than an absolute, we say so. Where a headline number changed during the project, we explain the change.</w:t>
+        <w:t xml:space="preserve">How we wrote this document. </w:t>
+      </w:r>
+      <w:r>
+        <w:rPr>
+          <w:rFonts w:ascii="Arial" w:cs="Arial" w:eastAsia="Arial" w:hAnsi="Arial"/>
+          <w:color w:val="1A1A1A"/>
+          <w:sz w:val="22"/>
+          <w:szCs w:val="22"/>
+        </w:rPr>
+        <w:t xml:space="preserve">Every number in this report is either measured from the live CAD, taken from a published datasheet, or generated by a reproducible simulation. Where a value is an engineering estimate, we say so. Where a result is a rank rather than an absolute, we say so. And where a headline number changed during the project, we explain the change.</w:t>
       </w:r>
     </w:p>
     <w:p>
@@ -1495,7 +1495,7 @@
     </w:p>
     <w:p>
       <w:pPr>
-        <w:spacing w:after="100" w:before="0" w:line="300"/>
+        <w:spacing w:after="150" w:before="0" w:line="330"/>
       </w:pPr>
       <w:r>
         <w:rPr>
@@ -1508,7 +1508,7 @@
           <w:sz w:val="22"/>
           <w:szCs w:val="22"/>
         </w:rPr>
-        <w:t xml:space="preserve">This section is for the judges. It is the project management half of the design rubric: who owns what, how we plan a 10 month season across two competitions and a Korea trip, how we meet, how we decide, and the evidence trail behind it. The five subsections below correspond directly to the DESIGN and CORE VALUES criteria a judge fills in: project plan, ownership, decision protocol, meeting cadence, and the receipts.</w:t>
+        <w:t xml:space="preserve">This section is for the judges. It's the project-management half of the design rubric: who owns what, how we plan a 10 month season across two competitions and a Korea trip, how we meet, how we decide, and the evidence trail behind all of it. The five subsections below line up directly with the DESIGN and CORE VALUES criteria a judge fills in: project plan, ownership, decision protocol, meeting cadence, and the receipts.</w:t>
       </w:r>
     </w:p>
     <w:p>
@@ -1530,7 +1530,7 @@
     </w:p>
     <w:p>
       <w:pPr>
-        <w:spacing w:after="100" w:before="0" w:line="300"/>
+        <w:spacing w:after="150" w:before="0" w:line="330"/>
       </w:pPr>
       <w:r>
         <w:rPr>
@@ -1543,7 +1543,7 @@
           <w:sz w:val="22"/>
           <w:szCs w:val="22"/>
         </w:rPr>
-        <w:t xml:space="preserve">The chart below is the season plan we worked from. Four parallel tracks (Robot, Innovation, Outreach, Logistics) and three competition milestones (Regionals, Nationals, Korea Open) on a single time axis from September 2025 to July 2026. Owner names are inside each bar where the owner is settled; bars marked [OWNER] are work packages whose lead is still being formalised for the Korea-prep stretch and will be filled in at the next team meeting.</w:t>
+        <w:t xml:space="preserve">The chart below is the season plan we worked from. It has four parallel tracks (Robot, Innovation, Outreach, Logistics) and three competition milestones (Regionals, Nationals, Korea Open) on a single time axis from September 2025 to July 2026. Owner names sit inside each bar where the owner is settled. Bars marked [OWNER] are work packages whose lead we're still formalising for the Korea-prep stretch, and we'll fill those in at the next team meeting.</w:t>
       </w:r>
     </w:p>
     <w:p>
@@ -1606,12 +1606,12 @@
           <w:sz w:val="18"/>
           <w:szCs w:val="18"/>
         </w:rPr>
-        <w:t xml:space="preserve">Figure 2.1   Team Lebob #3236 season plan. Robot track in blue, Innovation track in red, Outreach in purple, Logistics in orange. Competition milestones rendered as black diamonds.</w:t>
-      </w:r>
-    </w:p>
-    <w:p>
-      <w:pPr>
-        <w:spacing w:after="100" w:before="0" w:line="300"/>
+        <w:t xml:space="preserve">Figure 2.1   Team Lebob #3236 season plan. The Robot track is blue, the Innovation track is red, Outreach is purple, and Logistics is orange. Competition milestones show up as black diamonds.</w:t>
+      </w:r>
+    </w:p>
+    <w:p>
+      <w:pPr>
+        <w:spacing w:after="150" w:before="0" w:line="330"/>
       </w:pPr>
       <w:r>
         <w:rPr>
@@ -1624,7 +1624,7 @@
           <w:sz w:val="22"/>
           <w:szCs w:val="22"/>
         </w:rPr>
-        <w:t xml:space="preserve">How we used the plan. The Gantt is not a back-fill; it is the planning surface we rebuilt at four points in the season: at start (September), after Regionals (when the FEA campaign and the materials reframe got scheduled), at Nationals (when the Korea-prep block was added), and now (post-Nationals, in response to the judges' feedback that the plan should be visible in the documentation). Each rebuild was a 30 to 60 minute whiteboard session with the whole team; the photo of the most recent rebuild is in §2.5.</w:t>
+        <w:t xml:space="preserve">How we used the plan. The Gantt isn't a back-fill. It's the planning surface we rebuilt at four points in the season: at the start (September), after Regionals (when we scheduled the FEA campaign and the materials reframe), at Nationals (when we added the Korea-prep block), and now (post-Nationals, answering the judges' feedback that the plan should be visible in the documentation). Each rebuild was a 30 to 60 minute whiteboard session with the whole team, and the photo of the most recent one is in §2.5.</w:t>
       </w:r>
     </w:p>
     <w:p>
@@ -1646,7 +1646,7 @@
     </w:p>
     <w:p>
       <w:pPr>
-        <w:spacing w:after="100" w:before="0" w:line="300"/>
+        <w:spacing w:after="150" w:before="0" w:line="330"/>
       </w:pPr>
       <w:r>
         <w:rPr>
@@ -1659,7 +1659,7 @@
           <w:sz w:val="22"/>
           <w:szCs w:val="22"/>
         </w:rPr>
-        <w:t xml:space="preserve">Eight student members plus two mentors. Each member owns at least one work package; most own more than one. The table below maps the public roster (lebob.com.au) to the work each member led in the 2025/26 season. Where a role is shared, we name the co-owner.</w:t>
+        <w:t xml:space="preserve">Eight student members plus two mentors. Each member owns at least one work package, and most own more than one. The table below maps the public roster (lebob.com.au) to the work each member led in the 2025/26 season. Where a role is shared, we name the co-owner.</w:t>
       </w:r>
     </w:p>
     <w:tbl>
@@ -2832,7 +2832,7 @@
           <w:sz w:val="22"/>
           <w:szCs w:val="22"/>
         </w:rPr>
-        <w:t xml:space="preserve">   Every member ownership line above (except Andre's, Sean's, and Aaron's, which are verifiable from the public GitHub history and team website) is a placeholder representing the team's best current understanding of who owns what. The lines will be confirmed by each member at the next team meeting and the documentation reissued before Korea. We are using this drafting cycle to capture every member's contribution by name rather than the generic "whole team" shorthand. The judges' Nationals feedback was explicit on this point and we are taking it directly.</w:t>
+        <w:t xml:space="preserve">   Every member-ownership line above is a placeholder showing the team's best current read on who owns what. The exceptions are Andre's, Sean's, and Aaron's, which you can verify from the public GitHub history and the team website. Each member will confirm their line at the next team meeting, and we'll reissue the documentation before Korea. We're using this drafting cycle to capture every member's contribution by name instead of the generic "whole team" shorthand. The judges' Nationals feedback was explicit on this point, and we're taking it directly.</w:t>
       </w:r>
     </w:p>
     <w:p>
@@ -2854,7 +2854,7 @@
     </w:p>
     <w:p>
       <w:pPr>
-        <w:spacing w:after="100" w:before="0" w:line="300"/>
+        <w:spacing w:after="150" w:before="0" w:line="330"/>
       </w:pPr>
       <w:r>
         <w:rPr>
@@ -2867,7 +2867,7 @@
           <w:sz w:val="22"/>
           <w:szCs w:val="22"/>
         </w:rPr>
-        <w:t xml:space="preserve">How we decide what to build, what to scrap, and what to escalate. Three levels:</w:t>
+        <w:t xml:space="preserve">Here's how we decide what to build, what to scrap, and what to escalate. There are three levels:</w:t>
       </w:r>
     </w:p>
     <w:p>
@@ -2903,7 +2903,7 @@
           <w:sz w:val="22"/>
           <w:szCs w:val="22"/>
         </w:rPr>
-        <w:t xml:space="preserve">are made by the workstream owner. Sean does not need a vote to refactor the mission menu; Andre does not need a vote to change a Fin Ray rib angle. Owners commit to their workstream and report back at the next meeting.</w:t>
+        <w:t xml:space="preserve">are made by the workstream owner. Sean doesn't need a vote to refactor the mission menu, and Andre doesn't need a vote to change a Fin Ray rib angle. Owners commit to their workstream and report back at the next meeting.</w:t>
       </w:r>
     </w:p>
     <w:p>
@@ -2939,7 +2939,7 @@
           <w:sz w:val="22"/>
           <w:szCs w:val="22"/>
         </w:rPr>
-        <w:t xml:space="preserve">happen when a choice affects more than one workstream (a robot redesign that changes attachment mounts; a SoftSense material change that affects the build schedule; a sponsorship that requires a logo on the team shirt). These go to a meeting vote with a simple majority; the mentors have observer roles but not voting roles.</w:t>
+        <w:t xml:space="preserve">happen when a choice touches more than one workstream (a robot redesign that changes attachment mounts, a SoftSense material change that affects the build schedule, or a sponsorship that needs a logo on the team shirt). These go to a meeting vote with a simple majority. The mentors have observer roles but not voting roles.</w:t>
       </w:r>
     </w:p>
     <w:p>
@@ -2975,12 +2975,12 @@
           <w:sz w:val="22"/>
           <w:szCs w:val="22"/>
         </w:rPr>
-        <w:t xml:space="preserve">is required for two things only: anything that affects safety (workshop equipment, travel) and anything that commits money outside the agreed budget. Mentors do not direct technical choices; they hold the safety and financial backstop.</w:t>
-      </w:r>
-    </w:p>
-    <w:p>
-      <w:pPr>
-        <w:spacing w:after="100" w:before="0" w:line="300"/>
+        <w:t xml:space="preserve">is required for two things only: anything that affects safety (workshop equipment, travel) and anything that commits money outside the agreed budget. Mentors don't direct technical choices. They hold the safety and financial backstop.</w:t>
+      </w:r>
+    </w:p>
+    <w:p>
+      <w:pPr>
+        <w:spacing w:after="150" w:before="0" w:line="330"/>
       </w:pPr>
       <w:r>
         <w:rPr>
@@ -2993,7 +2993,7 @@
           <w:sz w:val="22"/>
           <w:szCs w:val="22"/>
         </w:rPr>
-        <w:t xml:space="preserve">The boundary between mentor input and student ownership is deliberate. FLL Core Values explicitly judge student ownership of the work, and the protocol above is what keeps that line clean. The Innovation Project is student-led; the mentors are advisors, not collaborators on the engineering.</w:t>
+        <w:t xml:space="preserve">The line between mentor input and student ownership is deliberate. FLL Core Values explicitly judge student ownership of the work, and the protocol above is what keeps that line clean. The Innovation Project is student-led, and the mentors are advisors, not collaborators on the engineering.</w:t>
       </w:r>
     </w:p>
     <w:p>
@@ -3015,7 +3015,7 @@
     </w:p>
     <w:p>
       <w:pPr>
-        <w:spacing w:after="100" w:before="0" w:line="300"/>
+        <w:spacing w:after="150" w:before="0" w:line="330"/>
       </w:pPr>
       <w:r>
         <w:rPr>
@@ -3028,7 +3028,7 @@
           <w:sz w:val="22"/>
           <w:szCs w:val="22"/>
         </w:rPr>
-        <w:t xml:space="preserve">The team meets on a regular weekly cadence during term time, with extra weekend sessions in the four weeks before each competition. The format is fixed so meetings are predictable and short:</w:t>
+        <w:t xml:space="preserve">The team meets on a regular weekly cadence during term time, with extra weekend sessions in the four weeks before each competition. The format is fixed so meetings stay predictable and short:</w:t>
       </w:r>
     </w:p>
     <w:tbl>
@@ -3868,7 +3868,7 @@
     </w:p>
     <w:p>
       <w:pPr>
-        <w:spacing w:after="100" w:before="0" w:line="300"/>
+        <w:spacing w:after="150" w:before="0" w:line="330"/>
       </w:pPr>
       <w:r>
         <w:rPr>
@@ -3881,7 +3881,7 @@
           <w:sz w:val="22"/>
           <w:szCs w:val="22"/>
         </w:rPr>
-        <w:t xml:space="preserve">Meeting minutes. Each meeting has a rotating scribe (a different member each week, mentor included) who captures decisions, action items with owners, and any blocked work needing escalation. Minutes live in the team Google Drive and are linked from each week's standup agenda. The judges flagged minutes as a specific EXCEEDS criterion at Nationals; the existing system was informal and we have formalised it for the Korea cycle.</w:t>
+        <w:t xml:space="preserve">Meeting minutes. Each meeting has a rotating scribe (a different member each week, mentor included) who captures decisions, action items with owners, and any blocked work that needs escalation. Minutes live in the team Google Drive and are linked from each week's standup agenda. The judges flagged minutes as a specific EXCEEDS criterion at Nationals. The old system was informal, so we've formalised it for the Korea cycle.</w:t>
       </w:r>
     </w:p>
     <w:p>
@@ -3903,7 +3903,7 @@
     </w:p>
     <w:p>
       <w:pPr>
-        <w:spacing w:after="100" w:before="0" w:line="300"/>
+        <w:spacing w:after="150" w:before="0" w:line="330"/>
       </w:pPr>
       <w:r>
         <w:rPr>
@@ -3916,7 +3916,7 @@
           <w:sz w:val="22"/>
           <w:szCs w:val="22"/>
         </w:rPr>
-        <w:t xml:space="preserve">The Nationals reviewer wrote, verbatim: "we saw a table with grip data but no pictures of it operating/testing or an explicit demonstration of the electronics." That feedback drives this subsection. From now until Korea, every bench test, every build session, and every expert meeting is photographed and the photo gets a date and a caption. The frames below are placeholders; the live versions sit in the team Google Drive and will be inserted before the final pre-Korea reissue of this document.</w:t>
+        <w:t xml:space="preserve">The Nationals reviewer wrote, verbatim: "we saw a table with grip data but no pictures of it operating/testing or an explicit demonstration of the electronics." That feedback drives this subsection. From now until Korea, we photograph every bench test, every build session, and every expert meeting, and each photo gets a date and a caption. The frames below are placeholders. The live versions sit in the team Google Drive and will go in before the final pre-Korea reissue of this document.</w:t>
       </w:r>
     </w:p>
     <w:tbl>
@@ -4718,7 +4718,7 @@
     </w:p>
     <w:p>
       <w:pPr>
-        <w:spacing w:after="100" w:before="0" w:line="300"/>
+        <w:spacing w:after="150" w:before="0" w:line="330"/>
       </w:pPr>
       <w:r>
         <w:rPr>
@@ -4731,7 +4731,7 @@
           <w:sz w:val="22"/>
           <w:szCs w:val="22"/>
         </w:rPr>
-        <w:t xml:space="preserve">SoftSense upgrades the standard ROV gripper by combining four innovations that directly target the four failure modes from §1. Each one was tested, each one was reviewed by a working expert, and each one is described below in the order we built it.</w:t>
+        <w:t xml:space="preserve">SoftSense takes the standard ROV gripper and adds four innovations that each go straight after one of the four failure modes from §1. We tested every one, a working expert reviewed every one, and we describe them below in the order we built them.</w:t>
       </w:r>
     </w:p>
     <w:p>
@@ -4794,7 +4794,7 @@
           <w:sz w:val="18"/>
           <w:szCs w:val="18"/>
         </w:rPr>
-        <w:t xml:space="preserve">Figure 2.1   The SoftSense end effector with the cover removed, alongside the actuator ladder we surveyed. The gripper itself is one part; the actuator is the modularity swap point that sets the depth rating.</w:t>
+        <w:t xml:space="preserve">Figure 2.1   The SoftSense end effector with the cover removed, next to the actuator ladder we surveyed. The gripper itself is one part, and the actuator is the modularity swap point that sets the depth rating.</w:t>
       </w:r>
     </w:p>
     <w:p>
@@ -4816,7 +4816,7 @@
     </w:p>
     <w:p>
       <w:pPr>
-        <w:spacing w:after="100" w:before="0" w:line="300"/>
+        <w:spacing w:after="150" w:before="0" w:line="330"/>
       </w:pPr>
       <w:r>
         <w:rPr>
@@ -4829,12 +4829,12 @@
           <w:sz w:val="22"/>
           <w:szCs w:val="22"/>
         </w:rPr>
-        <w:t xml:space="preserve">Each fingertip carries a flexible foam pad so the arm no longer presses metal against the artefact. The soft pad spreads the gripping force across a wider area, lowering peak stress on fragile material. This reduces breakage risk and lets the arm safely handle smooth and curved surfaces, such as vases, bones, and rounded stone fragments. Where a rigid jaw point-loads a 4 mm patch of pottery rim, a foam pad distributes the same total force across roughly ten times the area.</w:t>
-      </w:r>
-    </w:p>
-    <w:p>
-      <w:pPr>
-        <w:spacing w:after="100" w:before="0" w:line="300"/>
+        <w:t xml:space="preserve">Each fingertip wears a flexible foam pad, so the arm no longer presses metal against the artefact. The soft pad spreads the gripping force over a wider area and lowers peak stress on fragile material. That cuts the risk of breakage and lets the arm safely handle smooth and curved surfaces like vases, bones, and rounded stone fragments. Where a rigid jaw point-loads a 4 mm patch of pottery rim, a foam pad spreads the same total force over roughly ten times the area.</w:t>
+      </w:r>
+    </w:p>
+    <w:p>
+      <w:pPr>
+        <w:spacing w:after="150" w:before="0" w:line="330"/>
       </w:pPr>
       <w:r>
         <w:rPr>
@@ -4847,7 +4847,7 @@
           <w:sz w:val="22"/>
           <w:szCs w:val="22"/>
         </w:rPr>
-        <w:t xml:space="preserve">In our 2 finger versus 4 finger bench test (§15), the 4 finger configuration outperformed 2 finger on smooth or round geometry (the vase) and on poor grip feature geometry (the bone), and tied on regular feature geometry (the anchor and chest). That is the soft pad's contribution made measurable: four pads conforming to an awkward shape beats two flat jaws every time the shape stops being a T-bar handle.</w:t>
+        <w:t xml:space="preserve">In our 2 finger versus 4 finger bench test (§15), the 4 finger setup beat 2 finger on smooth or round geometry (the vase) and on poor grip feature geometry (the bone), and it tied on regular feature geometry (the anchor and chest). That is the soft pad's contribution made measurable: four pads conforming to an awkward shape beats two flat jaws every time the shape stops being a T-bar handle.</w:t>
       </w:r>
     </w:p>
     <w:p>
@@ -4869,7 +4869,7 @@
     </w:p>
     <w:p>
       <w:pPr>
-        <w:spacing w:after="100" w:before="0" w:line="300"/>
+        <w:spacing w:after="150" w:before="0" w:line="330"/>
       </w:pPr>
       <w:r>
         <w:rPr>
@@ -4882,12 +4882,12 @@
           <w:sz w:val="22"/>
           <w:szCs w:val="22"/>
         </w:rPr>
-        <w:t xml:space="preserve">Underneath every foam pad sits a calibrated pressure sensor. These sensors continuously stream a force reading to the pilot's console, and optionally into our auto-stop control loop that halts the actuator the moment pressure passes a configurable threshold. The pilot finally gets an early warning before crushing something. The control code can hold different presets per artefact class: a low threshold for coral, a different one for bone, a different one for ceramic.</w:t>
-      </w:r>
-    </w:p>
-    <w:p>
-      <w:pPr>
-        <w:spacing w:after="100" w:before="0" w:line="300"/>
+        <w:t xml:space="preserve">Under every foam pad sits a calibrated pressure sensor. These sensors stream a force reading to the pilot's console without a break, and optionally into our auto-stop control loop, which halts the actuator the moment pressure crosses a configurable threshold. The pilot finally gets an early warning before crushing something. The control code can hold a different preset per artefact class: a low threshold for coral, another for bone, another for ceramic.</w:t>
+      </w:r>
+    </w:p>
+    <w:p>
+      <w:pPr>
+        <w:spacing w:after="150" w:before="0" w:line="330"/>
       </w:pPr>
       <w:r>
         <w:rPr>
@@ -4900,12 +4900,12 @@
           <w:sz w:val="22"/>
           <w:szCs w:val="22"/>
         </w:rPr>
-        <w:t xml:space="preserve">David Howard, in his Regionals feedback, identified a subtle confounder: as the gripper descends, ambient water pressure rises by roughly 1 atmosphere every 10 metres. A naïve pressure sensor would read "squeeze" when there is none. Our fix is a second pressure sensor on the main body of the claw that measures ambient water pressure. The control code subtracts ambient from each pad reading and recovers an accurate squeeze value at any depth.</w:t>
-      </w:r>
-    </w:p>
-    <w:p>
-      <w:pPr>
-        <w:spacing w:after="100" w:before="0" w:line="300"/>
+        <w:t xml:space="preserve">David Howard, in his Regionals feedback, spotted a subtle confounder. As the gripper descends, ambient water pressure rises by roughly 1 atmosphere every 10 metres, so a naïve pressure sensor would read "squeeze" when there is none. Our fix is a second pressure sensor on the main body of the claw that measures ambient water pressure. The control code subtracts ambient from each pad reading and recovers an accurate squeeze value at any depth.</w:t>
+      </w:r>
+    </w:p>
+    <w:p>
+      <w:pPr>
+        <w:spacing w:after="150" w:before="0" w:line="330"/>
       </w:pPr>
       <w:r>
         <w:rPr>
@@ -4918,7 +4918,7 @@
           <w:sz w:val="22"/>
           <w:szCs w:val="22"/>
         </w:rPr>
-        <w:t xml:space="preserve">Patrick Morrison flagged a second concern at our 14 May site visit. Foam under pressure compresses; air pockets inside the foam shrink with depth. His suggested countermeasures are oil filling (incompressible), moving the sensing to the joints via encoders, or a differential pressure sensor that reads pad minus ambient mechanically rather than in software. All three are on our roadmap for the post-Korea engineering iteration.</w:t>
+        <w:t xml:space="preserve">Patrick Morrison raised a second concern at our 14 May site visit. Foam under pressure compresses, and the air pockets inside it shrink with depth. He suggested a few countermeasures: oil filling (incompressible), moving the sensing to the joints with encoders, or a differential pressure sensor that reads pad minus ambient mechanically rather than in software. All three are on our roadmap for the post-Korea engineering iteration.</w:t>
       </w:r>
     </w:p>
     <w:p>
@@ -4963,7 +4963,7 @@
     </w:p>
     <w:p>
       <w:pPr>
-        <w:spacing w:after="100" w:before="0" w:line="300"/>
+        <w:spacing w:after="150" w:before="0" w:line="330"/>
       </w:pPr>
       <w:r>
         <w:rPr>
@@ -4976,12 +4976,12 @@
           <w:sz w:val="22"/>
           <w:szCs w:val="22"/>
         </w:rPr>
-        <w:t xml:space="preserve">All four pads and their sensors sit on a rotating platform inside the gripper body. The platform lets the gripper align its contact patches to the angle of the artefact automatically, increasing the surface area that actually touches the object. More contact area at the same total force means lower local pressure and less crush risk. Rotation also relaxes how precisely the ROV pilot has to position the arm in the first place: the platform finds the angle the pilot could not.</w:t>
-      </w:r>
-    </w:p>
-    <w:p>
-      <w:pPr>
-        <w:spacing w:after="100" w:before="0" w:line="300"/>
+        <w:t xml:space="preserve">All four pads and their sensors ride on a rotating platform inside the gripper body. The platform lets the gripper line up its contact patches to the angle of the artefact on its own, which grows the surface area that actually touches the object. More contact area at the same total force means lower local pressure and less crush risk. Rotation also eases how precisely the ROV pilot has to place the arm in the first place, because the platform finds the angle the pilot could not.</w:t>
+      </w:r>
+    </w:p>
+    <w:p>
+      <w:pPr>
+        <w:spacing w:after="150" w:before="0" w:line="330"/>
       </w:pPr>
       <w:r>
         <w:rPr>
@@ -4994,7 +4994,7 @@
           <w:sz w:val="22"/>
           <w:szCs w:val="22"/>
         </w:rPr>
-        <w:t xml:space="preserve">This feature is specified but not built into the current scaled prototype. The mechanism is reserved for the 1:1 production version. We chose to document what the prototype does and does not show: at the FLL scale the rotating platform adds complexity without showing its real benefit, because the prototype objects are also scaled.</w:t>
+        <w:t xml:space="preserve">We have specified this feature but not built it into the current scaled prototype. The mechanism is reserved for the 1:1 production version. We chose to document what the prototype does and does not show: at the FLL scale the rotating platform adds complexity without showing its real benefit, since the prototype objects are scaled too.</w:t>
       </w:r>
     </w:p>
     <w:p>
@@ -5016,7 +5016,7 @@
     </w:p>
     <w:p>
       <w:pPr>
-        <w:spacing w:after="100" w:before="0" w:line="300"/>
+        <w:spacing w:after="150" w:before="0" w:line="330"/>
       </w:pPr>
       <w:r>
         <w:rPr>
@@ -5029,12 +5029,12 @@
           <w:sz w:val="22"/>
           <w:szCs w:val="22"/>
         </w:rPr>
-        <w:t xml:space="preserve">The whole gripper is designed as a swappable, 3D printed module. The structural body costs around AUD 100 in filament. Archaeologists carry several spares onto a mission and swap a broken module in the field instead of waiting days for a replacement to ship. Better still, because the parts are 3D printed, the crew can carry a small printer on the support vessel and produce a custom grip or new tool on deck while the dive plan continues.</w:t>
-      </w:r>
-    </w:p>
-    <w:p>
-      <w:pPr>
-        <w:spacing w:after="100" w:before="0" w:line="300"/>
+        <w:t xml:space="preserve">The whole gripper is built as a swappable, 3D printed module. The structural body costs around AUD 100 in filament. Archaeologists can carry several spares onto a mission and swap a broken module in the field instead of waiting days for a replacement to ship. Better still, because the parts are 3D printed, the crew can bring a small printer on the support vessel and run off a custom grip or a new tool on deck while the dive plan keeps going.</w:t>
+      </w:r>
+    </w:p>
+    <w:p>
+      <w:pPr>
+        <w:spacing w:after="150" w:before="0" w:line="330"/>
       </w:pPr>
       <w:r>
         <w:rPr>
@@ -5047,7 +5047,7 @@
           <w:sz w:val="22"/>
           <w:szCs w:val="22"/>
         </w:rPr>
-        <w:t xml:space="preserve">This attacks the cost-and-time problem directly. The biggest line item in archaeology is not the gripper, it is the cost of the day. When the gripper fails, the day is wasted; when the gripper can be replaced from a tote in the wet lab, the mission keeps moving. Tim MacDonald (Inkfish, formerly of the DSV Limiting Factor) confirmed this directly when we called him after Regionals:</w:t>
+        <w:t xml:space="preserve">This goes straight at the cost-and-time problem. The biggest line item in archaeology is not the gripper, it is the cost of the day. When the gripper fails, the day is wasted; when the gripper can be replaced from a tote in the wet lab, the mission keeps moving. Tim MacDonald (Inkfish, formerly of the DSV Limiting Factor) confirmed this directly when we called him after Regionals:</w:t>
       </w:r>
     </w:p>
     <w:p>
@@ -5092,7 +5092,7 @@
     </w:p>
     <w:p>
       <w:pPr>
-        <w:spacing w:after="100" w:before="0" w:line="300"/>
+        <w:spacing w:after="150" w:before="0" w:line="330"/>
       </w:pPr>
       <w:r>
         <w:rPr>
@@ -5105,7 +5105,7 @@
           <w:sz w:val="22"/>
           <w:szCs w:val="22"/>
         </w:rPr>
-        <w:t xml:space="preserve">Four soft pads spread force; four pressure sensors keep the pilot informed and the actuator safe; a rotating platform brings more pad area into contact with whatever shape the artefact happens to be; and a modular kit shape means the whole gripper is treated as a consumable, not a capital expense. Together, the four innovations turn a basic industrial gripper into an intelligent, adaptable archaeological tool. It protects fragile objects, improves pilot accuracy, and addresses the biggest limitations of today's two-finger manipulators.</w:t>
+        <w:t xml:space="preserve">Four soft pads spread force; four pressure sensors keep the pilot informed and the actuator safe; a rotating platform brings more pad area into contact with whatever shape the artefact happens to be; and a modular kit shape means the whole gripper is treated as a consumable, not a capital expense. Put together, the four innovations turn a basic industrial gripper into an intelligent, adaptable archaeological tool. It protects fragile objects, improves pilot accuracy, and tackles the biggest limitations of today's two-finger manipulators.</w:t>
       </w:r>
     </w:p>
     <w:p>
@@ -5138,7 +5138,7 @@
     </w:p>
     <w:p>
       <w:pPr>
-        <w:spacing w:after="100" w:before="0" w:line="300"/>
+        <w:spacing w:after="150" w:before="0" w:line="330"/>
       </w:pPr>
       <w:r>
         <w:rPr>
@@ -5151,7 +5151,7 @@
           <w:sz w:val="22"/>
           <w:szCs w:val="22"/>
         </w:rPr>
-        <w:t xml:space="preserve">The end effector has a single degree of freedom. One input shaft rotates; both fingers open and close symmetrically and splay outward as they open to give a funnel-mouth catch. Everything else flows from that one rotation.</w:t>
+        <w:t xml:space="preserve">The end effector has a single degree of freedom. One input shaft rotates, and both fingers open and close symmetrically, splaying outward as they open to give a funnel-mouth catch. Everything else follows from that one rotation.</w:t>
       </w:r>
     </w:p>
     <w:p>
@@ -5236,7 +5236,7 @@
     </w:p>
     <w:p>
       <w:pPr>
-        <w:spacing w:after="100" w:before="0" w:line="300"/>
+        <w:spacing w:after="150" w:before="0" w:line="330"/>
       </w:pPr>
       <w:r>
         <w:rPr>
@@ -5249,12 +5249,12 @@
           <w:sz w:val="22"/>
           <w:szCs w:val="22"/>
         </w:rPr>
-        <w:t xml:space="preserve">Two equal spur sector gears mesh on the centreline. The left sector carries an integral crown gear on its top face. A small spur input pinion on a vertical shaft drives that crown, a right-angle stage that lets the drive shaft exit out of the housing bottom. From the operator's side the gripper has one input shaft going in and two symmetric fingers coming out.</w:t>
-      </w:r>
-    </w:p>
-    <w:p>
-      <w:pPr>
-        <w:spacing w:after="100" w:before="0" w:line="300"/>
+        <w:t xml:space="preserve">Two equal spur sector gears mesh on the centreline. The left sector carries an integral crown gear on its top face. A small spur input pinion on a vertical shaft drives that crown, a right-angle stage that lets the drive shaft exit out of the housing bottom. From the operator's side, the gripper has one input shaft going in and two symmetric fingers coming out.</w:t>
+      </w:r>
+    </w:p>
+    <w:p>
+      <w:pPr>
+        <w:spacing w:after="150" w:before="0" w:line="330"/>
       </w:pPr>
       <w:r>
         <w:rPr>
@@ -5267,7 +5267,7 @@
           <w:sz w:val="22"/>
           <w:szCs w:val="22"/>
         </w:rPr>
-        <w:t xml:space="preserve">Each sector gear is also the crank of a non-parallelogram four-bar linkage. The finger is rigid with the coupler. The link lengths give a translate-apart motion plus roughly 18° of outward splay across the travel, and we sized them so the transmission angle stays well clear of any dead point (it varies from 71.7° to 34.6° across the open stroke).</w:t>
+        <w:t xml:space="preserve">Each sector gear doubles as the crank of a non-parallelogram four-bar linkage. The finger is rigid with the coupler. The link lengths give a translate-apart motion plus roughly 18° of outward splay across the travel, and we sized them so the transmission angle stays well clear of any dead point (it varies from 71.7° to 34.6° across the open stroke).</w:t>
       </w:r>
     </w:p>
     <w:p>
@@ -5330,7 +5330,7 @@
           <w:sz w:val="18"/>
           <w:szCs w:val="18"/>
         </w:rPr>
-        <w:t xml:space="preserve">Figure 3.2   Internal layout. The front cover lifts off to expose the four-bar linkage and the crown-pinion drive stage; the input shaft exits the bottom face of the housing.</w:t>
+        <w:t xml:space="preserve">Figure 3.2   Internal layout. The front cover lifts off to expose the four-bar linkage and the crown-pinion drive stage, and the input shaft exits the bottom face of the housing.</w:t>
       </w:r>
     </w:p>
     <w:p>
@@ -5352,7 +5352,7 @@
     </w:p>
     <w:p>
       <w:pPr>
-        <w:spacing w:after="100" w:before="0" w:line="300"/>
+        <w:spacing w:after="150" w:before="0" w:line="330"/>
       </w:pPr>
       <w:r>
         <w:rPr>
@@ -5365,7 +5365,7 @@
           <w:sz w:val="22"/>
           <w:szCs w:val="22"/>
         </w:rPr>
-        <w:t xml:space="preserve">X is jaw open/close (right is positive), Y is toward the fingertips, Z is depth and the gear axis. All units are millimetres. The dimensions below come from the parametric CAD source of truth.</w:t>
+        <w:t xml:space="preserve">X is jaw open/close (right is positive), Y is toward the fingertips, and Z is depth and the gear axis. All units are millimetres. The dimensions below come from the parametric CAD source of truth.</w:t>
       </w:r>
     </w:p>
     <w:tbl>
@@ -6409,7 +6409,7 @@
     </w:p>
     <w:p>
       <w:pPr>
-        <w:spacing w:after="100" w:before="0" w:line="300"/>
+        <w:spacing w:after="150" w:before="0" w:line="330"/>
       </w:pPr>
       <w:r>
         <w:rPr>
@@ -6444,7 +6444,7 @@
     </w:p>
     <w:p>
       <w:pPr>
-        <w:spacing w:after="100" w:before="0" w:line="300"/>
+        <w:spacing w:after="150" w:before="0" w:line="330"/>
       </w:pPr>
       <w:r>
         <w:rPr>
@@ -6457,12 +6457,12 @@
           <w:sz w:val="22"/>
           <w:szCs w:val="22"/>
         </w:rPr>
-        <w:t xml:space="preserve">Each finger is a passive Fin Ray compliant truss in TPU. The architecture is a thin contact beam (1.2 mm), a sharply tapered compliant spine (1.8 mm), and 14 fine 1.6 mm slanted ribs with hollow cells. The four foam pads with their pressure sensors sit on the contact face. We verified that the two TPU fingers build as valid solids with 0.0 mm³ interference at the closed pose at every finger scale we ship (0.7×, 1.0×, 1.6×).</w:t>
-      </w:r>
-    </w:p>
-    <w:p>
-      <w:pPr>
-        <w:spacing w:after="100" w:before="0" w:line="300"/>
+        <w:t xml:space="preserve">Each finger is a passive Fin Ray compliant truss in TPU. The architecture is a thin contact beam (1.2 mm), a sharply tapered compliant spine (1.8 mm), and 14 fine 1.6 mm slanted ribs with hollow cells. The four foam pads and their pressure sensors sit on the contact face. We checked that the two TPU fingers build as valid solids with 0.0 mm³ interference at the closed pose at every finger scale we ship (0.7×, 1.0×, 1.6×).</w:t>
+      </w:r>
+    </w:p>
+    <w:p>
+      <w:pPr>
+        <w:spacing w:after="150" w:before="0" w:line="330"/>
       </w:pPr>
       <w:r>
         <w:rPr>
@@ -6475,7 +6475,7 @@
           <w:sz w:val="22"/>
           <w:szCs w:val="22"/>
         </w:rPr>
-        <w:t xml:space="preserve">The enclosure is a single open-front housing with a snap-on front cover. Inside sit the two sector gears, the four-bar links, and the crown-pinion stage. Outside are the M4 bottom mounting flange, the vertical input shaft, eight drain and flood paths (four bottom plus two per side wall), four snap-clip windows, the two top slots where the link arms exit, four axle bore floods through the back wall, and three Ø1.8 mm cover vents. Every part is a single solid with exactly one shell. There is no enclosed void anywhere in the assembly, which is what makes the design safe to flood.</w:t>
+        <w:t xml:space="preserve">The enclosure is a single open-front housing with a snap-on front cover. Inside sit the two sector gears, the four-bar links, and the crown-pinion stage. Outside are the M4 bottom mounting flange, the vertical input shaft, eight drain and flood paths (four bottom plus two per side wall), four snap-clip windows, the two top slots where the link arms exit, four axle bore floods through the back wall, and three Ø1.8 mm cover vents. Every part is a single solid with exactly one shell. There is no enclosed void anywhere in the assembly, and that is what makes the design safe to flood.</w:t>
       </w:r>
     </w:p>
     <w:p>
@@ -6571,7 +6571,7 @@
     </w:p>
     <w:p>
       <w:pPr>
-        <w:spacing w:after="100" w:before="0" w:line="300"/>
+        <w:spacing w:after="150" w:before="0" w:line="330"/>
       </w:pPr>
       <w:r>
         <w:rPr>
@@ -6584,7 +6584,7 @@
           <w:sz w:val="22"/>
           <w:szCs w:val="22"/>
         </w:rPr>
-        <w:t xml:space="preserve">We did not want to print a hundred fingers and break them in a bucket of water. That is slow, expensive, and biased toward the geometries we happened to think of first. Instead we built a physics model of the finger and ran a design search through it, scoring every candidate against a battery of objects, and only committed a geometry once it won in software and survived independent validation. This section is how that campaign ran.</w:t>
+        <w:t xml:space="preserve">We didn't want to print a hundred fingers and snap them one by one in a bucket of water. That's slow, expensive, and biased toward the shapes we happened to think of first. So instead we built a physics model of the finger and ran a design search through it, scoring every candidate against a battery of objects, and we only committed to a geometry once it won in software and survived independent validation. This section walks through how that ran.</w:t>
       </w:r>
     </w:p>
     <w:p>
@@ -6606,7 +6606,7 @@
     </w:p>
     <w:p>
       <w:pPr>
-        <w:spacing w:after="100" w:before="0" w:line="300"/>
+        <w:spacing w:after="150" w:before="0" w:line="330"/>
       </w:pPr>
       <w:r>
         <w:rPr>
@@ -6619,7 +6619,7 @@
           <w:sz w:val="22"/>
           <w:szCs w:val="22"/>
         </w:rPr>
-        <w:t xml:space="preserve">A Fin Ray finger is a compliant triangular truss: when you push its contact face against an object, the internal ribs make the whole finger curl inward and wrap. We needed three things proven by simulation, not by guesswork:</w:t>
+        <w:t xml:space="preserve">A Fin Ray finger is a compliant triangular truss: push its contact face against an object and the internal ribs make the whole finger curl inward and wrap. We needed three things proven by simulation, not by guesswork:</w:t>
       </w:r>
     </w:p>
     <w:p>
@@ -6642,7 +6642,7 @@
           <w:sz w:val="22"/>
           <w:szCs w:val="22"/>
         </w:rPr>
-        <w:t xml:space="preserve">It actually wraps along the whole finger, not just point-pokes.</w:t>
+        <w:t xml:space="preserve">It really does wrap along the whole finger, not just point-poke.</w:t>
       </w:r>
     </w:p>
     <w:p>
@@ -6665,7 +6665,7 @@
           <w:sz w:val="22"/>
           <w:szCs w:val="22"/>
         </w:rPr>
-        <w:t xml:space="preserve">It does so for many object shapes and sizes, not one tuned target.</w:t>
+        <w:t xml:space="preserve">It does that for lots of object shapes and sizes, not one tuned target.</w:t>
       </w:r>
     </w:p>
     <w:p>
@@ -6688,7 +6688,7 @@
           <w:sz w:val="22"/>
           <w:szCs w:val="22"/>
         </w:rPr>
-        <w:t xml:space="preserve">The peak stress stays well below TPU strength, so it is gentle on fragile artefacts and durable in repeated service.</w:t>
+        <w:t xml:space="preserve">The peak stress stays well below TPU strength, so it's gentle on fragile artefacts and holds up under repeated use.</w:t>
       </w:r>
     </w:p>
     <w:p>
@@ -6710,7 +6710,7 @@
     </w:p>
     <w:p>
       <w:pPr>
-        <w:spacing w:after="100" w:before="0" w:line="300"/>
+        <w:spacing w:after="150" w:before="0" w:line="330"/>
       </w:pPr>
       <w:r>
         <w:rPr>
@@ -6723,12 +6723,12 @@
           <w:sz w:val="22"/>
           <w:szCs w:val="22"/>
         </w:rPr>
-        <w:t xml:space="preserve">gripper.py is the parametric source of truth. Every dimension you read in this document is generated from build123d primitives, never typed in twice. The FEA pipeline extracts the finger's 2D structural cross-section (contact beam, slanted spine, cross-ribs, mount eyes) directly from the CAD parameters, meshes it into triangles with gmsh (element size 0.5 to 1.3 mm), and extrudes the triangle mesh through the 10 mm finger thickness into 3 layers of linear tetrahedra. That gives roughly 25,000 tets, 6,600 nodes, and 20,000 degrees of freedom.</w:t>
-      </w:r>
-    </w:p>
-    <w:p>
-      <w:pPr>
-        <w:spacing w:after="100" w:before="0" w:line="300"/>
+        <w:t xml:space="preserve">gripper.py is the parametric source of truth. Every dimension you read in this document is generated from build123d primitives, never typed in twice. The FEA pipeline pulls the finger's 2D structural cross-section (contact beam, slanted spine, cross-ribs, mount eyes) straight from the CAD parameters, meshes it into triangles with gmsh (element size 0.5 to 1.3 mm), and extrudes the triangle mesh through the 10 mm finger thickness into 3 layers of linear tetrahedra. That gives us roughly 25,000 tets, 6,600 nodes, and 20,000 degrees of freedom.</w:t>
+      </w:r>
+    </w:p>
+    <w:p>
+      <w:pPr>
+        <w:spacing w:after="150" w:before="0" w:line="330"/>
       </w:pPr>
       <w:r>
         <w:rPr>
@@ -6741,7 +6741,7 @@
           <w:sz w:val="22"/>
           <w:szCs w:val="22"/>
         </w:rPr>
-        <w:t xml:space="preserve">This is legitimate because the finger is a 2.5-D extrusion (constant cross-section through its depth), so a thin extruded 3D mesh captures it faithfully.</w:t>
+        <w:t xml:space="preserve">This holds up because the finger is a 2.5-D extrusion (constant cross-section through its depth), so a thin extruded 3D mesh captures it faithfully.</w:t>
       </w:r>
     </w:p>
     <w:p>
@@ -6763,7 +6763,7 @@
     </w:p>
     <w:p>
       <w:pPr>
-        <w:spacing w:after="100" w:before="0" w:line="300"/>
+        <w:spacing w:after="150" w:before="0" w:line="330"/>
       </w:pPr>
       <w:r>
         <w:rPr>
@@ -6776,12 +6776,12 @@
           <w:sz w:val="22"/>
           <w:szCs w:val="22"/>
         </w:rPr>
-        <w:t xml:space="preserve">TPU strains stay small (a few percent), but the finger rotates a lot as it curls. Ordinary linear FEA is wrong under large rotation; it shows spurious stress from rigid-body spin. Full nonlinear hyperelasticity is overkill. The correct middle ground is corotational elasticity, and that is what we solve.</w:t>
-      </w:r>
-    </w:p>
-    <w:p>
-      <w:pPr>
-        <w:spacing w:after="100" w:before="0" w:line="300"/>
+        <w:t xml:space="preserve">TPU strains stay small (a few percent), but the finger rotates a lot as it curls. Ordinary linear FEA gets this wrong under large rotation; it shows fake stress from rigid-body spin. Full nonlinear hyperelasticity is overkill. The right middle ground is corotational elasticity, and that's what we solve.</w:t>
+      </w:r>
+    </w:p>
+    <w:p>
+      <w:pPr>
+        <w:spacing w:after="150" w:before="0" w:line="330"/>
       </w:pPr>
       <w:r>
         <w:rPr>
@@ -6794,7 +6794,7 @@
           <w:sz w:val="22"/>
           <w:szCs w:val="22"/>
         </w:rPr>
-        <w:t xml:space="preserve">Each Newton iteration computes the deformation gradient F from current node positions, takes the polar decomposition F = R·U via the singular-value decomposition (with the last column flipped if det(R) &lt; 0), and extracts the co-rotated strain ε = sym(Rᵀ·F) − I, which is strain measured after the rotation is removed. Stress is linear-elastic in this strain. We build the warped element stiffness Kₑ = R·Kₑ₀·Rᵀ and internal force fᵢₙₜ = R·Kₑ₀·(Rᵀx − X), which gives correct physics for the small-strain, large-rotation regime with a symmetric tangent that lets Newton's method converge robustly.</w:t>
+        <w:t xml:space="preserve">Each Newton iteration computes the deformation gradient F from current node positions, takes the polar decomposition F = R·U via the singular-value decomposition (with the last column flipped if det(R) &lt; 0), and extracts the co-rotated strain ε = sym(Rᵀ·F) − I, which is strain measured once the rotation is removed. Stress is linear-elastic in this strain. We build the warped element stiffness Kₑ = R·Kₑ₀·Rᵀ and internal force fᵢₙₜ = R·Kₑ₀·(Rᵀx − X), and that gives correct physics for the small-strain, large-rotation regime, with a symmetric tangent that lets Newton's method converge reliably.</w:t>
       </w:r>
     </w:p>
     <w:p>
@@ -7132,7 +7132,7 @@
                 <w:sz w:val="18"/>
                 <w:szCs w:val="18"/>
               </w:rPr>
-              <w:t xml:space="preserve">Measured ISO 527, anisotropic (in-plane / through-Z); replaces the old 40 MPa engineering guess. Part of the drop is definitional — 9.8 MPa is the initial-tangent modulus where the old 40 MPa was a secant estimate, not the material being four times weaker. Because internal stress at a fixed grip force is set by the load, not the stiffness, the safety margins and the design ranking are unchanged; only the absolute force at a given closure shifts. We re-centred the sweep on E = 7 / 9.8 / 12 MPa and the ranking still holds.</w:t>
+              <w:t xml:space="preserve">Measured ISO 527, anisotropic (in-plane / through-Z); replaces the old 40 MPa engineering guess. Part of the drop is definitional, 9.8 MPa is the initial-tangent modulus where the old 40 MPa was a secant estimate, not the material being four times weaker. Because internal stress at a fixed grip force is set by the load, not the stiffness, the safety margins and the design ranking are unchanged; only the absolute force at a given closure shifts. We re-centred the sweep on E = 7 / 9.8 / 12 MPa and the ranking still holds.</w:t>
             </w:r>
           </w:p>
         </w:tc>
@@ -7367,7 +7367,7 @@
     </w:p>
     <w:p>
       <w:pPr>
-        <w:spacing w:after="100" w:before="0" w:line="300"/>
+        <w:spacing w:after="150" w:before="0" w:line="330"/>
       </w:pPr>
       <w:r>
         <w:rPr>
@@ -7380,7 +7380,7 @@
           <w:sz w:val="22"/>
           <w:szCs w:val="22"/>
         </w:rPr>
-        <w:t xml:space="preserve">If you compare all fingers at the same closure, a stiff finger reaches a crushing grip while a compliant one barely touches. Unfair. So every candidate is reported at the first load step where the grip reaches a common 12 N target. Same grip force for every finger, compare wrap quality fairly. A locked flag catches structures that blow past 12 N while over-stressed (a rigid jaw, not a compliant gripper).</w:t>
+        <w:t xml:space="preserve">If you compare all the fingers at the same closure, a stiff finger reaches a crushing grip while a compliant one barely touches. That's unfair. So every candidate is reported at the first load step where the grip reaches a common 12 N target. Same grip force for every finger, so we compare wrap quality fairly. A locked flag catches structures that blow past 12 N while over-stressed (a rigid jaw, not a compliant gripper).</w:t>
       </w:r>
     </w:p>
     <w:p>
@@ -7404,16 +7404,16 @@
           <w:sz w:val="22"/>
           <w:szCs w:val="22"/>
         </w:rPr>
-        <w:t xml:space="preserve">What 12 N means here.</w:t>
-      </w:r>
-      <w:r>
-        <w:rPr>
-          <w:rFonts w:ascii="Arial" w:cs="Arial" w:eastAsia="Arial" w:hAnsi="Arial"/>
-          <w:color w:val="1A1A1A"/>
-          <w:sz w:val="22"/>
-          <w:szCs w:val="22"/>
-        </w:rPr>
-        <w:t xml:space="preserve">   12 N is a stress-probe load used to rank designs at a closure the FEA can reach in software. It is not the force the drivetrain delivers. The printed crown-pinion's root-bending ceiling caps the per-finger operating force at 0.14 to 0.73 N on the current gears, or 4.2 to 8.7 N on the proposed re-size. The implied vM margin at the operating force is roughly 100× to 300×, not the 6.2× to 9.4× we quote at 12 N. The 12 N comparison is a finger-design ranking probe; the rank survives at any sub-T_safe load because the regime is small-strain elastic.</w:t>
+        <w:t xml:space="preserve">What 12 N means here. </w:t>
+      </w:r>
+      <w:r>
+        <w:rPr>
+          <w:rFonts w:ascii="Arial" w:cs="Arial" w:eastAsia="Arial" w:hAnsi="Arial"/>
+          <w:color w:val="1A1A1A"/>
+          <w:sz w:val="22"/>
+          <w:szCs w:val="22"/>
+        </w:rPr>
+        <w:t xml:space="preserve">The 12 N figure is a stress-probe load we use to rank designs at a closure the FEA can actually reach in software. It isn't the force the drivetrain delivers. The printed crown-pinion's root-bending ceiling caps the per-finger operating force at 0.14 to 0.73 N on the current gears, or 4.2 to 8.7 N on the proposed re-size. The implied vM margin at the operating force is roughly 100× to 300×, not the 6.2× to 9.4× we quote at 12 N. So the 12 N comparison is a finger-design ranking probe, and the rank holds at any sub-T_safe load because the regime is small-strain elastic.</w:t>
       </w:r>
     </w:p>
     <w:p>
@@ -7435,7 +7435,7 @@
     </w:p>
     <w:p>
       <w:pPr>
-        <w:spacing w:after="100" w:before="0" w:line="300"/>
+        <w:spacing w:after="150" w:before="0" w:line="330"/>
       </w:pPr>
       <w:r>
         <w:rPr>
@@ -7448,7 +7448,7 @@
           <w:sz w:val="22"/>
           <w:szCs w:val="22"/>
         </w:rPr>
-        <w:t xml:space="preserve">Before the search, we wrote down what we wanted the finger to do, in three layers. The first layer was the user complaint about the production finger: under FEA the grasp load all sat in the lower-mid ribs, the top of the finger carried nothing, and the finger never morphed over the object. The second layer was the harder restatement: it had to work on every type of shape and every size, not just on the one cylinder we had tuned the geometry against. The third layer was the project constraint that kept eliminating otherwise-promising answers: fool-proof, no maintenance, and underwater. That third constraint is what rules out tendon-actuated and motorised-fingertip mechanisms before they reach the test bench.</w:t>
+        <w:t xml:space="preserve">Before the search, we wrote down what we wanted the finger to do, in three layers. The first layer was the user complaint about the production finger: under FEA the grasp load all sat in the lower-mid ribs, the top of the finger carried nothing, and the finger never morphed over the object. The second layer was the harder restatement: it had to work on every type of shape and every size, not just the one cylinder we'd tuned the geometry against. The third layer was the project constraint that kept knocking out otherwise-promising answers: fool-proof, no maintenance, and underwater. That third constraint is what rules out tendon-actuated and motorised-fingertip mechanisms before they ever reach the test bench.</w:t>
       </w:r>
     </w:p>
     <w:p>
@@ -7470,7 +7470,7 @@
     </w:p>
     <w:p>
       <w:pPr>
-        <w:spacing w:after="100" w:before="0" w:line="300"/>
+        <w:spacing w:after="150" w:before="0" w:line="330"/>
       </w:pPr>
       <w:r>
         <w:rPr>
@@ -7483,12 +7483,12 @@
           <w:sz w:val="22"/>
           <w:szCs w:val="22"/>
         </w:rPr>
-        <w:t xml:space="preserve">A straight contact face on a round object can only tangent-kiss in one short band. The production finger contacts a Ø44 mm cylinder over only about 6.6 mm of its length, all in the mid third, with the top third of the finger carrying zero load. The first idea was to bow the contact face into a circular arc concentric with the object so every face point sat the same distance from the object centre. Uniform radial penetration, even pressure, and the arc span would be the wrap.</w:t>
-      </w:r>
-    </w:p>
-    <w:p>
-      <w:pPr>
-        <w:spacing w:after="100" w:before="0" w:line="300"/>
+        <w:t xml:space="preserve">A straight contact face on a round object can only tangent-kiss in one short band. The production finger touches a Ø44 mm cylinder over only about 6.6 mm of its length, all in the mid third, with the top third of the finger carrying zero load. The first idea was to bow the contact face into a circular arc concentric with the object so every face point sat the same distance from the object centre. Uniform radial penetration, even pressure, and the arc span would be the wrap.</w:t>
+      </w:r>
+    </w:p>
+    <w:p>
+      <w:pPr>
+        <w:spacing w:after="150" w:before="0" w:line="330"/>
       </w:pPr>
       <w:r>
         <w:rPr>
@@ -7501,7 +7501,7 @@
           <w:sz w:val="22"/>
           <w:szCs w:val="22"/>
         </w:rPr>
-        <w:t xml:space="preserve">We built two versions, a hollow shell and a solid arc, and ran both under FEA. They failed identically. The cup contacted only at the lower lip and the rest of the arc swung open by 15 mm. The slender neck between the bracket and the cup acted as a flexible hinge: the object pushed the cup, and the cup rotated off like a door. A concave cantilever was no better than a straight one because we had thrown away the truss load path that ties the contact face back to the mount-anchored spine. The Fin Ray architecture itself was the load path; trying to replace it broke the wrap.</w:t>
+        <w:t xml:space="preserve">We built two versions, a hollow shell and a solid arc, and ran both under FEA. They failed the same way. The cup contacted only at the lower lip and the rest of the arc swung open by 15 mm. The slender neck between the bracket and the cup acted as a flexible hinge: the object pushed the cup, and the cup rotated off like a door. A concave cantilever was no better than a straight one, because we'd thrown away the truss load path that ties the contact face back to the mount-anchored spine. The Fin Ray architecture itself was the load path, and trying to replace it broke the wrap.</w:t>
       </w:r>
     </w:p>
     <w:p>
@@ -7523,7 +7523,7 @@
     </w:p>
     <w:p>
       <w:pPr>
-        <w:spacing w:after="100" w:before="0" w:line="300"/>
+        <w:spacing w:after="150" w:before="0" w:line="330"/>
       </w:pPr>
       <w:r>
         <w:rPr>
@@ -7536,7 +7536,7 @@
           <w:sz w:val="22"/>
           <w:szCs w:val="22"/>
         </w:rPr>
-        <w:t xml:space="preserve">After the dead-end, we changed what we were searching for. Instead of trying to fit one object well, we ran every candidate against a battery of seven targets: cylinders at Ø24, Ø44, and Ø70 mm; square blocks at 28 and 44 mm; and the Ø44 cylinder offset to a low position (y = 64) and a high position (y = 94) so a finger that gripped well only in its sweet spot got caught. Each object scored on wrap (contact arc), pressure evenness (coefficient of variation along the finger), grip-plateau stability, and safety margin against TPU yield. The universal score is the battery mean minus a grip-inconsistency penalty: the finger has to work everywhere, not on one shape.</w:t>
+        <w:t xml:space="preserve">After the dead end, we changed what we were searching for. Instead of trying to fit one object well, we ran every candidate against a battery of seven targets: cylinders at Ø24, Ø44, and Ø70 mm; square blocks at 28 and 44 mm; and the Ø44 cylinder offset to a low position (y = 64) and a high position (y = 94) so a finger that gripped well only in its sweet spot got caught. Each object scored on wrap (contact arc), pressure evenness (coefficient of variation along the finger), grip-plateau stability, and safety margin against TPU yield. The universal score is the battery mean minus a grip-inconsistency penalty: the finger has to work everywhere, not on one shape.</w:t>
       </w:r>
     </w:p>
     <w:p>
@@ -7558,7 +7558,7 @@
     </w:p>
     <w:p>
       <w:pPr>
-        <w:spacing w:after="100" w:before="0" w:line="300"/>
+        <w:spacing w:after="150" w:before="0" w:line="330"/>
       </w:pPr>
       <w:r>
         <w:rPr>
@@ -7571,7 +7571,7 @@
           <w:sz w:val="22"/>
           <w:szCs w:val="22"/>
         </w:rPr>
-        <w:t xml:space="preserve">Six parallel design tracks each explored one lever on the existing Fin Ray cross-section, plus three tracks on a different family entirely (a monolithic flexure finger with a thin compliant spine notch instead of an internal rib truss). The table below is the wave-one summary. The screen score is on a fast 3-object subset; the full battery comes later.</w:t>
+        <w:t xml:space="preserve">Six parallel design tracks each explored one lever on the existing Fin Ray cross-section, plus three tracks on a completely different family (a monolithic flexure finger with a thin compliant spine notch instead of an internal rib truss). The table below is the wave-one summary. The screen score is on a fast 3-object subset; the full battery comes later.</w:t>
       </w:r>
     </w:p>
     <w:tbl>
@@ -9011,7 +9011,7 @@
     </w:p>
     <w:p>
       <w:pPr>
-        <w:spacing w:after="100" w:before="0" w:line="300"/>
+        <w:spacing w:after="150" w:before="0" w:line="330"/>
       </w:pPr>
       <w:r>
         <w:rPr>
@@ -9024,7 +9024,7 @@
           <w:sz w:val="22"/>
           <w:szCs w:val="22"/>
         </w:rPr>
-        <w:t xml:space="preserve">Two cross-cutting findings came out of wave one. The Fin Ray family wraps blocks and large objects beautifully but point-contacts every round object: the flat contact face cannot curl around a cylinder, and changing the ribs does not add the degree of freedom that would let it. The flexure family wraps circles but is structurally unstable. We had to decide what to do with each.</w:t>
+        <w:t xml:space="preserve">Two cross-cutting findings came out of wave one. The Fin Ray family wraps blocks and large objects beautifully but point-contacts every round object: the flat contact face can't curl around a cylinder, and changing the ribs doesn't add the degree of freedom that would let it. The flexure family wraps circles but is structurally unstable. We had to decide what to do with each.</w:t>
       </w:r>
     </w:p>
     <w:p>
@@ -9046,7 +9046,7 @@
     </w:p>
     <w:p>
       <w:pPr>
-        <w:spacing w:after="100" w:before="0" w:line="300"/>
+        <w:spacing w:after="150" w:before="0" w:line="330"/>
       </w:pPr>
       <w:r>
         <w:rPr>
@@ -9094,7 +9094,7 @@
     </w:p>
     <w:p>
       <w:pPr>
-        <w:spacing w:after="100" w:before="0" w:line="300"/>
+        <w:spacing w:after="150" w:before="0" w:line="330"/>
       </w:pPr>
       <w:r>
         <w:rPr>
@@ -9107,7 +9107,7 @@
           <w:sz w:val="22"/>
           <w:szCs w:val="22"/>
         </w:rPr>
-        <w:t xml:space="preserve">The grip oscillated chaotically between 0 N and over 100,000 N at adjacent 0.25 mm steps. The von Mises stress stayed low; this was not material failure but penalty-contact overshoot as the notch snapped between floppy and jammed configurations. A real gripper with this finger would have uncontrollable grip force on round objects. We ruled out the flexure family and recorded the result so a future team would not re-investigate it.</w:t>
+        <w:t xml:space="preserve">The grip jumped around chaotically between 0 N and over 100,000 N at adjacent 0.25 mm steps. The von Mises stress stayed low; this wasn't material failure but penalty-contact overshoot as the notch snapped between floppy and jammed configurations. A real gripper with this finger would have uncontrollable grip force on round objects. So we ruled out the flexure family and recorded the result so a future team wouldn't re-investigate it.</w:t>
       </w:r>
     </w:p>
     <w:p>
@@ -9129,7 +9129,7 @@
     </w:p>
     <w:p>
       <w:pPr>
-        <w:spacing w:after="100" w:before="0" w:line="300"/>
+        <w:spacing w:after="150" w:before="0" w:line="330"/>
       </w:pPr>
       <w:r>
         <w:rPr>
@@ -9142,7 +9142,7 @@
           <w:sz w:val="22"/>
           <w:szCs w:val="22"/>
         </w:rPr>
-        <w:t xml:space="preserve">With the flexure family eliminated, wave two refined around sfc_04, the wave-one Fin Ray champion.</w:t>
+        <w:t xml:space="preserve">With the flexure family out, wave two refined around sfc_04, the wave-one Fin Ray champion.</w:t>
       </w:r>
     </w:p>
     <w:tbl>
@@ -9848,7 +9848,7 @@
     </w:p>
     <w:p>
       <w:pPr>
-        <w:spacing w:after="100" w:before="0" w:line="300"/>
+        <w:spacing w:after="150" w:before="0" w:line="330"/>
       </w:pPr>
       <w:r>
         <w:rPr>
@@ -9861,7 +9861,7 @@
           <w:sz w:val="22"/>
           <w:szCs w:val="22"/>
         </w:rPr>
-        <w:t xml:space="preserve">w2d_05 won. The combination of a thinner contact face (t_contact = 1.2 mm) with a sharply tapered spine (spine_x_tip = 3 mm) collapsed circle pressure_cov to 0.31 to 0.35 at a safe, consistent ~12 N grip. A separate combination wave that merged the best lever from each track did not beat it. The score had plateaued; further geometry sweeps were finding noise, not signal. We stopped iterating and validated on the full 7-object battery.</w:t>
+        <w:t xml:space="preserve">w2d_05 won. Pairing a thinner contact face (t_contact = 1.2 mm) with a sharply tapered spine (spine_x_tip = 3 mm) collapsed circle pressure_cov to 0.31 to 0.35 at a safe, consistent ~12 N grip. A separate combination wave that merged the best lever from each track didn't beat it. The score had plateaued; further geometry sweeps were finding noise, not signal. So we stopped iterating and validated on the full 7-object battery.</w:t>
       </w:r>
     </w:p>
     <w:p>
@@ -10417,7 +10417,7 @@
     </w:p>
     <w:p>
       <w:pPr>
-        <w:spacing w:after="100" w:before="0" w:line="300"/>
+        <w:spacing w:after="150" w:before="0" w:line="330"/>
       </w:pPr>
       <w:r>
         <w:rPr>
@@ -10430,12 +10430,12 @@
           <w:sz w:val="22"/>
           <w:szCs w:val="22"/>
         </w:rPr>
-        <w:t xml:space="preserve">The sfa_03 candidate scored 0.72 on the 3-object screen but collapsed to 0.595 on the full 7-object battery. That collapse confirmed the screen had been giving us false positives on R20-block resonance, and validated the decision to grade the finalists on the harder battery.</w:t>
-      </w:r>
-    </w:p>
-    <w:p>
-      <w:pPr>
-        <w:spacing w:after="100" w:before="0" w:line="300"/>
+        <w:t xml:space="preserve">The sfa_03 candidate scored 0.72 on the 3-object screen but collapsed to 0.595 on the full 7-object battery. That collapse confirmed the screen had been giving us false positives on R20-block resonance, and it backed up the decision to grade the finalists on the harder battery.</w:t>
+      </w:r>
+    </w:p>
+    <w:p>
+      <w:pPr>
+        <w:spacing w:after="150" w:before="0" w:line="330"/>
       </w:pPr>
       <w:r>
         <w:rPr>
@@ -10448,7 +10448,7 @@
           <w:sz w:val="22"/>
           <w:szCs w:val="22"/>
         </w:rPr>
-        <w:t xml:space="preserve">The shipped finger geometry: 14 ribs at 38° angle with the reversed slant direction, 1.2 mm contact beam, 1.8 mm spine, 1.6 mm ribs, 2 mm tip width with a sharp taper. Ported into gripper.py as FR_N_RIBS = 14, FR_RIB_DIR = −1, FR_TIP_WIDTH = 2, FR_CONTACT_WALL = 1.2, FR_SPINE_WALL = 1.8, FR_RIB_WALL = 1.6. Verified after port: both fingers build as valid solids, zero finger-to-finger interference at the closed pose, and the four-bar closure is unchanged from the baseline.</w:t>
+        <w:t xml:space="preserve">Here's the shipped finger geometry: 14 ribs at 38° angle with the reversed slant direction, 1.2 mm contact beam, 1.8 mm spine, 1.6 mm ribs, 2 mm tip width with a sharp taper. Ported into gripper.py as FR_N_RIBS = 14, FR_RIB_DIR = −1, FR_TIP_WIDTH = 2, FR_CONTACT_WALL = 1.2, FR_SPINE_WALL = 1.8, FR_RIB_WALL = 1.6. Verified after the port: both fingers build as valid solids, there's zero finger-to-finger interference at the closed pose, and the four-bar closure is unchanged from the baseline.</w:t>
       </w:r>
     </w:p>
     <w:p>
@@ -10528,12 +10528,12 @@
           <w:sz w:val="18"/>
           <w:szCs w:val="18"/>
         </w:rPr>
-        <w:t>Figure 4.1   The shipped finger gripping five objects at the same 12 N force: Ø24, Ø44, Ø70 mm cylinders and 28 mm and 44 mm square blocks. Contact length grows from 8 mm to 44 mm as the object gets bigger or flatter. Colour is von Mises stress. The peak across the battery stays well below the 27.3 MPa in-plane TPU strength.</w:t>
-      </w:r>
-    </w:p>
-    <w:p>
-      <w:pPr>
-        <w:spacing w:after="100" w:before="0" w:line="300"/>
+        <w:t xml:space="preserve">Figure 4.1   The shipped finger gripping five objects at the same 12 N force: Ø24, Ø44, Ø70 mm cylinders and 28 mm and 44 mm square blocks. Contact length grows from 8 mm to 44 mm as the object gets bigger or flatter. Colour is von Mises stress. The peak across the battery stays well below the 27.3 MPa in-plane TPU strength.</w:t>
+      </w:r>
+    </w:p>
+    <w:p>
+      <w:pPr>
+        <w:spacing w:after="150" w:before="0" w:line="330"/>
       </w:pPr>
       <w:r>
         <w:rPr>
@@ -10546,7 +10546,7 @@
           <w:sz w:val="22"/>
           <w:szCs w:val="22"/>
         </w:rPr>
-        <w:t xml:space="preserve">The aggregate universal score moved from 0.559 on the old finger to 0.584 on the shipped finger, a 4.5 % gain. The real wins are not in the aggregate; they are in the failure modes:</w:t>
+        <w:t xml:space="preserve">The aggregate universal score moved from 0.559 on the old finger to 0.584 on the shipped finger, a 4.5 % gain. The real wins aren't in the aggregate; they're in the failure modes:</w:t>
       </w:r>
     </w:p>
     <w:tbl>
@@ -11788,7 +11788,7 @@
     </w:p>
     <w:p>
       <w:pPr>
-        <w:spacing w:after="100" w:before="0" w:line="300"/>
+        <w:spacing w:after="150" w:before="0" w:line="330"/>
       </w:pPr>
       <w:r>
         <w:rPr>
@@ -11801,7 +11801,7 @@
           <w:sz w:val="22"/>
           <w:szCs w:val="22"/>
         </w:rPr>
-        <w:t xml:space="preserve">The old finger's grip swung by 7 times with object height (a stiffness gradient artefact). The shipped finger grips every object at a consistent 12 N at the test load. The old finger only wrapped one square size; the new one wraps both. On round objects the contact arc roughly doubles.</w:t>
+        <w:t xml:space="preserve">The old finger's grip swung by 7 times with object height (a stiffness-gradient artefact). The shipped finger grips every object at a consistent 12 N at the test load. The old finger only wrapped one square size; the new one wraps both. On round objects the contact arc roughly doubles.</w:t>
       </w:r>
     </w:p>
     <w:p>
@@ -11927,7 +11927,7 @@
           <w:sz w:val="18"/>
           <w:szCs w:val="18"/>
         </w:rPr>
-        <w:t xml:space="preserve">Figure 4.3   Old finger versus shipped finger on the Ø44 mm cylinder. The new finger is more compliant (reaches the same 12 N at more closure) and spreads stress more evenly along the ribs. On a round object neither finger fully curls around it; that is the physics ceiling of a passive single-piece finger without a tendon.</w:t>
+        <w:t xml:space="preserve">Figure 4.3   Old finger versus shipped finger on the Ø44 mm cylinder. The new finger is more compliant (it reaches the same 12 N at more closure) and spreads stress more evenly along the ribs. On a round object neither finger fully curls around it; that's the physics ceiling of a passive single-piece finger without a tendon.</w:t>
       </w:r>
     </w:p>
     <w:p>
@@ -11949,7 +11949,7 @@
     </w:p>
     <w:p>
       <w:pPr>
-        <w:spacing w:after="100" w:before="0" w:line="300"/>
+        <w:spacing w:after="150" w:before="0" w:line="330"/>
       </w:pPr>
       <w:r>
         <w:rPr>
@@ -11962,12 +11962,12 @@
           <w:sz w:val="22"/>
           <w:szCs w:val="22"/>
         </w:rPr>
-        <w:t xml:space="preserve">Two formulations agree in order of magnitude on the fragility metric. A 2D plane-strain finite-strain solve in scikit-fem and the 3D corotational solve both produce peak von Mises around 2.7 MPa at the 12 N stress-probe load. These are not the same problem (different boundary conditions, ν, strain measure, load level), so this is a cross-formulation consistency check, not an independent re-derivation.</w:t>
-      </w:r>
-    </w:p>
-    <w:p>
-      <w:pPr>
-        <w:spacing w:after="100" w:before="0" w:line="300"/>
+        <w:t xml:space="preserve">Two formulations agree to order of magnitude on the fragility metric. A 2D plane-strain finite-strain solve in scikit-fem and the 3D corotational solve both produce peak von Mises around 2.7 MPa at the 12 N stress-probe load. These aren't the same problem (different boundary conditions, ν, strain measure, load level), so this is a cross-formulation consistency check, not an independent re-derivation.</w:t>
+      </w:r>
+    </w:p>
+    <w:p>
+      <w:pPr>
+        <w:spacing w:after="150" w:before="0" w:line="330"/>
       </w:pPr>
       <w:r>
         <w:rPr>
@@ -11980,7 +11980,7 @@
           <w:sz w:val="22"/>
           <w:szCs w:val="22"/>
         </w:rPr>
-        <w:t>A locking-stable P2 (quadratic-triangle) re-run of the 2D precursor showed that the linear-element solver under-reports peak vM by about 50 % at 12 N. The headline 6.2 to 9.4 times margin is therefore optimistic. A locking-free reading is closer to 4.1 to 6.2 times at 12 N. The design call is unchanged (margins at the actual operating force are still around 120 to 300 times), but we corrected the absolute fragility number in the underlying docs.</w:t>
+        <w:t xml:space="preserve">A locking-stable P2 (quadratic-triangle) re-run of the 2D precursor showed that the linear-element solver under-reports peak vM by about 50 % at 12 N. So the headline 6.2 to 9.4 times margin is optimistic. A locking-free reading is closer to 4.1 to 6.2 times at 12 N. The design call doesn't change (margins at the actual operating force are still around 120 to 300 times), but we corrected the absolute fragility number in the underlying docs.</w:t>
       </w:r>
     </w:p>
     <w:p>
@@ -12004,16 +12004,16 @@
           <w:sz w:val="22"/>
           <w:szCs w:val="22"/>
         </w:rPr>
-        <w:t xml:space="preserve">Established and not established.</w:t>
-      </w:r>
-      <w:r>
-        <w:rPr>
-          <w:rFonts w:ascii="Arial" w:cs="Arial" w:eastAsia="Arial" w:hAnsi="Arial"/>
-          <w:color w:val="1A1A1A"/>
-          <w:sz w:val="22"/>
-          <w:szCs w:val="22"/>
-        </w:rPr>
-        <w:t xml:space="preserve">   Established: the finger wraps universally and gently at the 12 N stress-probe load with peak stress around 2.7 MPa, ten times below TPU strength under both formulations. At the operating force the implied margin is around 100 to 300 times. Not established: the absolute grip force in newtons (the texture model ranks, it does not predict); long-term wet service (TPU swelling and biofilm in the grip channels need physical soak testing); whether a passive single-piece finger can curl tightly around a small round object (it cannot, by architecture).</w:t>
+        <w:t xml:space="preserve">Established and not established. </w:t>
+      </w:r>
+      <w:r>
+        <w:rPr>
+          <w:rFonts w:ascii="Arial" w:cs="Arial" w:eastAsia="Arial" w:hAnsi="Arial"/>
+          <w:color w:val="1A1A1A"/>
+          <w:sz w:val="22"/>
+          <w:szCs w:val="22"/>
+        </w:rPr>
+        <w:t xml:space="preserve">Established: the finger wraps universally and gently at the 12 N stress-probe load with peak stress around 2.7 MPa, ten times below TPU strength under both formulations. At the operating force the implied margin is around 100 to 300 times. Not established: the absolute grip force in newtons (the texture model ranks, it doesn't predict); long-term wet service (TPU swelling and biofilm in the grip channels need physical soak testing); and whether a passive single-piece finger can curl tightly around a small round object (it can't, by architecture).</w:t>
       </w:r>
     </w:p>
     <w:p>
@@ -12046,7 +12046,7 @@
     </w:p>
     <w:p>
       <w:pPr>
-        <w:spacing w:after="100" w:before="0" w:line="300"/>
+        <w:spacing w:after="150" w:before="0" w:line="330"/>
       </w:pPr>
       <w:r>
         <w:rPr>
@@ -12059,7 +12059,7 @@
           <w:sz w:val="22"/>
           <w:szCs w:val="22"/>
         </w:rPr>
-        <w:t xml:space="preserve">With the finger geometry locked, we needed to optimise the actual contact surface, the micro-relief that does or does not catch on a wet object. The finger structural FEA cannot answer this: it has no friction model and no fluid model. So we built a second campaign with its own model, its own validation gates, and its own set of candidate textures.</w:t>
+        <w:t xml:space="preserve">Once the finger geometry was locked, we still had to sort out the actual contact surface, the micro-relief that decides whether a finger catches on a wet object or slides off it. The finger structural FEA can't answer that question: it has no friction model and no fluid model. So we set up a second campaign with its own model, its own validation gates, and its own list of candidate textures.</w:t>
       </w:r>
     </w:p>
     <w:p>
@@ -12081,7 +12081,7 @@
     </w:p>
     <w:p>
       <w:pPr>
-        <w:spacing w:after="100" w:before="0" w:line="300"/>
+        <w:spacing w:after="150" w:before="0" w:line="330"/>
       </w:pPr>
       <w:r>
         <w:rPr>
@@ -12094,7 +12094,7 @@
           <w:sz w:val="22"/>
           <w:szCs w:val="22"/>
         </w:rPr>
-        <w:t>The shipped finger needs a surface that works on every kind of object an archaeologist might recover: smooth ceramic, rough rock, ridged coral, slimy bone, soft tissue, small round shells. The Bambu TPU 95A HF we print the fingers in has a glossy, low-friction skin straight off the print bed. A textured contact face has to defeat both the water film and the slick skin at the same time. None of that was scored by the structural FEA, which only sees mechanical stress.</w:t>
+        <w:t xml:space="preserve">The shipped finger needs a surface that copes with every kind of object an archaeologist might recover: smooth ceramic, rough rock, ridged coral, slimy bone, soft tissue, small round shells. The Bambu TPU 95A HF we print the fingers in comes off the print bed with a glossy, low-friction skin. A textured contact face has to beat both the water film and that slick skin at once. The structural FEA scored none of this, because it only sees mechanical stress.</w:t>
       </w:r>
     </w:p>
     <w:p>
@@ -12116,7 +12116,7 @@
     </w:p>
     <w:p>
       <w:pPr>
-        <w:spacing w:after="100" w:before="0" w:line="300"/>
+        <w:spacing w:after="150" w:before="0" w:line="330"/>
       </w:pPr>
       <w:r>
         <w:rPr>
@@ -12129,7 +12129,7 @@
           <w:sz w:val="22"/>
           <w:szCs w:val="22"/>
         </w:rPr>
-        <w:t xml:space="preserve">There is no cheap first-principles simulator for wet elastomer friction, so we built two tiers:</w:t>
+        <w:t xml:space="preserve">There's no cheap first-principles simulator for wet elastomer friction, so we built two tiers:</w:t>
       </w:r>
     </w:p>
     <w:p>
@@ -12165,7 +12165,7 @@
           <w:sz w:val="22"/>
           <w:szCs w:val="22"/>
         </w:rPr>
-        <w:t xml:space="preserve">a mechanistic surrogate (microseconds per evaluation) that scores any texture. Fast enough to run hundreds of thousands of candidates.</w:t>
+        <w:t xml:space="preserve">a mechanistic surrogate (microseconds per evaluation) that scores any texture. It's fast enough to run hundreds of thousands of candidates.</w:t>
       </w:r>
     </w:p>
     <w:p>
@@ -12201,12 +12201,12 @@
           <w:sz w:val="22"/>
           <w:szCs w:val="22"/>
         </w:rPr>
-        <w:t xml:space="preserve">a real plane-strain contact FEA that validates the contact-mechanics pieces the surrogate relies on.</w:t>
-      </w:r>
-    </w:p>
-    <w:p>
-      <w:pPr>
-        <w:spacing w:after="100" w:before="0" w:line="300"/>
+        <w:t xml:space="preserve">a real plane-strain contact FEA that checks the contact-mechanics pieces the surrogate leans on.</w:t>
+      </w:r>
+    </w:p>
+    <w:p>
+      <w:pPr>
+        <w:spacing w:after="150" w:before="0" w:line="330"/>
       </w:pPr>
       <w:r>
         <w:rPr>
@@ -12219,7 +12219,7 @@
           <w:sz w:val="22"/>
           <w:szCs w:val="22"/>
         </w:rPr>
-        <w:t xml:space="preserve">We guarded the surrogate with three independent validations (a literature gate, a 50 % sensitivity sweep, and the Tier-2 FEA) so it could not just be a function we tuned to give the answer we wanted.</w:t>
+        <w:t xml:space="preserve">We wrapped three independent validations around the surrogate (a literature gate, a 50 % sensitivity sweep, and the Tier-2 FEA) so it couldn't just be a function we tuned to give us the answer we wanted.</w:t>
       </w:r>
     </w:p>
     <w:p>
@@ -12241,7 +12241,7 @@
     </w:p>
     <w:p>
       <w:pPr>
-        <w:spacing w:after="100" w:before="0" w:line="300"/>
+        <w:spacing w:after="150" w:before="0" w:line="330"/>
       </w:pPr>
       <w:r>
         <w:rPr>
@@ -12254,7 +12254,7 @@
           <w:sz w:val="22"/>
           <w:szCs w:val="22"/>
         </w:rPr>
-        <w:t xml:space="preserve">A texture is resolved into neutral geometric descriptors: land fraction, land width, channel width, depth, edge density, drainage path, directional factors. For each object condition the model composes an effective holding coefficient from:</w:t>
+        <w:t xml:space="preserve">A texture gets resolved into neutral geometric descriptors: land fraction, land width, channel width, depth, edge density, drainage path, directional factors. For each object condition the model builds an effective holding coefficient from:</w:t>
       </w:r>
     </w:p>
     <w:p>
@@ -12398,7 +12398,7 @@
           <w:sz w:val="22"/>
           <w:szCs w:val="22"/>
         </w:rPr>
-        <w:t xml:space="preserve">Dewetted fraction from the squeeze-film drain time over half a land width to the nearest channel, gated by channel capacity, boosted by edge film-piercing. No open channels means hydroplane; fine open channels means grip recovered. The tyre-tread and tree-frog mechanism.</w:t>
+        <w:t xml:space="preserve">Dewetted fraction comes from the squeeze-film drain time over half a land width to the nearest channel, gated by channel capacity and boosted by edge film-piercing. With no open channels you get hydroplane; with fine open channels grip comes back. It's the tyre-tread and tree-frog mechanism.</w:t>
       </w:r>
     </w:p>
     <w:p>
@@ -12434,7 +12434,7 @@
           <w:sz w:val="22"/>
           <w:szCs w:val="22"/>
         </w:rPr>
-        <w:t xml:space="preserve">Subdividing a monolithic pad into many small lands resets the edge stress at each, so efficiency rises with subdivision. Monotone surrogate, not gecko adhesion and not Cattaneo-Mindlin; the direction is established in tyre and tree-frog literature, the functional form is engineering convenience.</w:t>
+        <w:t xml:space="preserve">Splitting a monolithic pad into many small lands resets the edge stress at each one, so efficiency climbs with subdivision. It's a monotone surrogate, not gecko adhesion and not Cattaneo-Mindlin; the direction is established in tyre and tree-frog literature, and the functional form is engineering convenience.</w:t>
       </w:r>
     </w:p>
     <w:p>
@@ -12506,7 +12506,7 @@
           <w:sz w:val="22"/>
           <w:szCs w:val="22"/>
         </w:rPr>
-        <w:t>Root bending σ = 6·τ·AR; margin against the 27.3 MPa printed strength. Validated by Tier-2 FEA.</w:t>
+        <w:t xml:space="preserve">Root bending σ = 6·τ·AR; margin against the 27.3 MPa printed strength. Validated by Tier-2 FEA.</w:t>
       </w:r>
     </w:p>
     <w:p>
@@ -12542,7 +12542,7 @@
           <w:sz w:val="22"/>
           <w:szCs w:val="22"/>
         </w:rPr>
-        <w:t xml:space="preserve">A small cavity bonus for dimple and sucker patterns, explicitly flagged as speculative.</w:t>
+        <w:t xml:space="preserve">A small cavity bonus for dimple and sucker patterns, which we explicitly flag as speculative.</w:t>
       </w:r>
     </w:p>
     <w:p>
@@ -12564,7 +12564,7 @@
     </w:p>
     <w:p>
       <w:pPr>
-        <w:spacing w:after="100" w:before="0" w:line="300"/>
+        <w:spacing w:after="150" w:before="0" w:line="330"/>
       </w:pPr>
       <w:r>
         <w:rPr>
@@ -12577,7 +12577,7 @@
           <w:sz w:val="22"/>
           <w:szCs w:val="22"/>
         </w:rPr>
-        <w:t xml:space="preserve">Before trusting the model to rank anything, it had to reproduce the published wet-grip ordering of five real patterns. The model computes each pattern's wet holding coefficient and asserts six orderings. All six pass:</w:t>
+        <w:t xml:space="preserve">Before we trusted the model to rank anything, it had to reproduce the published wet-grip ordering of five real patterns. The model works out each pattern's wet holding coefficient and asserts six orderings. All six pass:</w:t>
       </w:r>
     </w:p>
     <w:p>
@@ -12673,7 +12673,7 @@
           <w:sz w:val="22"/>
           <w:szCs w:val="22"/>
         </w:rPr>
-        <w:t xml:space="preserve">   The placeholder and estimate coefficients were chosen so the gate passes, so "gate passes" is a sufficient-condition test (the model can be fit to these 5 patterns), not a necessary one. A coefficient-perturbation diagnostic (50 % up and down on each placeholder) shows the gate still passes in 89 of 90 settings (99 %). A harsher zero-the-placeholders check fails, meaning the placeholder terms (drainage, edge piercing, hysteresis) are doing real work. An out-of-sample gate with three new patterns the placeholders were not tuned on passes 2 of 3 (67 %).</w:t>
+        <w:t xml:space="preserve">   We chose the placeholder and estimate coefficients so the gate passes, so "gate passes" is a sufficient-condition test (the model can be fit to these 5 patterns), not a necessary one. A coefficient-perturbation diagnostic (50 % up and down on each placeholder) shows the gate still passes in 89 of 90 settings (99 %). A harsher zero-the-placeholders check fails, which means the placeholder terms (drainage, edge piercing, hysteresis) are doing real work. An out-of-sample gate with three new patterns the placeholders weren't tuned on passes 2 of 3 (67 %).</w:t>
       </w:r>
     </w:p>
     <w:p>
@@ -12695,7 +12695,7 @@
     </w:p>
     <w:p>
       <w:pPr>
-        <w:spacing w:after="100" w:before="0" w:line="300"/>
+        <w:spacing w:after="150" w:before="0" w:line="330"/>
       </w:pPr>
       <w:r>
         <w:rPr>
@@ -12708,7 +12708,7 @@
           <w:sz w:val="22"/>
           <w:szCs w:val="22"/>
         </w:rPr>
-        <w:t xml:space="preserve">We ran seven texture families in parallel. Each family had its own parametric description and its own parameter ranges (post pitch, channel width, depth, post height, ridge angle, ring spacing, dimple radius, hierarchy ratio). Each family ran an inner sweep over its full parameter space at 0.1 mm resolution, refined around its best score with a finer mesh, and reported its champion configuration along with how much that champion leaned on the speculative or placeholder coefficients in the model. The seven families together produced more than 700,000 model evaluations. The families were: ridge, crosshatch, chevron, hexpad (tree-frog), concentric (octopus sucker), dimple, and hierarchical.</w:t>
+        <w:t xml:space="preserve">We ran seven texture families in parallel. Each family had its own parametric description and its own parameter ranges (post pitch, channel width, depth, post height, ridge angle, ring spacing, dimple radius, hierarchy ratio). Each family ran an inner sweep over its full parameter space at 0.1 mm resolution, refined around its best score with a finer mesh, and reported its champion configuration along with how much that champion leaned on the speculative or placeholder coefficients in the model. Together the seven families produced more than 700,000 model evaluations. The families were: ridge, crosshatch, chevron, hexpad (tree-frog), concentric (octopus sucker), dimple, and hierarchical.</w:t>
       </w:r>
     </w:p>
     <w:p>
@@ -12793,7 +12793,7 @@
     </w:p>
     <w:p>
       <w:pPr>
-        <w:spacing w:after="100" w:before="0" w:line="300"/>
+        <w:spacing w:after="150" w:before="0" w:line="330"/>
       </w:pPr>
       <w:r>
         <w:rPr>
@@ -12806,7 +12806,7 @@
           <w:sz w:val="22"/>
           <w:szCs w:val="22"/>
         </w:rPr>
-        <w:t xml:space="preserve">The central risk of a surrogate model: "family X wins" might just reflect the numbers we chose. So we perturbed every coefficient to 0.5× and 1.5× and, at each of 31 settings, re-optimised all seven families and recorded the winner. A winner that survives the whole sweep is a real conclusion.</w:t>
+        <w:t xml:space="preserve">Here's the central risk of a surrogate model: "family X wins" might just reflect the numbers we chose. So we perturbed every coefficient to 0.5× and 1.5× and, at each of 31 settings, re-optimised all seven families and recorded the winner. A winner that survives the whole sweep is a real conclusion.</w:t>
       </w:r>
     </w:p>
     <w:p>
@@ -12891,7 +12891,7 @@
     </w:p>
     <w:p>
       <w:pPr>
-        <w:spacing w:after="100" w:before="0" w:line="300"/>
+        <w:spacing w:after="150" w:before="0" w:line="330"/>
       </w:pPr>
       <w:r>
         <w:rPr>
@@ -12904,12 +12904,12 @@
           <w:sz w:val="22"/>
           <w:szCs w:val="22"/>
         </w:rPr>
-        <w:t xml:space="preserve">Concentric is the model's invariant winner and we did not ship it, for two reasons. First, it cannot tile the finger blade: the contact face is about 72 mm × 10 mm, and at a 1.4 mm ring pitch at most one full rosette fits across the 10 mm width. The rest is truncated ring fragments and inter-rosette gaps where the directional-isotropy benefit disappears. The model has no tileability term; this is a missing-physics override, applied externally and on purpose. Second, its remaining lead leans on the speculative micro-suction term, which a 0.16 mm layer FDM TPU cavity cannot actually sustain (stepped rims break the seal).</w:t>
-      </w:r>
-    </w:p>
-    <w:p>
-      <w:pPr>
-        <w:spacing w:after="100" w:before="0" w:line="300"/>
+        <w:t xml:space="preserve">Concentric is the model's invariant winner, and we didn't ship it, for two reasons. First, it can't tile the finger blade: the contact face is about 72 mm × 10 mm, and at a 1.4 mm ring pitch at most one full rosette fits across the 10 mm width. The rest is truncated ring fragments and inter-rosette gaps where the directional-isotropy benefit disappears. The model has no tileability term, so this is a missing-physics override, applied externally and on purpose. Second, its remaining lead leans on the speculative micro-suction term, which a 0.16 mm layer FDM TPU cavity can't actually sustain (stepped rims break the seal).</w:t>
+      </w:r>
+    </w:p>
+    <w:p>
+      <w:pPr>
+        <w:spacing w:after="150" w:before="0" w:line="330"/>
       </w:pPr>
       <w:r>
         <w:rPr>
@@ -12922,7 +12922,7 @@
           <w:sz w:val="22"/>
           <w:szCs w:val="22"/>
         </w:rPr>
-        <w:t xml:space="preserve">Among patterns that actually tile the blade, are robust without speculation, and print reliably, crosshatch is the empirical winner at 23 of 31 settings. That is what ships.</w:t>
+        <w:t xml:space="preserve">Among patterns that actually tile the blade, hold up without speculation, and print reliably, crosshatch is the empirical winner at 23 of 31 settings. That's what ships.</w:t>
       </w:r>
     </w:p>
     <w:p>
@@ -13007,7 +13007,7 @@
     </w:p>
     <w:p>
       <w:pPr>
-        <w:spacing w:after="100" w:before="0" w:line="300"/>
+        <w:spacing w:after="150" w:before="0" w:line="330"/>
       </w:pPr>
       <w:r>
         <w:rPr>
@@ -13122,7 +13122,7 @@
     </w:p>
     <w:p>
       <w:pPr>
-        <w:spacing w:after="100" w:before="0" w:line="300"/>
+        <w:spacing w:after="150" w:before="0" w:line="330"/>
       </w:pPr>
       <w:r>
         <w:rPr>
@@ -13135,7 +13135,7 @@
           <w:sz w:val="22"/>
           <w:szCs w:val="22"/>
         </w:rPr>
-        <w:t xml:space="preserve">1.8 mm posts, 0.54 mm crossing channels, 0.6 mm deep. Ported into gripper.py as FR_GRIP_CROSS, both fingers verified as valid solids with 0.0 mm³ interference at the closed pose.</w:t>
+        <w:t xml:space="preserve">1.8 mm posts, 0.54 mm crossing channels, 0.6 mm deep. Ported into gripper.py as FR_GRIP_CROSS, with both fingers verified as valid solids with 0.0 mm³ interference at the closed pose.</w:t>
       </w:r>
     </w:p>
     <w:p>
@@ -13231,7 +13231,7 @@
     </w:p>
     <w:p>
       <w:pPr>
-        <w:spacing w:after="100" w:before="0" w:line="300"/>
+        <w:spacing w:after="150" w:before="0" w:line="330"/>
       </w:pPr>
       <w:r>
         <w:rPr>
@@ -13244,7 +13244,7 @@
           <w:sz w:val="22"/>
           <w:szCs w:val="22"/>
         </w:rPr>
-        <w:t xml:space="preserve">The four innovations in §3 are the FLL-judging story. In parallel we explored a deeper engineering question: could the actuator's own current draw replace the per-pad pressure sensors entirely, removing all fingertip electronics? The answer turned out to be "yes, with a real cost", and the work is documented here so the engineering thinking is on record alongside the public solution.</w:t>
+        <w:t xml:space="preserve">The four innovations in §3 are the FLL-judging story. Alongside that, we chased a deeper engineering question: could the actuator's own current draw stand in for the per-pad pressure sensors entirely, so there's no fingertip electronics at all? The answer turned out to be "yes, with a real cost", and we've written the work up here so the engineering thinking sits on record next to the public solution.</w:t>
       </w:r>
     </w:p>
     <w:p>
@@ -13266,7 +13266,7 @@
     </w:p>
     <w:p>
       <w:pPr>
-        <w:spacing w:after="100" w:before="0" w:line="300"/>
+        <w:spacing w:after="150" w:before="0" w:line="330"/>
       </w:pPr>
       <w:r>
         <w:rPr>
@@ -13279,12 +13279,12 @@
           <w:sz w:val="22"/>
           <w:szCs w:val="22"/>
         </w:rPr>
-        <w:t xml:space="preserve">Force-controlled industrial and surgical grippers (Maxon, Robotiq, Schunk) do not put strain gauges on every fingertip. They read the motor current, multiply by the torque constant, back-trace through the drivetrain, and recover an estimated tip force. The current that drives the gripper also senses it.</w:t>
-      </w:r>
-    </w:p>
-    <w:p>
-      <w:pPr>
-        <w:spacing w:after="100" w:before="0" w:line="300"/>
+        <w:t xml:space="preserve">Force-controlled industrial and surgical grippers (Maxon, Robotiq, Schunk) don't put strain gauges on every fingertip. They read the motor current, multiply by the torque constant, trace it back through the drivetrain, and recover an estimated tip force. The current that drives the gripper also senses it.</w:t>
+      </w:r>
+    </w:p>
+    <w:p>
+      <w:pPr>
+        <w:spacing w:after="150" w:before="0" w:line="330"/>
       </w:pPr>
       <w:r>
         <w:rPr>
@@ -13297,7 +13297,7 @@
           <w:sz w:val="22"/>
           <w:szCs w:val="22"/>
         </w:rPr>
-        <w:t xml:space="preserve">For an underwater tool the payoff is decisive: no fingertip wires through a flexing TPU finger, no fingertip connector to flood, no separate analogue front-end to seal. The sensing chain is the same chain that already exists for control.</w:t>
+        <w:t xml:space="preserve">For an underwater tool the payoff is hard to argue with: no fingertip wires running through a flexing TPU finger, no fingertip connector to flood, no separate analogue front-end to seal. The sensing chain is the same chain that already exists for control.</w:t>
       </w:r>
     </w:p>
     <w:p>
@@ -13930,7 +13930,7 @@
     </w:p>
     <w:p>
       <w:pPr>
-        <w:spacing w:after="100" w:before="0" w:line="300"/>
+        <w:spacing w:after="150" w:before="0" w:line="330"/>
       </w:pPr>
       <w:r>
         <w:rPr>
@@ -13943,7 +13943,7 @@
           <w:sz w:val="22"/>
           <w:szCs w:val="22"/>
         </w:rPr>
-        <w:t xml:space="preserve">The selection sweep places different actuator classes at the top depending on depth. Same gripper body, same D-coupler interface, different drive.</w:t>
+        <w:t xml:space="preserve">The selection sweep puts different actuator classes on top depending on depth. Same gripper body, same D-coupler interface, just a different drive.</w:t>
       </w:r>
     </w:p>
     <w:tbl>
@@ -14800,7 +14800,7 @@
     </w:p>
     <w:p>
       <w:pPr>
-        <w:spacing w:after="100" w:before="0" w:line="300"/>
+        <w:spacing w:after="150" w:before="0" w:line="330"/>
       </w:pPr>
       <w:r>
         <w:rPr>
@@ -14833,7 +14833,7 @@
     </w:p>
     <w:p>
       <w:pPr>
-        <w:spacing w:after="100" w:before="0" w:line="300"/>
+        <w:spacing w:after="150" w:before="0" w:line="330"/>
       </w:pPr>
       <w:r>
         <w:rPr>
@@ -14846,7 +14846,7 @@
           <w:sz w:val="22"/>
           <w:szCs w:val="22"/>
         </w:rPr>
-        <w:t xml:space="preserve">K_t is the torque constant, I_0 is the no-load and friction current, i_g = 2.667 is the crown-pinion ratio, MA(P) is the four-bar mechanical advantage at the current pose, η is the calibrated efficiency. Because command and readout share the chain, one drivetrain characterisation closes the loop: commanding a current limit sets a force limit and the gear-protection ceiling at the same time.</w:t>
+        <w:t xml:space="preserve">K_t is the torque constant, I_0 is the no-load and friction current, i_g = 2.667 is the crown-pinion ratio, MA(P) is the four-bar mechanical advantage at the current pose, and η is the calibrated efficiency. Since command and readout share the chain, one drivetrain characterisation closes the loop: commanding a current limit sets a force limit and the gear-protection ceiling at the same time.</w:t>
       </w:r>
     </w:p>
     <w:p>
@@ -14909,7 +14909,7 @@
           <w:sz w:val="18"/>
           <w:szCs w:val="18"/>
         </w:rPr>
-        <w:t xml:space="preserve">Figure 6.1   Motor to tip force chain across three drivetrain configurations. The gear ceiling binds, not the servo. 12 N is the FEA stress probe, not the operating force.</w:t>
+        <w:t xml:space="preserve">Figure 6.1   Motor to tip force chain across three drivetrain configurations. The gear ceiling is what binds, not the servo. 12 N is the FEA stress probe, not the operating force.</w:t>
       </w:r>
     </w:p>
     <w:p>
@@ -14931,7 +14931,7 @@
     </w:p>
     <w:p>
       <w:pPr>
-        <w:spacing w:after="100" w:before="0" w:line="300"/>
+        <w:spacing w:after="150" w:before="0" w:line="330"/>
       </w:pPr>
       <w:r>
         <w:rPr>
@@ -14967,7 +14967,7 @@
           <w:sz w:val="22"/>
           <w:szCs w:val="22"/>
         </w:rPr>
-        <w:t xml:space="preserve">Mount a load cell (Phidgets 10 kg, 0.03 % FS, around 3 g) and a 24-bit ADC (NAU7802, 80+ SPS) at the finger contact face. Reference uncertainty &lt; 0.05 N, well under the 0.3 N target.</w:t>
+        <w:t xml:space="preserve">Mount a load cell (Phidgets 10 kg, 0.03 % FS, around 3 g) and a 24-bit ADC (NAU7802, 80+ SPS) at the finger contact face. Reference uncertainty &lt; 0.05 N, comfortably under the 0.3 N target.</w:t>
       </w:r>
     </w:p>
     <w:p>
@@ -14990,7 +14990,7 @@
           <w:sz w:val="22"/>
           <w:szCs w:val="22"/>
         </w:rPr>
-        <w:t xml:space="preserve">Apply known tip forces through calibrated weights and a lever arm, or load the pad directly through the cell.</w:t>
+        <w:t xml:space="preserve">Apply known tip forces through calibrated weights and a lever arm, or load the pad straight through the cell.</w:t>
       </w:r>
     </w:p>
     <w:p>
@@ -15013,7 +15013,7 @@
           <w:sz w:val="22"/>
           <w:szCs w:val="22"/>
         </w:rPr>
-        <w:t xml:space="preserve">Log (I_motor, F_cell) pairs at 8 to 12 force levels (1 to 20 N), three cycles each (captures hysteresis, I_0 offset, drivetrain friction).</w:t>
+        <w:t xml:space="preserve">Log (I_motor, F_cell) pairs at 8 to 12 force levels (1 to 20 N), three cycles each, which captures hysteresis, I_0 offset, and drivetrain friction.</w:t>
       </w:r>
     </w:p>
     <w:p>
@@ -15036,7 +15036,7 @@
           <w:sz w:val="22"/>
           <w:szCs w:val="22"/>
         </w:rPr>
-        <w:t xml:space="preserve">Regress F = a·I² + b·I + c (quadratic absorbs the motor R and back-EMF nonlinearity) or fit a lookup table. Require residuals below 0.15 N.</w:t>
+        <w:t xml:space="preserve">Regress F = a·I² + b·I + c (the quadratic soaks up the motor R and back-EMF nonlinearity), or fit a lookup table. Keep residuals below 0.15 N.</w:t>
       </w:r>
     </w:p>
     <w:p>
@@ -15059,7 +15059,7 @@
           <w:sz w:val="22"/>
           <w:szCs w:val="22"/>
         </w:rPr>
-        <w:t xml:space="preserve">Validate on five blind weights; require under 0.3 N error. Re-calibrate after thermal excursions; K_t drifts about −0.1 % per °C.</w:t>
+        <w:t xml:space="preserve">Validate on five blind weights, and require under 0.3 N error. Re-calibrate after thermal excursions, since K_t drifts about −0.1 % per °C.</w:t>
       </w:r>
     </w:p>
     <w:p>
@@ -15112,7 +15112,7 @@
           <w:sz w:val="22"/>
           <w:szCs w:val="22"/>
         </w:rPr>
-        <w:t xml:space="preserve">Motor current is one aggregate number. It cannot say where on the finger the contact is, nor map pressure across the face.</w:t>
+        <w:t xml:space="preserve">Motor current is one aggregate number. It can't say where on the finger the contact sits, and it can't map pressure across the face.</w:t>
       </w:r>
     </w:p>
     <w:p>
@@ -15184,7 +15184,7 @@
           <w:sz w:val="22"/>
           <w:szCs w:val="22"/>
         </w:rPr>
-        <w:t xml:space="preserve">The sensed and commandable force is capped by T_safe; the sensor is most useful precisely as the limiter that keeps the printed gears alive.</w:t>
+        <w:t xml:space="preserve">The sensed and commandable force is capped by T_safe. The sensor is most useful precisely as the limiter that keeps the printed gears alive.</w:t>
       </w:r>
     </w:p>
     <w:p>
@@ -15220,7 +15220,7 @@
           <w:sz w:val="22"/>
           <w:szCs w:val="22"/>
         </w:rPr>
-        <w:t xml:space="preserve">Our grip-texture model ranks object slip risk; it does not give absolute hold force, so neither does a slip-margin readout built on it.</w:t>
+        <w:t xml:space="preserve">Our grip-texture model ranks object slip risk, but it doesn't give absolute hold force, so neither does a slip-margin readout built on it.</w:t>
       </w:r>
     </w:p>
     <w:p>
@@ -15242,7 +15242,7 @@
     </w:p>
     <w:p>
       <w:pPr>
-        <w:spacing w:after="100" w:before="0" w:line="300"/>
+        <w:spacing w:after="150" w:before="0" w:line="330"/>
       </w:pPr>
       <w:r>
         <w:rPr>
@@ -15255,7 +15255,7 @@
           <w:sz w:val="22"/>
           <w:szCs w:val="22"/>
         </w:rPr>
-        <w:t xml:space="preserve">The motor-current approach gives one aggregate force across the whole gripper. The per-pad pressure sensors (innovation 2) give four spatially resolved readings, one per fingertip. For the archaeological use case where the operator needs to know which finger is overloaded, the per-pad sensors carry information the motor-current chain throws away. We ship the per-pad sensors as the primary solution, and treat motor-current as the redundant secondary that survives even if a pad sensor floods.</w:t>
+        <w:t xml:space="preserve">The motor-current approach gives one aggregate force across the whole gripper. The per-pad pressure sensors (innovation 2) give four spatially resolved readings, one per fingertip. For the archaeological use case, where the operator needs to know which finger is overloaded, the per-pad sensors carry information the motor-current chain throws away. So we ship the per-pad sensors as the primary solution, and treat motor-current as the redundant secondary that survives even if a pad sensor floods.</w:t>
       </w:r>
     </w:p>
     <w:p>
@@ -15311,7 +15311,7 @@
     </w:p>
     <w:p>
       <w:pPr>
-        <w:spacing w:after="100" w:before="0" w:line="300"/>
+        <w:spacing w:after="150" w:before="0" w:line="330"/>
       </w:pPr>
       <w:r>
         <w:rPr>
@@ -15324,7 +15324,7 @@
           <w:sz w:val="22"/>
           <w:szCs w:val="22"/>
         </w:rPr>
-        <w:t xml:space="preserve">At the small radii the housing allows, the printed teeth carry far less torque than a 12 N stress-probe grip would demand. This finding emerged from the gear FEA and we record it here in detail because it changes how the rest of the design has to work. The fix is three-part: face-width strengthening (implemented and build-verified), a module and radius re-size (specified as a proposed engineered target, needs CAD clearance validation), and the motor current limit (the sensing pivot) enforcing the safe ceiling in firmware. This is precisely why the magnetic-coupling fallback looks strong in retrospect: its pole-slip torque scales with coupling diameter, not housing radius.</w:t>
+        <w:t xml:space="preserve">At the small radii the housing allows, the printed teeth carry far less torque than a 12 N stress-probe grip would need. We found this in the gear FEA, and we're spelling it out here because it changes how the rest of the design has to work. The fix has three parts: face-width strengthening (done and build-verified), a module and radius re-size (a proposed engineered target that still needs CAD clearance validation), and the motor current limit (the sensing pivot) holding the safe ceiling in firmware. This is exactly why the magnetic-coupling fallback looks good in hindsight: its pole-slip torque scales with coupling diameter, not housing radius.</w:t>
       </w:r>
     </w:p>
     <w:p>
@@ -15346,7 +15346,7 @@
     </w:p>
     <w:p>
       <w:pPr>
-        <w:spacing w:after="100" w:before="0" w:line="300"/>
+        <w:spacing w:after="150" w:before="0" w:line="330"/>
       </w:pPr>
       <w:r>
         <w:rPr>
@@ -15359,7 +15359,7 @@
           <w:sz w:val="22"/>
           <w:szCs w:val="22"/>
         </w:rPr>
-        <w:t xml:space="preserve">A 2D plane-stress FEA of the actual straight-flank tooth (motor/scripts/gear_fea.py, porting the grip Tier-2 Q4 machinery). A worst-case tip tangential load bends a cantilever tooth (root thickness s_root, height h, loaded face width = min of the two mating faces); peak von Mises is sampled in the root band (sharp shoulder, conservative; a real fillet would lower it).</w:t>
+        <w:t xml:space="preserve">A 2D plane-stress FEA of the real straight-flank tooth (motor/scripts/gear_fea.py, porting the grip Tier-2 Q4 machinery). A worst-case tip tangential load bends a cantilever tooth (root thickness s_root, height h, loaded face width = min of the two mating faces). We sample peak von Mises in the root band (sharp shoulder, so it's conservative; a real fillet would lower it).</w:t>
       </w:r>
     </w:p>
     <w:p>
@@ -15383,16 +15383,16 @@
           <w:sz w:val="22"/>
           <w:szCs w:val="22"/>
         </w:rPr>
-        <w:t xml:space="preserve">Two failure modes we have to call out.</w:t>
-      </w:r>
-      <w:r>
-        <w:rPr>
-          <w:rFonts w:ascii="Arial" w:cs="Arial" w:eastAsia="Arial" w:hAnsi="Arial"/>
-          <w:color w:val="1A1A1A"/>
-          <w:sz w:val="22"/>
-          <w:szCs w:val="22"/>
-        </w:rPr>
-        <w:t xml:space="preserve">   First: the earlier framing presented a Lewis form-factor check versus the FEA as cross-validation. It is not. Lewis assumes a 14.5° or 20° involute spur tooth; ours are straight-flank face teeth. Two wrong models that agree are not the same as one right model being confirmed. Second: the crown gear is a 3D problem, not a 2D plane-stress tooth. The contact line sweeps radially under rotation, the load decomposes into tangential plus radial plus axial, the disk-bending compliance matters. None of which the 2D solver captures. We added gear_fea_radial.py, which runs the same 2D FEA at five radial stations and takes the worst (inner-radius) station. That tightens the single-station ceiling by 2.6× because the inner-radius tooth slice has a thinner s_root than the pitch radius.</w:t>
+        <w:t xml:space="preserve">Two failure modes we have to flag. </w:t>
+      </w:r>
+      <w:r>
+        <w:rPr>
+          <w:rFonts w:ascii="Arial" w:cs="Arial" w:eastAsia="Arial" w:hAnsi="Arial"/>
+          <w:color w:val="1A1A1A"/>
+          <w:sz w:val="22"/>
+          <w:szCs w:val="22"/>
+        </w:rPr>
+        <w:t xml:space="preserve">First: the earlier framing presented a Lewis form-factor check against the FEA as cross-validation. It isn't. Lewis assumes a 14.5° or 20° involute spur tooth, and ours are straight-flank face teeth. Two wrong models that agree aren't the same as one right model being confirmed. Second: the crown gear is a 3D problem, not a 2D plane-stress tooth. The contact line sweeps radially under rotation, the load splits into tangential plus radial plus axial, and the disk-bending compliance matters. The 2D solver catches none of that. We added gear_fea_radial.py, which runs the same 2D FEA at five radial stations and takes the worst (inner-radius) one. That tightens the single-station ceiling by 2.6× because the inner-radius tooth slice has a thinner s_root than the pitch radius.</w:t>
       </w:r>
     </w:p>
     <w:p>
@@ -15981,7 +15981,7 @@
     </w:p>
     <w:p>
       <w:pPr>
-        <w:spacing w:after="100" w:before="0" w:line="300"/>
+        <w:spacing w:after="150" w:before="0" w:line="330"/>
       </w:pPr>
       <w:r>
         <w:rPr>
@@ -15994,7 +15994,7 @@
           <w:sz w:val="22"/>
           <w:szCs w:val="22"/>
         </w:rPr>
-        <w:t xml:space="preserve">The sector gear (chunky m around 1.5) is robust; the crown then pinion are the weak links. Face-width doubling roughly halves the root stress but the tiny module dominates, so T_safe only rises from 0.02 to 0.034 N·m, still well below the 0.94 N·m working torque a 12 N grip would need. Strengthening alone is insufficient; the module-and-radius re-size is the only path that approaches the working torque.</w:t>
+        <w:t xml:space="preserve">The sector gear (chunky m around 1.5) holds up well; the crown and then the pinion are the weak links. Doubling the face width roughly halves the root stress, but the tiny module dominates, so T_safe only climbs from 0.02 to 0.034 N·m, still well below the 0.94 N·m working torque a 12 N grip would need. Strengthening on its own isn't enough; the module-and-radius re-size is the only path that gets close to the working torque.</w:t>
       </w:r>
     </w:p>
     <w:p>
@@ -16373,7 +16373,7 @@
           <w:sz w:val="18"/>
           <w:szCs w:val="18"/>
         </w:rPr>
-        <w:t xml:space="preserve">Figure 7.1   Slip margin across the 7-condition battery for the shipped crosshatch texture, at three drivetrain ceilings. Only the proposed re-size (green) clears margin ≥ 1.0 across every wet object class. This is the headline reason the gear re-size is on the roadmap and why bench testing is the gate.</w:t>
+        <w:t xml:space="preserve">Figure 7.1   Slip margin across the 7-condition battery for the shipped crosshatch texture, at three drivetrain ceilings. Only the proposed re-size (green) clears margin ≥ 1.0 across every wet object class. That's the headline reason the gear re-size is on the roadmap and why bench testing is the gate.</w:t>
       </w:r>
     </w:p>
     <w:p>
@@ -16395,7 +16395,7 @@
     </w:p>
     <w:p>
       <w:pPr>
-        <w:spacing w:after="100" w:before="0" w:line="300"/>
+        <w:spacing w:after="150" w:before="0" w:line="330"/>
       </w:pPr>
       <w:r>
         <w:rPr>
@@ -16408,7 +16408,7 @@
           <w:sz w:val="22"/>
           <w:szCs w:val="22"/>
         </w:rPr>
-        <w:t xml:space="preserve">The rock-bottom budget servo (Feetech STS3215, continuous 0.98 N·m) is the binding floor. At 2.667:1 it reaches 12 N at the tip continuously; dropping to 2.2:1 it falls to about 11.4 N and the budget option no longer hits 12 N. So we revisited the ratio and deliberately kept it. The real change here is engineered teeth and a derived current ceiling, not a ratio tweak.</w:t>
+        <w:t xml:space="preserve">The rock-bottom budget servo (Feetech STS3215, continuous 0.98 N·m) sets the binding floor. At 2.667:1 it reaches 12 N at the tip continuously; drop to 2.2:1 and it falls to about 11.4 N, where the budget option no longer hits 12 N. So we went back and looked at the ratio, then kept it on purpose. The real change here is engineered teeth and a derived current ceiling, not a ratio tweak.</w:t>
       </w:r>
     </w:p>
     <w:p>
@@ -16461,7 +16461,7 @@
           <w:sz w:val="22"/>
           <w:szCs w:val="22"/>
         </w:rPr>
-        <w:t xml:space="preserve">The fragility margins quoted at 12 N are worst-case-load margins, used for fair comparison across stiff and compliant finger candidates.</w:t>
+        <w:t xml:space="preserve">The fragility margins we quote at 12 N are worst-case-load margins, used to compare stiff and compliant finger candidates fairly.</w:t>
       </w:r>
     </w:p>
     <w:p>
@@ -16497,7 +16497,7 @@
           <w:sz w:val="22"/>
           <w:szCs w:val="22"/>
         </w:rPr>
-        <w:t xml:space="preserve">Mandatory on every servo in the ladder (their stall torques exceed T_safe by 10 to 30 times).</w:t>
+        <w:t xml:space="preserve">It's mandatory on every servo in the ladder (their stall torques beat T_safe by 10 to 30 times).</w:t>
       </w:r>
     </w:p>
     <w:p>
@@ -16533,7 +16533,7 @@
           <w:sz w:val="22"/>
           <w:szCs w:val="22"/>
         </w:rPr>
-        <w:t xml:space="preserve">A 60 to 80 mm magnetic coupling clears the stall band the geared stage cannot.</w:t>
+        <w:t xml:space="preserve">A 60 to 80 mm magnetic coupling clears the stall band the geared stage can't.</w:t>
       </w:r>
     </w:p>
     <w:p>
@@ -16569,7 +16569,7 @@
           <w:sz w:val="22"/>
           <w:szCs w:val="22"/>
         </w:rPr>
-        <w:t xml:space="preserve">Both 2D bounds are upper bounds. The straight-flank face teeth will edge-load and gall in PA12-GF rather than roll cleanly. The printed-coupon torque-to-failure test is the only bench-grade answer.</w:t>
+        <w:t xml:space="preserve">Both 2D bounds are upper bounds. The straight-flank face teeth will edge-load and gall in PA12-GF instead of rolling cleanly. The printed-coupon torque-to-failure test is the only bench-grade answer.</w:t>
       </w:r>
     </w:p>
     <w:p>
@@ -16619,7 +16619,7 @@
     </w:p>
     <w:p>
       <w:pPr>
-        <w:spacing w:after="100" w:before="0" w:line="300"/>
+        <w:spacing w:after="150" w:before="0" w:line="330"/>
       </w:pPr>
       <w:r>
         <w:rPr>
@@ -16632,7 +16632,7 @@
           <w:sz w:val="22"/>
           <w:szCs w:val="22"/>
         </w:rPr>
-        <w:t xml:space="preserve">Galvanic corrosion has nothing to attack in our gripper because there is no metal anywhere inside it. Every pin, every snap, every gear, every shaft is printed. The only metal in the whole system lives inside the user's actuator canister, isolated from the seawater. That removes an entire failure-mode class (galvanic pitting, bushing dryout, dowel galling) before it can start.</w:t>
+        <w:t xml:space="preserve">Galvanic corrosion has nothing to bite on in our gripper, because there's no metal anywhere inside it. Every pin, every snap, every gear, every shaft is printed. The only metal in the whole system lives inside the user's actuator canister, isolated from the seawater. That takes a whole class of failure modes (galvanic pitting, bushing dryout, dowel galling) off the table before it can even start.</w:t>
       </w:r>
     </w:p>
     <w:p>
@@ -16677,7 +16677,7 @@
     </w:p>
     <w:p>
       <w:pPr>
-        <w:spacing w:after="100" w:before="0" w:line="300"/>
+        <w:spacing w:after="150" w:before="0" w:line="330"/>
       </w:pPr>
       <w:r>
         <w:rPr>
@@ -16690,7 +16690,7 @@
           <w:sz w:val="22"/>
           <w:szCs w:val="22"/>
         </w:rPr>
-        <w:t xml:space="preserve">There are three materials in the production build, assigned by structural role:</w:t>
+        <w:t xml:space="preserve">The production build uses three materials, each assigned by what it has to do structurally:</w:t>
       </w:r>
     </w:p>
     <w:tbl>
@@ -18398,7 +18398,7 @@
     </w:p>
     <w:p>
       <w:pPr>
-        <w:spacing w:after="100" w:before="0" w:line="300"/>
+        <w:spacing w:after="150" w:before="0" w:line="330"/>
       </w:pPr>
       <w:r>
         <w:rPr>
@@ -18411,7 +18411,7 @@
           <w:sz w:val="22"/>
           <w:szCs w:val="22"/>
         </w:rPr>
-        <w:t>Total filament for the production build: about 120 to 175 g of PA12-GF, 50 to 70 g of TPU 95A HF, and 4 to 8 g of PETG-HF for the finger pins. Test prints during iteration use PETG-HF for everything that ships in PA12-GF, because PETG-HF iterates faster and matches PA12-GF dimensionally close enough to fit-test snap geometries before committing the slower PA12-GF print.</w:t>
+        <w:t xml:space="preserve">Total filament for the production build comes to about 120 to 175 g of PA12-GF, 50 to 70 g of TPU 95A HF, and 4 to 8 g of PETG-HF for the finger pins. While we iterate, the test prints use PETG-HF for everything that ships in PA12-GF, because PETG-HF prints faster and matches PA12-GF dimensionally closely enough to fit-test the snap geometries before we commit to the slower PA12-GF print.</w:t>
       </w:r>
     </w:p>
     <w:p>
@@ -18433,7 +18433,7 @@
     </w:p>
     <w:p>
       <w:pPr>
-        <w:spacing w:after="100" w:before="0" w:line="300"/>
+        <w:spacing w:after="150" w:before="0" w:line="330"/>
       </w:pPr>
       <w:r>
         <w:rPr>
@@ -18446,12 +18446,12 @@
           <w:sz w:val="22"/>
           <w:szCs w:val="22"/>
         </w:rPr>
-        <w:t xml:space="preserve">PA12 is the lowest-water-uptake engineering nylon. Saturated seawater absorption sits at about 0.7 to 1.2 %, and the glass fill reduces that further. It does not hydrolyse. It holds tight dimensions under sustained immersion. The 30 % glass fill gives roughly 3.5 to 5.5 GPa modulus and low creep, which is the right answer for gearbox bodies, link arms, the input shaft, and the axle dowels that have to keep their pivot geometry over months underwater.</w:t>
-      </w:r>
-    </w:p>
-    <w:p>
-      <w:pPr>
-        <w:spacing w:after="100" w:before="0" w:line="300"/>
+        <w:t xml:space="preserve">PA12 is the lowest-water-uptake engineering nylon out there. Saturated seawater absorption sits at about 0.7 to 1.2 %, and the glass fill brings that down further. It doesn't hydrolyse. It holds tight dimensions even after long immersion. The 30 % glass fill gives roughly 3.5 to 5.5 GPa modulus and low creep, which is exactly what we want for the gearbox bodies, the link arms, the input shaft, and the axle dowels that have to keep their pivot geometry over months underwater.</w:t>
+      </w:r>
+    </w:p>
+    <w:p>
+      <w:pPr>
+        <w:spacing w:after="150" w:before="0" w:line="330"/>
       </w:pPr>
       <w:r>
         <w:rPr>
@@ -18464,7 +18464,7 @@
           <w:sz w:val="22"/>
           <w:szCs w:val="22"/>
         </w:rPr>
-        <w:t>PA12-GF replaces a previous spec for carbon-filled Nylon 12 (PA12-CF). PA12-CF needs a 45 to 60 °C heated chamber the Bambu P1S we print on cannot hold. Without that chamber, PA12-CF lays down with poor inter-layer adhesion and warps on cooling. PA12-GF is the right material on its properties — the glass fill plus PA12’s inherently low water uptake covers the seawater duty cycle — but we are honest that it is marginal on the P1S, which has no actively heated chamber: glass-filled nylon is warp-prone on the larger parts, so it wants a closed chamber, a brim, and a 260 to 280 °C nozzle over a 90 °C bed with glue stick. Where that proves troublesome, the P1S-friendly substitutions that keep most of the rigidity are Bambu PAHT-CF or PETG-CF, or plain PETG-HF for a lower-spec build. The glass fill also pulls dimensional drift below the carbon-filled grade because glass fibres do not bend under print stress the way short carbon fibres do.</w:t>
+        <w:t xml:space="preserve">PA12-GF replaces an earlier spec for carbon-filled Nylon 12 (PA12-CF). PA12-CF needs a 45 to 60 °C heated chamber, and the Bambu P1S we print on can't hold that. Without the chamber, PA12-CF lays down with poor inter-layer adhesion and warps as it cools. On its properties, PA12-GF is the right material (the glass fill plus PA12's naturally low water uptake covers the seawater duty cycle), but we'll be honest that it's marginal on the P1S, which has no actively heated chamber: glass-filled nylon is warp-prone on the larger parts, so it wants a closed chamber, a brim, and a 260 to 280 °C nozzle over a 90 °C bed with glue stick. Where that gets troublesome, the P1S-friendly substitutions that keep most of the rigidity are Bambu PAHT-CF or PETG-CF, or plain PETG-HF for a lower-spec build. The glass fill also pulls dimensional drift below the carbon-filled grade, because glass fibres don't bend under print stress the way short carbon fibres do.</w:t>
       </w:r>
     </w:p>
     <w:p>
@@ -18486,7 +18486,7 @@
     </w:p>
     <w:p>
       <w:pPr>
-        <w:spacing w:after="100" w:before="0" w:line="300"/>
+        <w:spacing w:after="150" w:before="0" w:line="330"/>
       </w:pPr>
       <w:r>
         <w:rPr>
@@ -18499,12 +18499,12 @@
           <w:sz w:val="22"/>
           <w:szCs w:val="22"/>
         </w:rPr>
-        <w:t xml:space="preserve">Glass fill trades ductility for stiffness. Unfilled PA12 prints at roughly 10 to 20 % elongation at break; the 30 % glass-filled grade drops elongation to about 3 to 8 % and removes the yield plateau. Filled PA12 fails by cracking rather than yielding. For one-time assembly snaps the design allowable is conservatively 1.5 to 2.0 % strain.</w:t>
-      </w:r>
-    </w:p>
-    <w:p>
-      <w:pPr>
-        <w:spacing w:after="100" w:before="0" w:line="300"/>
+        <w:t xml:space="preserve">Glass fill trades ductility for stiffness. Unfilled PA12 prints at roughly 10 to 20 % elongation at break; the 30 % glass-filled grade drops that to about 3 to 8 % and removes the yield plateau. Filled PA12 fails by cracking instead of yielding. For one-time assembly snaps, we set the design allowable conservatively at 1.5 to 2.0 % strain.</w:t>
+      </w:r>
+    </w:p>
+    <w:p>
+      <w:pPr>
+        <w:spacing w:after="150" w:before="0" w:line="330"/>
       </w:pPr>
       <w:r>
         <w:rPr>
@@ -18517,12 +18517,12 @@
           <w:sz w:val="22"/>
           <w:szCs w:val="22"/>
         </w:rPr>
-        <w:t xml:space="preserve">The barbed split-tip pin geometry that secures the fingers must flex inward as it passes through the receiving bore. The split tip has a 0.9 mm proud barb (nominal), 1.0 mm worst-tight at the loose tolerance edge. Working the strain through the cantilever surface model ε = 3·t·δ / (2·L²) on the effective slot length gives a nominal insertion strain of 2.50 % and a worst-tight insertion strain of 2.78 %. Both numbers exceed PA12-GF's 1.5 to 2.0 % allowable. A finger snap pin printed in PA12-GF would crack on the way in.</w:t>
-      </w:r>
-    </w:p>
-    <w:p>
-      <w:pPr>
-        <w:spacing w:after="100" w:before="0" w:line="300"/>
+        <w:t xml:space="preserve">The barbed split-tip pin that secures the fingers has to flex inward as it passes through the receiving bore. The split tip has a 0.9 mm proud barb (nominal), 1.0 mm worst-tight at the loose tolerance edge. Working the strain through the cantilever surface model ε = 3·t·δ / (2·L²) on the effective slot length gives a nominal insertion strain of 2.50 % and a worst-tight insertion strain of 2.78 %. Both numbers run past PA12-GF's 1.5 to 2.0 % allowable. A finger snap pin printed in PA12-GF would crack on the way in.</w:t>
+      </w:r>
+    </w:p>
+    <w:p>
+      <w:pPr>
+        <w:spacing w:after="150" w:before="0" w:line="330"/>
       </w:pPr>
       <w:r>
         <w:rPr>
@@ -18535,7 +18535,7 @@
           <w:sz w:val="22"/>
           <w:szCs w:val="22"/>
         </w:rPr>
-        <w:t xml:space="preserve">PETG-HF (high-flow) has the same modulus, strength, and elongation as regular PETG; high-flow is a processing variant for faster prints. Its one-time-assembly allowable is 2.5 to 3.5 %. The 2.78 % worst-tight strain sits inside that band with margin. The four finger snap pins go in PETG-HF, marked with a star in the BOM, while every other part stays PA12-GF. The pull-out load on the snapped pin is not carried by the pin material at all; it is taken by the rigid PA12-GF counterbore shoulder in the receiving arm or follower eye. The pin only has to survive the one-time insertion, and PETG-HF does that with margin.</w:t>
+        <w:t xml:space="preserve">PETG-HF (high-flow) has the same modulus, strength, and elongation as regular PETG; high-flow is just a processing variant for faster prints. Its one-time-assembly allowable is 2.5 to 3.5 %. The 2.78 % worst-tight strain sits inside that band with room to spare. So the four finger snap pins go in PETG-HF, marked with a star in the BOM, while every other part stays PA12-GF. The pull-out load on the snapped pin isn't carried by the pin material at all; it's taken by the rigid PA12-GF counterbore shoulder in the receiving arm or follower eye. The pin only has to survive the one-time insertion, and PETG-HF does that with margin.</w:t>
       </w:r>
     </w:p>
     <w:p>
@@ -18559,16 +18559,16 @@
           <w:sz w:val="22"/>
           <w:szCs w:val="22"/>
         </w:rPr>
-        <w:t xml:space="preserve">The cover clip needed a separate fix.</w:t>
-      </w:r>
-      <w:r>
-        <w:rPr>
-          <w:rFonts w:ascii="Arial" w:cs="Arial" w:eastAsia="Arial" w:hAnsi="Arial"/>
-          <w:color w:val="1A1A1A"/>
-          <w:sz w:val="22"/>
-          <w:szCs w:val="22"/>
-        </w:rPr>
-        <w:t xml:space="preserve">   The 4 cantilever snap clips on the front cover were originally tuned to PETG's elastic band and would have failed at 3.32 % worst-tight strain in PA12-GF. We re-tuned the geometry rather than the material: SNAP_Z0 was lowered from 6.5 to 1.5 (lengthening the cantilever arm), and SNAP_ARM_T was thinned from 2.8 mm to 2.0 mm. New worst-tight strain is 1.36 %, well inside the PA12-GF allowable. gripper.py now asserts the worst-tight strain stays below 1.5 % and fails the build loud if it does not.</w:t>
+        <w:t xml:space="preserve">The cover clip needed its own fix. </w:t>
+      </w:r>
+      <w:r>
+        <w:rPr>
+          <w:rFonts w:ascii="Arial" w:cs="Arial" w:eastAsia="Arial" w:hAnsi="Arial"/>
+          <w:color w:val="1A1A1A"/>
+          <w:sz w:val="22"/>
+          <w:szCs w:val="22"/>
+        </w:rPr>
+        <w:t xml:space="preserve">The 4 cantilever snap clips on the front cover were originally tuned to PETG's elastic band, and they would have failed at 3.32 % worst-tight strain in PA12-GF. We re-tuned the geometry instead of the material: SNAP_Z0 dropped from 6.5 to 1.5 (lengthening the cantilever arm), and SNAP_ARM_T thinned from 2.8 mm to 2.0 mm. The new worst-tight strain is 1.36 %, well inside the PA12-GF allowable. gripper.py now asserts the worst-tight strain stays below 1.5 % and fails the build loudly if it doesn't.</w:t>
       </w:r>
     </w:p>
     <w:p>
@@ -18585,12 +18585,12 @@
           <w:sz w:val="26"/>
           <w:szCs w:val="26"/>
         </w:rPr>
-        <w:t>Why TPU 95A HF for the fingers (and the hydrolysis question)</w:t>
-      </w:r>
-    </w:p>
-    <w:p>
-      <w:pPr>
-        <w:spacing w:after="100" w:before="0" w:line="300"/>
+        <w:t xml:space="preserve">Why TPU 95A HF for the fingers (and the hydrolysis question)</w:t>
+      </w:r>
+    </w:p>
+    <w:p>
+      <w:pPr>
+        <w:spacing w:after="150" w:before="0" w:line="330"/>
       </w:pPr>
       <w:r>
         <w:rPr>
@@ -18603,12 +18603,12 @@
           <w:sz w:val="22"/>
           <w:szCs w:val="22"/>
         </w:rPr>
-        <w:t xml:space="preserve">The Fin Ray grip principle is material compliance. The fingers have to flex visibly as they wrap an object; that is the whole mechanism. TPU at 95 Shore A is the right hardness. Softer TPU (85A) gives more compliance but loses grip force; harder TPU (98A) gives more grip force but loses wrap. 95A is the standard middle ground for soft robotic grippers.</w:t>
-      </w:r>
-    </w:p>
-    <w:p>
-      <w:pPr>
-        <w:spacing w:after="100" w:before="0" w:line="300"/>
+        <w:t xml:space="preserve">The Fin Ray grip principle is all about material compliance. The fingers have to flex visibly as they wrap an object; that's the whole mechanism. TPU at 95 Shore A is the right hardness. Softer TPU (85A) gives more compliance but loses grip force; harder TPU (98A) gives more grip force but loses the wrap. 95A is the standard middle ground for soft robotic grippers.</w:t>
+      </w:r>
+    </w:p>
+    <w:p>
+      <w:pPr>
+        <w:spacing w:after="150" w:before="0" w:line="330"/>
       </w:pPr>
       <w:r>
         <w:rPr>
@@ -18621,12 +18621,12 @@
           <w:sz w:val="22"/>
           <w:szCs w:val="22"/>
         </w:rPr>
-        <w:t xml:space="preserve">There are two TPU chemistries: ester-based and ether-based (polyether). They look identical, print the same way, and have almost identical mechanical properties. They differ in one thing that matters here: hydrolysis resistance. Ester-based TPU hydrolyses in sustained or warm immersion. Underwater for weeks, an ester-based TPU finger crumbles from the inside out. Ether-based TPU is hydrolysis-stable; it survives sustained marine immersion.</w:t>
-      </w:r>
-    </w:p>
-    <w:p>
-      <w:pPr>
-        <w:spacing w:after="100" w:before="0" w:line="300"/>
+        <w:t xml:space="preserve">There are two TPU chemistries: ester-based and ether-based (polyether). They look identical, print the same way, and have almost identical mechanical properties. They differ in the one thing that matters here: hydrolysis resistance. Ester-based TPU hydrolyses in sustained or warm immersion. Left underwater for weeks, an ester-based TPU finger crumbles from the inside out. Ether-based TPU is hydrolysis-stable, and it survives sustained marine immersion.</w:t>
+      </w:r>
+    </w:p>
+    <w:p>
+      <w:pPr>
+        <w:spacing w:after="150" w:before="0" w:line="330"/>
       </w:pPr>
       <w:r>
         <w:rPr>
@@ -18639,7 +18639,7 @@
           <w:sz w:val="22"/>
           <w:szCs w:val="22"/>
         </w:rPr>
-        <w:t xml:space="preserve">We print the fingers in Bambu TPU 95A HF. Two things drove the switch from the eSUN eTPU-95A we used earlier. First, and decisively, Bambu publishes ISO 527 mechanical data measured on printed specimens — an in-plane modulus of 9.8 MPa and tensile strength of 27.3 MPa, and a through-Z modulus of 7.4 MPa and strength of 22.3 MPa — so the finger FEA now runs on a measured, direction-aware number instead of the old 40 MPa estimate. Second, the high-flow grade prints at roughly three times the throughput of standard 95A TPU, which matters on a finger this size. The honest cost of the switch is the hydrolysis story: Bambu does not state whether 95A HF is ester- or ether-based, so we lose the published polyether claim eSUN gave us. The measured saturated water uptake is low, about 1.08 %, which is encouraging but not a chemistry guarantee. That is exactly why the 7-day seawater soak test in the bench plan (§13) is now load-bearing rather than a formality: it is the gate that confirms the chosen filament survives sustained immersion.</w:t>
+        <w:t xml:space="preserve">We print the fingers in Bambu TPU 95A HF. Two things drove the switch from the eSUN eTPU-95A we used earlier. First, and decisively, Bambu publishes ISO 527 mechanical data measured on printed specimens: an in-plane modulus of 9.8 MPa and tensile strength of 27.3 MPa, plus a through-Z modulus of 7.4 MPa and strength of 22.3 MPa. So the finger FEA now runs on a measured, direction-aware number instead of the old 40 MPa estimate. Second, the high-flow grade prints at roughly three times the throughput of standard 95A TPU, which matters on a finger this size. The honest cost of the switch is the hydrolysis story: Bambu doesn't state whether 95A HF is ester- or ether-based, so we lose the published polyether claim eSUN gave us. The measured saturated water uptake is low, about 1.08 %, which is encouraging but not a chemistry guarantee. That's exactly why the 7-day seawater soak test in the bench plan (§13) is now load-bearing rather than a formality: it's the gate that confirms the chosen filament survives sustained immersion.</w:t>
       </w:r>
     </w:p>
     <w:p>
@@ -18692,7 +18692,7 @@
           <w:sz w:val="22"/>
           <w:szCs w:val="22"/>
         </w:rPr>
-        <w:t xml:space="preserve">hydrolyses underwater. Loses strength over days to weeks of immersion. Reject for every part.</w:t>
+        <w:t xml:space="preserve">hydrolyses underwater. It loses strength over days to weeks of immersion. Reject for every part.</w:t>
       </w:r>
     </w:p>
     <w:p>
@@ -18728,7 +18728,7 @@
           <w:sz w:val="22"/>
           <w:szCs w:val="22"/>
         </w:rPr>
-        <w:t xml:space="preserve">absorbs 1 to 3 % water and more, swells, softens, drifts dimensionally. Only the lowest-uptake nylon (PA12) with glass fill is acceptable.</w:t>
+        <w:t xml:space="preserve">absorbs 1 to 3 % water and more, swells, softens, and drifts dimensionally. Only the lowest-uptake nylon (PA12) with glass fill is acceptable.</w:t>
       </w:r>
     </w:p>
     <w:p>
@@ -18764,7 +18764,7 @@
           <w:sz w:val="22"/>
           <w:szCs w:val="22"/>
         </w:rPr>
-        <w:t xml:space="preserve">needs the 45 to 60 °C heated chamber the P1S cannot hold; carbon fibre also contaminates the recycling stream. Glass-filled PA12 is the right answer.</w:t>
+        <w:t xml:space="preserve">needs the 45 to 60 °C heated chamber the P1S can't hold; carbon fibre also contaminates the recycling stream. Glass-filled PA12 is the right answer.</w:t>
       </w:r>
     </w:p>
     <w:p>
@@ -18800,7 +18800,7 @@
           <w:sz w:val="22"/>
           <w:szCs w:val="22"/>
         </w:rPr>
-        <w:t xml:space="preserve">an acceptable test-print material but not the final production answer. PETG's modulus (~1.7 to 2.1 GPa) is below PA12-GF's (~3.5 to 5.5 GPa); PETG also creeps under sustained load. For the gear arms and the input shaft running in flooded journal bores, the PA12-GF stiffness and low creep both matter.</w:t>
+        <w:t xml:space="preserve">an acceptable test-print material, but not the final production answer. PETG's modulus (~1.7 to 2.1 GPa) is below PA12-GF's (~3.5 to 5.5 GPa), and PETG also creeps under sustained load. For the gear arms and the input shaft running in flooded journal bores, the PA12-GF stiffness and low creep both matter.</w:t>
       </w:r>
     </w:p>
     <w:p>
@@ -18836,7 +18836,7 @@
           <w:sz w:val="22"/>
           <w:szCs w:val="22"/>
         </w:rPr>
-        <w:t xml:space="preserve">the fibre kills any recycling story and the part geometry does not need the extra stiffness above PA12-GF.</w:t>
+        <w:t xml:space="preserve">the fibre kills any recycling story, and the part geometry doesn't need the extra stiffness above PA12-GF.</w:t>
       </w:r>
     </w:p>
     <w:p>
@@ -18908,7 +18908,7 @@
           <w:sz w:val="22"/>
           <w:szCs w:val="22"/>
         </w:rPr>
-        <w:t xml:space="preserve">hydrolyses. Crumbles in sustained marine immersion. Reject every ester grade.</w:t>
+        <w:t xml:space="preserve">hydrolyses. It crumbles in sustained marine immersion. Reject every ester grade.</w:t>
       </w:r>
     </w:p>
     <w:p>
@@ -18944,7 +18944,7 @@
           <w:sz w:val="22"/>
           <w:szCs w:val="22"/>
         </w:rPr>
-        <w:t xml:space="preserve">creeps under sustained axial load. The pin head relaxes and wallows the bore, the snap retention is lost. PA12-GF for the axle dowels (no flex) and PETG-HF for the finger snap pins (one-time flex). No TPU.</w:t>
+        <w:t xml:space="preserve">creeps under sustained axial load. The pin head relaxes and wallows the bore, and the snap retention is lost. PA12-GF for the axle dowels (no flex) and PETG-HF for the finger snap pins (one-time flex). No TPU.</w:t>
       </w:r>
     </w:p>
     <w:p>
@@ -18980,7 +18980,7 @@
           <w:sz w:val="22"/>
           <w:szCs w:val="22"/>
         </w:rPr>
-        <w:t xml:space="preserve">the oil leaches out flooded, leaving a dry porous bush. Not applicable here (we have no bushings) but worth recording: the input shaft runs in flooded printed journal bores, no bushing of any kind.</w:t>
+        <w:t xml:space="preserve">the oil leaches out once flooded, leaving a dry porous bush. It isn't applicable here (we have no bushings), but it's worth recording: the input shaft runs in flooded printed journal bores, with no bushing of any kind.</w:t>
       </w:r>
     </w:p>
     <w:p>
@@ -19002,7 +19002,7 @@
     </w:p>
     <w:p>
       <w:pPr>
-        <w:spacing w:after="100" w:before="0" w:line="300"/>
+        <w:spacing w:after="150" w:before="0" w:line="330"/>
       </w:pPr>
       <w:r>
         <w:rPr>
@@ -20177,7 +20177,7 @@
     </w:p>
     <w:p>
       <w:pPr>
-        <w:spacing w:after="100" w:before="0" w:line="300"/>
+        <w:spacing w:after="150" w:before="0" w:line="330"/>
       </w:pPr>
       <w:r>
         <w:rPr>
@@ -20190,7 +20190,7 @@
           <w:sz w:val="22"/>
           <w:szCs w:val="22"/>
         </w:rPr>
-        <w:t xml:space="preserve">Every part is designed to standard FDM rules so it prints reliably on any 0.4 mm-nozzle FDM machine with no exotic settings:</w:t>
+        <w:t xml:space="preserve">Every part is designed to standard FDM rules, so it prints reliably on any 0.4 mm-nozzle FDM machine with no exotic settings:</w:t>
       </w:r>
     </w:p>
     <w:tbl>
@@ -20858,7 +20858,7 @@
     </w:p>
     <w:p>
       <w:pPr>
-        <w:spacing w:after="100" w:before="0" w:line="300"/>
+        <w:spacing w:after="150" w:before="0" w:line="330"/>
       </w:pPr>
       <w:r>
         <w:rPr>
@@ -20871,7 +20871,7 @@
           <w:sz w:val="22"/>
           <w:szCs w:val="22"/>
         </w:rPr>
-        <w:t xml:space="preserve">Seawater is the hard case. Our gripper is designed flooded; there is nothing to seal inside it. So the audit is about polymer chemistry, no trapped air, net buoyancy, galvanic isolation, and creep at the load-bearing snaps.</w:t>
+        <w:t xml:space="preserve">Seawater is the hard case. Our gripper is built to flood, so there's nothing to seal inside it. That means the audit is about polymer chemistry, no trapped air, net buoyancy, galvanic isolation, and creep at the load-bearing snaps.</w:t>
       </w:r>
     </w:p>
     <w:p>
@@ -21646,7 +21646,7 @@
     </w:p>
     <w:p>
       <w:pPr>
-        <w:spacing w:after="100" w:before="0" w:line="300"/>
+        <w:spacing w:after="150" w:before="0" w:line="330"/>
       </w:pPr>
       <w:r>
         <w:rPr>
@@ -21659,12 +21659,12 @@
           <w:sz w:val="22"/>
           <w:szCs w:val="22"/>
         </w:rPr>
-        <w:t xml:space="preserve">The audit above settles the chemistry, the buoyancy, and the flooded geometry. We also ran the finger through a full three-dimensional pressure FEA to answer the blunt question a judge always asks: does the water itself crush it? The answer splits cleanly on one variable — whether the Fin Ray cells flood.</w:t>
-      </w:r>
-    </w:p>
-    <w:p>
-      <w:pPr>
-        <w:spacing w:after="100" w:before="0" w:line="300"/>
+        <w:t xml:space="preserve">The audit above settles the chemistry, the buoyancy, and the flooded geometry. We also ran the finger through a full three-dimensional pressure FEA to answer the blunt question a judge always asks: does the water itself crush it? The answer splits cleanly on one variable, whether the Fin Ray cells flood.</w:t>
+      </w:r>
+    </w:p>
+    <w:p>
+      <w:pPr>
+        <w:spacing w:after="150" w:before="0" w:line="330"/>
       </w:pPr>
       <w:r>
         <w:rPr>
@@ -21677,12 +21677,12 @@
           <w:sz w:val="22"/>
           <w:szCs w:val="22"/>
         </w:rPr>
-        <w:t xml:space="preserve">Flooded, the finger is fine at any practical depth. Water presses on every wetted surface at once, inside the cells and outside the skin, so the stress state is pure hydrostatic compression and the von Mises, shape-changing stress is essentially zero. The whole finger shrinks uniformly — about 1 % in linear size at 100 metres — without distorting. There is no depth in the archaeological range where a flooded finger is structurally at risk.</w:t>
-      </w:r>
-    </w:p>
-    <w:p>
-      <w:pPr>
-        <w:spacing w:after="100" w:before="0" w:line="300"/>
+        <w:t xml:space="preserve">Flooded, the finger is fine at any practical depth. Water presses on every wetted surface at once, inside the cells and outside the skin, so the stress state is pure hydrostatic compression and the von Mises, shape-changing stress is essentially zero. The whole finger shrinks uniformly, about 1 % in linear size at 100 metres, without distorting. There's no depth in the archaeological range where a flooded finger is structurally at risk.</w:t>
+      </w:r>
+    </w:p>
+    <w:p>
+      <w:pPr>
+        <w:spacing w:after="150" w:before="0" w:line="330"/>
       </w:pPr>
       <w:r>
         <w:rPr>
@@ -21695,12 +21695,12 @@
           <w:sz w:val="22"/>
           <w:szCs w:val="22"/>
         </w:rPr>
-        <w:t xml:space="preserve">Trapped air is the dangerous case, and it is dangerous from shallow water. If the cells fail to flood and hold air at surface pressure, the depth pressure becomes a real mechanical load. The 3-D solve shows peak von Mises climbing to about 3.8 MPa at 30 metres and 12.6 MPa at 100 metres, and — more tellingly — the contact face sags by more than the finger’s own thickness even at shallow depth, so the wrap is geometrically wrecked long before the material yields. The material itself yields beyond about 177 metres. This corrected an earlier two-dimensional estimate that read far lower: the 2-D model held the through-thickness strain at zero and hid the dominant collapse mode.</w:t>
-      </w:r>
-    </w:p>
-    <w:p>
-      <w:pPr>
-        <w:spacing w:after="100" w:before="0" w:line="300"/>
+        <w:t xml:space="preserve">Trapped air is the dangerous case, and it's dangerous from shallow water. If the cells fail to flood and hold air at surface pressure, the depth pressure becomes a real mechanical load. The 3-D solve shows peak von Mises climbing to about 3.8 MPa at 30 metres and 12.6 MPa at 100 metres, and, more tellingly, the contact face sags by more than the finger’s own thickness even at shallow depth, so the wrap is geometrically wrecked long before the material yields. The material itself yields beyond about 177 metres. This corrected an earlier two-dimensional estimate that read far lower: the 2-D model held the through-thickness strain at zero and hid the dominant collapse mode.</w:t>
+      </w:r>
+    </w:p>
+    <w:p>
+      <w:pPr>
+        <w:spacing w:after="150" w:before="0" w:line="330"/>
       </w:pPr>
       <w:r>
         <w:rPr>
@@ -21713,12 +21713,12 @@
           <w:sz w:val="22"/>
           <w:szCs w:val="22"/>
         </w:rPr>
-        <w:t xml:space="preserve">The design consequence is a procedure, not a redesign. Submerge the gripper fingers-down, let it soak for about thirty seconds, and cycle it open and closed once underwater to purge any trapped bubble. Because every part is a single solid with one shell and the cells drain through open channels, flooding is reliable — but it is a pre-dive step that matters from depth zero, not only on deep dives.</w:t>
-      </w:r>
-    </w:p>
-    <w:p>
-      <w:pPr>
-        <w:spacing w:after="100" w:before="0" w:line="300"/>
+        <w:t xml:space="preserve">The design consequence is a procedure, not a redesign. Submerge the gripper fingers-down, let it soak for about thirty seconds, and cycle it open and closed once underwater to purge any trapped bubble. Because every part is a single solid with one shell and the cells drain through open channels, flooding is reliable, but it's a pre-dive step that matters from depth zero, not only on deep dives.</w:t>
+      </w:r>
+    </w:p>
+    <w:p>
+      <w:pPr>
+        <w:spacing w:after="150" w:before="0" w:line="330"/>
       </w:pPr>
       <w:r>
         <w:rPr>
@@ -21731,7 +21731,7 @@
           <w:sz w:val="22"/>
           <w:szCs w:val="22"/>
         </w:rPr>
-        <w:t xml:space="preserve">One detail carries over from the filament switch. The crush von Mises field is load-controlled, so it is independent of the finger’s stiffness — the stress numbers above are identical to the earlier eSUN run. What the softer measured modulus changes is the displacement, which is roughly five times larger, and, through the measured 22.3 MPa through-Z strength, the material-yield depth, which moves from about 199 m to about 177 m.</w:t>
+        <w:t xml:space="preserve">One detail carries over from the filament switch. The crush von Mises field is load-controlled, so it doesn't depend on the finger’s stiffness, and the stress numbers above are identical to the earlier eSUN run. What the softer measured modulus changes is the displacement, which is roughly five times larger, and, through the measured 22.3 MPa through-Z strength, the material-yield depth, which moves from about 199 m to about 177 m.</w:t>
       </w:r>
     </w:p>
     <w:p>
@@ -21753,7 +21753,7 @@
     </w:p>
     <w:p>
       <w:pPr>
-        <w:spacing w:after="100" w:before="0" w:line="300"/>
+        <w:spacing w:after="150" w:before="0" w:line="330"/>
       </w:pPr>
       <w:r>
         <w:rPr>
@@ -22223,7 +22223,7 @@
     </w:p>
     <w:p>
       <w:pPr>
-        <w:spacing w:after="100" w:before="0" w:line="300"/>
+        <w:spacing w:after="150" w:before="0" w:line="330"/>
       </w:pPr>
       <w:r>
         <w:rPr>
@@ -22236,12 +22236,12 @@
           <w:sz w:val="22"/>
           <w:szCs w:val="22"/>
         </w:rPr>
-        <w:t xml:space="preserve">Pre-dive: confirm material (no PLA, no ester-TPU, no unfilled nylon); confirm snap pins meet geometric capture; tug-test every pin and the cover; confirm drains and slots and windows are clear and the cavity floods in your dive orientation; cycle open and close in air; confirm the actuator is sealed and rated for depth; verify buoyancy trim with the actuator fitted.</w:t>
-      </w:r>
-    </w:p>
-    <w:p>
-      <w:pPr>
-        <w:spacing w:after="100" w:before="0" w:line="300"/>
+        <w:t xml:space="preserve">Pre-dive: confirm material (no PLA, no ester-TPU, no unfilled nylon); confirm snap pins meet geometric capture; tug-test every pin and the cover; confirm drains and slots and windows are clear and the cavity floods in your dive orientation; cycle open and close in air; confirm the actuator is sealed and rated for depth; check buoyancy trim with the actuator fitted.</w:t>
+      </w:r>
+    </w:p>
+    <w:p>
+      <w:pPr>
+        <w:spacing w:after="150" w:before="0" w:line="330"/>
       </w:pPr>
       <w:r>
         <w:rPr>
@@ -22254,7 +22254,7 @@
           <w:sz w:val="22"/>
           <w:szCs w:val="22"/>
         </w:rPr>
-        <w:t xml:space="preserve">Post-dive: rinse thoroughly with fresh water (salt crystallises and abrades); cycle to flush grit; inspect teeth and pins for wear, the TPU for any swelling; inspect every snap pin and the cover clips for engagement; replace any pins that have loosened.</w:t>
+        <w:t xml:space="preserve">Post-dive: rinse well with fresh water (salt crystallises and abrades); cycle to flush grit; check teeth and pins for wear and the TPU for any swelling; check every snap pin and the cover clips for engagement; replace any pins that have loosened.</w:t>
       </w:r>
     </w:p>
     <w:p>
@@ -23484,7 +23484,7 @@
     </w:p>
     <w:p>
       <w:pPr>
-        <w:spacing w:after="100" w:before="0" w:line="300"/>
+        <w:spacing w:after="150" w:before="0" w:line="330"/>
       </w:pPr>
       <w:r>
         <w:rPr>
@@ -23497,7 +23497,7 @@
           <w:sz w:val="22"/>
           <w:szCs w:val="22"/>
         </w:rPr>
-        <w:t xml:space="preserve">The 8 printed pins divide into two families with different retention mechanisms. Confusing them at assembly time will fail the build.</w:t>
+        <w:t xml:space="preserve">The 8 printed pins split into two families, and each holds itself in place a different way. Mix them up at assembly time and the build won't work.</w:t>
       </w:r>
     </w:p>
     <w:p>
@@ -23519,7 +23519,7 @@
     </w:p>
     <w:p>
       <w:pPr>
-        <w:spacing w:after="100" w:before="0" w:line="300"/>
+        <w:spacing w:after="150" w:before="0" w:line="330"/>
       </w:pPr>
       <w:r>
         <w:rPr>
@@ -23532,7 +23532,7 @@
           <w:sz w:val="22"/>
           <w:szCs w:val="22"/>
         </w:rPr>
-        <w:t xml:space="preserve">Plain headed cylinders with a narrow pilot tip at the far end. No split barb. Retention is purely geometric sandwich. The flat shank shoulder (r 2.3 mm) is wider than the stepped-bore flood hole in the back wall (r 1.5 mm), and bottoms on the rigid bore step. The head flange (r 3.9 mm) is wider than the cover-boss bore (r 2.6 mm); once the cover is snapped on, the head face seats against the cover-boss inner face and cannot lift past it. The dowel is trapped between two rigid shoulders with essentially zero axial slop. No click on installation; the dowel drops in head-up and seats when the pilot tip enters the back-wall bore. The cover snapping on completes the capture, so the axle dowels must be installed before the cover.</w:t>
+        <w:t xml:space="preserve">These are plain headed cylinders with a narrow pilot tip on the far end. There's no split barb. They stay put purely because the geometry sandwiches them. The flat shank shoulder (r 2.3 mm) is wider than the stepped-bore flood hole in the back wall (r 1.5 mm), so it bottoms out on the rigid bore step. The head flange (r 3.9 mm) is wider than the cover-boss bore (r 2.6 mm), so once the cover snaps on, the head face seats against the cover-boss inner face and can't lift past it. That traps the dowel between two rigid shoulders with essentially zero axial slop. There's no click when you install it: the dowel drops in head-up and seats once the pilot tip enters the back-wall bore. Snapping the cover on is what finishes the capture, so the axle dowels have to go in before the cover.</w:t>
       </w:r>
     </w:p>
     <w:p>
@@ -23554,7 +23554,7 @@
     </w:p>
     <w:p>
       <w:pPr>
-        <w:spacing w:after="100" w:before="0" w:line="300"/>
+        <w:spacing w:after="150" w:before="0" w:line="330"/>
       </w:pPr>
       <w:r>
         <w:rPr>
@@ -23567,7 +23567,7 @@
           <w:sz w:val="22"/>
           <w:szCs w:val="22"/>
         </w:rPr>
-        <w:t xml:space="preserve">Barbed split-tip pins. Head flange at the top (+Z, above-finger) end; the far end is a split barbed tip sawn by a printed '+' cross-slot into four springy jaws with a tapered lead-in and a locking lip. Retention is rigid counterbore capture. A confining pocket (SNAP_CB_R 3.65 mm radius, depth 1.3 mm) is cut into the exit face of each receiving eye: the crank eye for C_R and C_L, the follower eye for D_R and D_L. When the locking lip clears the bore and enters the pocket, the rigid pocket shoulder takes the axial pull-out load and the pocket wall radially confines the lip. Push the barb end straight down through the finger eye and the link eye; the tapered cone cams the four jaws inward; when the lip drops into the counterbore pocket there is a positive click. Tool-free removal: pinch the four split barb jaws inward with fingernails (compress the cross below bore diameter), and pull the pin straight out.</w:t>
+        <w:t xml:space="preserve">These are barbed split-tip pins. The head flange sits at the top (+Z, above-finger) end, and the far end is a split barbed tip. A printed '+' cross-slot saws it into four springy jaws with a tapered lead-in and a locking lip. They hold by rigid counterbore capture. Each receiving eye has a confining pocket (SNAP_CB_R 3.65 mm radius, depth 1.3 mm) cut into its exit face: the crank eye for C_R and C_L, the follower eye for D_R and D_L. Once the locking lip clears the bore and enters the pocket, the rigid pocket shoulder takes the axial pull-out load and the pocket wall confines the lip radially. To fit one, push the barb end straight down through the finger eye and the link eye; the tapered cone cams the four jaws inward, and when the lip drops into the counterbore pocket you get a positive click. Removal is tool-free: pinch the four split barb jaws inward with your fingernails (compress the cross below bore diameter) and pull the pin straight out.</w:t>
       </w:r>
     </w:p>
     <w:p>
@@ -23607,7 +23607,7 @@
           <w:sz w:val="22"/>
           <w:szCs w:val="22"/>
         </w:rPr>
-        <w:t xml:space="preserve">Confirm every part is in the correct material. Enclosure, cover, both drive arms, both followers, and input_pinion_shaft in PA12-GF (or PETG-HF if this is a test print). All four axle dowels (pin_A_R, pin_A_L, pin_B_R, pin_B_L) in PA12-GF. All four finger snap pins (pin_C_R, pin_D_R, pin_C_L, pin_D_L) in PETG-HF, in the final build, never PA12-GF. Both fingers in eSUN eTPU-95A. Never PLA, never ester-TPU, never TPU for any pin.</w:t>
+        <w:t xml:space="preserve">Check that every part is in the right material. The enclosure, cover, both drive arms, both followers, and input_pinion_shaft go in PA12-GF (or PETG-HF if this is a test print). All four axle dowels (pin_A_R, pin_A_L, pin_B_R, pin_B_L) go in PA12-GF. All four finger snap pins (pin_C_R, pin_D_R, pin_C_L, pin_D_L) go in PETG-HF for the final build, never PA12-GF. Both fingers go in eSUN eTPU-95A. Never PLA, never ester-TPU, and never TPU for any pin.</w:t>
       </w:r>
     </w:p>
     <w:p>
@@ -23630,7 +23630,7 @@
           <w:sz w:val="22"/>
           <w:szCs w:val="22"/>
         </w:rPr>
-        <w:t xml:space="preserve">Deburr every pivot bore by hand with a countersink bit: the four back-wall A and B sockets, the four C and D finger mount holes, the cover boss bores, and the two journal bores in the bottom wall. Knock the first-layer elephant-foot lip off each bore mouth so pins enter square.</w:t>
+        <w:t xml:space="preserve">Deburr every pivot bore by hand with a countersink bit: the four back-wall A and B sockets, the four C and D finger mount holes, the cover boss bores, and the two journal bores in the bottom wall. Knock the first-layer elephant-foot lip off each bore mouth so the pins go in square.</w:t>
       </w:r>
     </w:p>
     <w:p>
@@ -23653,7 +23653,7 @@
           <w:sz w:val="22"/>
           <w:szCs w:val="22"/>
         </w:rPr>
-        <w:t xml:space="preserve">Clean the gear flanks on drive_arm_R and drive_arm_L: knock down layer ridges and any seam witness on the teeth.</w:t>
+        <w:t xml:space="preserve">Clean the gear flanks on drive_arm_R and drive_arm_L: knock down the layer ridges and any seam witness on the teeth.</w:t>
       </w:r>
     </w:p>
     <w:p>
@@ -23676,7 +23676,7 @@
           <w:sz w:val="22"/>
           <w:szCs w:val="22"/>
         </w:rPr>
-        <w:t xml:space="preserve">Fit-test one finger snap pin against a scrap counterbored bore coupon. Push it through; there must be an audible click as the lip drops into the counterbore pocket, and the head must be captive. Pinch and remove. Tune the geometry on the coupon before printing all four.</w:t>
+        <w:t xml:space="preserve">Fit-test one finger snap pin against a scrap counterbored bore coupon. Push it through. You should hear a click as the lip drops into the counterbore pocket, and the head should be captive. Pinch it and remove it. Tune the geometry on the coupon before you print all four.</w:t>
       </w:r>
     </w:p>
     <w:p>
@@ -23699,7 +23699,7 @@
           <w:sz w:val="22"/>
           <w:szCs w:val="22"/>
         </w:rPr>
-        <w:t xml:space="preserve">Dry-snap the front cover once onto the bare enclosure to confirm all 4 cantilever clips click into their side-wall windows. Flex the 4 hooks outward and lift the cover off. This confirms clip geometry before the mechanism is trapped inside.</w:t>
+        <w:t xml:space="preserve">Dry-snap the front cover once onto the bare enclosure to confirm all 4 cantilever clips click into their side-wall windows. Flex the 4 hooks outward and lift the cover off. This checks the clip geometry before the mechanism gets trapped inside.</w:t>
       </w:r>
     </w:p>
     <w:p>
@@ -23721,7 +23721,7 @@
     </w:p>
     <w:p>
       <w:pPr>
-        <w:spacing w:after="100" w:before="0" w:line="300"/>
+        <w:spacing w:after="150" w:before="0" w:line="330"/>
       </w:pPr>
       <w:r>
         <w:rPr>
@@ -23734,7 +23734,7 @@
           <w:sz w:val="22"/>
           <w:szCs w:val="22"/>
         </w:rPr>
-        <w:t xml:space="preserve">This is the one step that requires care. The two 16-tooth sector gears must interleave with a half-tooth offset so both jaws move symmetrically.</w:t>
+        <w:t xml:space="preserve">This is the one step that needs care. The two 16-tooth sector gears have to interleave with a half-tooth offset so both jaws move symmetrically.</w:t>
       </w:r>
     </w:p>
     <w:p>
@@ -23757,7 +23757,7 @@
           <w:sz w:val="22"/>
           <w:szCs w:val="22"/>
         </w:rPr>
-        <w:t xml:space="preserve">Hold the pair at the closed pose: drive_arm_L crank points up and slightly inboard (about 102° from +X); drive_arm_R is its mirror.</w:t>
+        <w:t xml:space="preserve">Hold the pair at the closed pose: drive_arm_L crank points up and slightly inboard (about 102° from +X), and drive_arm_R is its mirror.</w:t>
       </w:r>
     </w:p>
     <w:p>
@@ -23780,7 +23780,7 @@
           <w:sz w:val="22"/>
           <w:szCs w:val="22"/>
         </w:rPr>
-        <w:t xml:space="preserve">Bring the sectors together so their pitch circles touch on the centreline. Before teeth engage, rotate one arm by half a tooth: 360° ÷ 16 ÷ 2 = 11.25°. A tooth of one gear then drops into the valley of the other (teeth interleave, not tip-to-tip).</w:t>
+        <w:t xml:space="preserve">Bring the sectors together so their pitch circles touch on the centreline. Before the teeth engage, rotate one arm by half a tooth: 360° ÷ 16 ÷ 2 = 11.25°. A tooth of one gear then drops into the valley of the other, so the teeth interleave rather than meet tip-to-tip.</w:t>
       </w:r>
     </w:p>
     <w:p>
@@ -23803,7 +23803,7 @@
           <w:sz w:val="22"/>
           <w:szCs w:val="22"/>
         </w:rPr>
-        <w:t xml:space="preserve">The cranks should now be a true mirror pair. Check: at the closed pose the C-pin base gap is about 9.86 mm. If the jaws come out lopsided after full assembly, the mesh is off by one tooth. Separate, re-offset 11.25°, re-engage.</w:t>
+        <w:t xml:space="preserve">The cranks should now be a true mirror pair. To check: at the closed pose the C-pin base gap is about 9.86 mm. If the jaws come out lopsided after full assembly, the mesh is off by one tooth. Separate them, re-offset 11.25°, and re-engage.</w:t>
       </w:r>
     </w:p>
     <w:p>
@@ -23843,7 +23843,7 @@
           <w:sz w:val="22"/>
           <w:szCs w:val="22"/>
         </w:rPr>
-        <w:t xml:space="preserve">Seat drive_arm_R: lower it into the cavity so its A_R axle bore rests over the back-wall A_R boss. Located, not yet Z-captured.</w:t>
+        <w:t xml:space="preserve">Seat drive_arm_R: lower it into the cavity so its A_R axle bore rests over the back-wall A_R boss. It's located now, but not yet Z-captured.</w:t>
       </w:r>
     </w:p>
     <w:p>
@@ -23866,7 +23866,7 @@
           <w:sz w:val="22"/>
           <w:szCs w:val="22"/>
         </w:rPr>
-        <w:t xml:space="preserve">Seat drive_arm_L: lower it into the cavity so its A_L axle bore rests over the back-wall A_L boss. The crown gear face on drive_arm_L must face the bottom (−Y) toward the input-pinion position. Located, not yet Z-captured.</w:t>
+        <w:t xml:space="preserve">Seat drive_arm_L: lower it into the cavity so its A_L axle bore rests over the back-wall A_L boss. The crown gear face on drive_arm_L has to face the bottom (−Y), toward the input-pinion position. It's located now, but not yet Z-captured.</w:t>
       </w:r>
     </w:p>
     <w:p>
@@ -23889,7 +23889,7 @@
           <w:sz w:val="22"/>
           <w:szCs w:val="22"/>
         </w:rPr>
-        <w:t xml:space="preserve">Add follower_R: seat one eye over the B_R back-wall boss, the other eye aligned with the D_R end of the right crank.</w:t>
+        <w:t xml:space="preserve">Add follower_R: seat one eye over the B_R back-wall boss, with the other eye aligned with the D_R end of the right crank.</w:t>
       </w:r>
     </w:p>
     <w:p>
@@ -23912,7 +23912,7 @@
           <w:sz w:val="22"/>
           <w:szCs w:val="22"/>
         </w:rPr>
-        <w:t xml:space="preserve">Add follower_L: same on the left. One eye on B_L boss, one on D_L.</w:t>
+        <w:t xml:space="preserve">Add follower_L the same way on the left. One eye on the B_L boss, one on D_L.</w:t>
       </w:r>
     </w:p>
     <w:p>
@@ -23935,7 +23935,7 @@
           <w:sz w:val="22"/>
           <w:szCs w:val="22"/>
         </w:rPr>
-        <w:t xml:space="preserve">Recheck that the gear mesh is still correctly interleaved and both arms swing freely by hand.</w:t>
+        <w:t xml:space="preserve">Double-check that the gear mesh is still interleaved correctly and that both arms swing freely by hand.</w:t>
       </w:r>
     </w:p>
     <w:p>
@@ -23958,7 +23958,7 @@
           <w:sz w:val="22"/>
           <w:szCs w:val="22"/>
         </w:rPr>
-        <w:t xml:space="preserve">Drop input_pinion_shaft into the bottom-wall journal bores: lower the shaft down through the upper journal boss bore (2 mm bearing) and into the lower journal bore (7 mm bearing). The pinion end enters the cavity first and meshes the crown gear on drive_arm_L at the −Y azimuth. The integral collar (OD 5.8 mm) seats in the housing pocket between the two bore mouths, with about 0.25 mm axial play each side. The D-profile coupler end exits below the mounting flange. Rotate the shaft slightly by hand and both drive arms should move, confirming the crown/pinion stage is engaged.</w:t>
+        <w:t xml:space="preserve">Drop input_pinion_shaft into the bottom-wall journal bores: lower the shaft down through the upper journal boss bore (2 mm bearing) and into the lower journal bore (7 mm bearing). The pinion end enters the cavity first and meshes the crown gear on drive_arm_L at the −Y azimuth. The integral collar (OD 5.8 mm) seats in the housing pocket between the two bore mouths, with about 0.25 mm of axial play on each side. The D-profile coupler end exits below the mounting flange. Turn the shaft a little by hand and both drive arms should move, which confirms the crown/pinion stage is engaged.</w:t>
       </w:r>
     </w:p>
     <w:p>
@@ -23999,21 +23999,21 @@
           <w:sz w:val="22"/>
           <w:szCs w:val="22"/>
         </w:rPr>
-        <w:t xml:space="preserve">Critical order.</w:t>
-      </w:r>
-      <w:r>
-        <w:rPr>
-          <w:rFonts w:ascii="Arial" w:cs="Arial" w:eastAsia="Arial" w:hAnsi="Arial"/>
-          <w:color w:val="1A1A1A"/>
-          <w:sz w:val="22"/>
-          <w:szCs w:val="22"/>
-        </w:rPr>
-        <w:t xml:space="preserve">   The axle dowels must go in now, before the cover is snapped on. The cover-boss face is their +Z stop. Without the cover they are uncaptured and can lift out.</w:t>
-      </w:r>
-    </w:p>
-    <w:p>
-      <w:pPr>
-        <w:spacing w:after="100" w:before="0" w:line="300"/>
+        <w:t xml:space="preserve">Critical order. </w:t>
+      </w:r>
+      <w:r>
+        <w:rPr>
+          <w:rFonts w:ascii="Arial" w:cs="Arial" w:eastAsia="Arial" w:hAnsi="Arial"/>
+          <w:color w:val="1A1A1A"/>
+          <w:sz w:val="22"/>
+          <w:szCs w:val="22"/>
+        </w:rPr>
+        <w:t xml:space="preserve">The axle dowels have to go in now, before the cover snaps on. The cover-boss face is their +Z stop. Without the cover they're uncaptured and can lift out.</w:t>
+      </w:r>
+    </w:p>
+    <w:p>
+      <w:pPr>
+        <w:spacing w:after="150" w:before="0" w:line="330"/>
       </w:pPr>
       <w:r>
         <w:rPr>
@@ -24026,7 +24026,7 @@
           <w:sz w:val="22"/>
           <w:szCs w:val="22"/>
         </w:rPr>
-        <w:t xml:space="preserve">For each of A_R, A_L, B_R, B_L: orient the dowel head-up (head flange toward the open front/cover side). Drop it tip-first down through the front-open cavity, through the arm or follower bore, and into the back-wall socket. The pilot tip self-centres in the narrow flood hole; the flat shank shoulder seats on the rigid bore step. The head flange sits near the cavity top, waiting for the cover boss. The arm or follower must still pivot freely on its dowel.</w:t>
+        <w:t xml:space="preserve">For each of A_R, A_L, B_R, B_L: orient the dowel head-up, with the head flange toward the open front/cover side. Drop it tip-first down through the front-open cavity, through the arm or follower bore, and into the back-wall socket. The pilot tip self-centres in the narrow flood hole, and the flat shank shoulder seats on the rigid bore step. The head flange sits near the cavity top, waiting for the cover boss. The arm or follower should still pivot freely on its dowel.</w:t>
       </w:r>
     </w:p>
     <w:p>
@@ -24048,7 +24048,7 @@
     </w:p>
     <w:p>
       <w:pPr>
-        <w:spacing w:after="100" w:before="0" w:line="300"/>
+        <w:spacing w:after="150" w:before="0" w:line="330"/>
       </w:pPr>
       <w:r>
         <w:rPr>
@@ -24061,7 +24061,7 @@
           <w:sz w:val="22"/>
           <w:szCs w:val="22"/>
         </w:rPr>
-        <w:t xml:space="preserve">Align front_cover over the open front with the 4 hook clips facing the four side-wall windows (2 per long side). Push it straight on until all 4 cantilever clips click into their windows. The cover's inner-face bosses now cap all 4 axle-dowel heads; each dowel is sandwiched between the back-wall bore step and the cover boss and cannot fall out in either direction. No tools, no fasteners. Verify by tugging each axle-dowel head: it should have essentially no axial slop and refuse to pull out.</w:t>
+        <w:t xml:space="preserve">Line up front_cover over the open front with the 4 hook clips facing the four side-wall windows (2 per long side). Push it straight on until all 4 cantilever clips click into their windows. The cover's inner-face bosses now cap all 4 axle-dowel heads, so each dowel is sandwiched between the back-wall bore step and the cover boss and can't fall out either way. No tools, no fasteners. Verify by tugging each axle-dowel head: it should have essentially no axial slop and refuse to pull out.</w:t>
       </w:r>
     </w:p>
     <w:p>
@@ -24083,7 +24083,7 @@
     </w:p>
     <w:p>
       <w:pPr>
-        <w:spacing w:after="100" w:before="0" w:line="300"/>
+        <w:spacing w:after="150" w:before="0" w:line="330"/>
       </w:pPr>
       <w:r>
         <w:rPr>
@@ -24096,7 +24096,7 @@
           <w:sz w:val="22"/>
           <w:szCs w:val="22"/>
         </w:rPr>
-        <w:t xml:space="preserve">Place finger_R so its bracket eyes align with C_R (crank eye) and D_R (follower eye). Place finger_L on C_L and D_L. The fingers are a chiral pair; the ridged contact face must face inboard, toward the centreline. For each of C_R, D_R, C_L, D_L: push a finger snap pin (PETG-HF) straight down from above the finger, head flange on top. The barb traverses the finger eye and the link eye beneath it; the locking lip drops into the counterbore pocket cut into the exit face of that eye with a click. The head caps flush on top of the finger; the lip is now held by a rigid annular shoulder. Tug each pin head; it must hold.</w:t>
+        <w:t xml:space="preserve">Place finger_R so its bracket eyes line up with C_R (crank eye) and D_R (follower eye). Place finger_L on C_L and D_L. The fingers are a chiral pair, so the ridged contact face has to face inboard, toward the centreline. For each of C_R, D_R, C_L, D_L: push a finger snap pin (PETG-HF) straight down from above the finger, head flange on top. The barb travels through the finger eye and the link eye beneath it, and the locking lip drops into the counterbore pocket cut into the exit face of that eye with a click. The head caps flush on top of the finger, and the lip is now held by a rigid annular shoulder. Tug each pin head; it has to hold.</w:t>
       </w:r>
     </w:p>
     <w:p>
@@ -24118,7 +24118,7 @@
     </w:p>
     <w:p>
       <w:pPr>
-        <w:spacing w:after="100" w:before="0" w:line="300"/>
+        <w:spacing w:after="150" w:before="0" w:line="330"/>
       </w:pPr>
       <w:r>
         <w:rPr>
@@ -24131,7 +24131,7 @@
           <w:sz w:val="22"/>
           <w:szCs w:val="22"/>
         </w:rPr>
-        <w:t xml:space="preserve">Rotate the bottom D-coupler by hand. Both fingers should open and close symmetrically with smooth mesh, no binding, no lopsided travel. At full open the tip gap is about 123.8 mm; at closed it is about 9.86 mm. The fingers splay outward by about 18° to 20° as they open, giving a funnel-mouth catch. If the motion binds, separate and recheck the gear mesh (Step 2).</w:t>
+        <w:t xml:space="preserve">Turn the bottom D-coupler by hand. Both fingers should open and close symmetrically with a smooth mesh, no binding and no lopsided travel. At full open the tip gap is about 123.8 mm; at closed it's about 9.86 mm. The fingers splay outward by about 18° to 20° as they open, which gives a funnel-mouth catch. If the motion binds, separate it and recheck the gear mesh (Step 2).</w:t>
       </w:r>
     </w:p>
     <w:p>
@@ -24520,7 +24520,7 @@
     </w:p>
     <w:p>
       <w:pPr>
-        <w:spacing w:after="100" w:before="0" w:line="300"/>
+        <w:spacing w:after="150" w:before="0" w:line="330"/>
       </w:pPr>
       <w:r>
         <w:rPr>
@@ -24533,7 +24533,7 @@
           <w:sz w:val="22"/>
           <w:szCs w:val="22"/>
         </w:rPr>
-        <w:t xml:space="preserve">Every capture is geometric (held by a positive mechanical step in rigid material), not by elastic preload. That matters underwater because polymers creep under sustained load and water plasticises both PETG and nylon. A barb that relies on a sprung tip staying expanded eventually relaxes and releases; a barb that drops into a rigid counterbore pocket has nowhere to go. PA12-GF's low creep further reduces the chance of any pivot bore widening under sustained pivot load over months of immersion.</w:t>
+        <w:t xml:space="preserve">Every capture here is geometric, held by a positive mechanical step in rigid material rather than by elastic preload. That matters underwater, because polymers creep under sustained load and water plasticises both PETG and nylon. A barb that depends on a sprung tip staying expanded will eventually relax and let go, but a barb that drops into a rigid counterbore pocket has nowhere to go. PA12-GF's low creep also cuts the chance of any pivot bore widening under sustained pivot load over months of immersion.</w:t>
       </w:r>
     </w:p>
     <w:p>
@@ -24566,7 +24566,7 @@
     </w:p>
     <w:p>
       <w:pPr>
-        <w:spacing w:after="100" w:before="0" w:line="300"/>
+        <w:spacing w:after="150" w:before="0" w:line="330"/>
       </w:pPr>
       <w:r>
         <w:rPr>
@@ -24579,7 +24579,7 @@
           <w:sz w:val="22"/>
           <w:szCs w:val="22"/>
         </w:rPr>
-        <w:t xml:space="preserve">SoftSense is not a single-platform tool. The same gripper bolts onto whatever the operator already has, through a small library of parametric printed adapters that all share a common gripper-side mate.</w:t>
+        <w:t xml:space="preserve">SoftSense isn't tied to one platform. The same gripper bolts onto whatever the operator already runs, using a small set of parametric printed adapters that all share the same gripper-side mate.</w:t>
       </w:r>
     </w:p>
     <w:p>
@@ -24601,7 +24601,7 @@
     </w:p>
     <w:p>
       <w:pPr>
-        <w:spacing w:after="100" w:before="0" w:line="300"/>
+        <w:spacing w:after="150" w:before="0" w:line="330"/>
       </w:pPr>
       <w:r>
         <w:rPr>
@@ -24614,7 +24614,7 @@
           <w:sz w:val="22"/>
           <w:szCs w:val="22"/>
         </w:rPr>
-        <w:t xml:space="preserve">The bottom mounting flange has 4× M4 clearance holes (Ø4.5) at (X, Z) coordinates (−38, 2), (38, 2), (−38, 18), (38, 18) on the Y = −25 face. That is a rectangular 76 × 16 mm pattern with centroid at (X = 0, Z = 10). The drive shaft exits the same face at (X = −12, Z = 10.52), 12 mm offset in X from the bolt centroid. Adapters must clear that bore (Ø ≥ 14 H7 to seat the lip seal). This is the single source of truth in motor/cad/adapters/_base.py.</w:t>
+        <w:t xml:space="preserve">The bottom mounting flange carries 4× M4 clearance holes (Ø4.5) at (X, Z) coordinates (−38, 2), (38, 2), (−38, 18), (38, 18) on the Y = −25 face. That's a rectangular 76 × 16 mm pattern with its centroid at (X = 0, Z = 10). The drive shaft comes out of the same face at (X = −12, Z = 10.52), 12 mm offset in X from the bolt centroid. Adapters have to clear that bore (Ø ≥ 14 H7 to seat the lip seal). It's the single source of truth in motor/cad/adapters/_base.py.</w:t>
       </w:r>
     </w:p>
     <w:p>
@@ -24820,7 +24820,7 @@
           <w:sz w:val="18"/>
           <w:szCs w:val="18"/>
         </w:rPr>
-        <w:t xml:space="preserve">Figure 11.3   ISO 9409-1 Type 50-4-M6 cobot flange adapter. Drop-in for any standard cobot end effector mount.</w:t>
+        <w:t xml:space="preserve">Figure 11.3   ISO 9409-1 Type 50-4-M6 cobot flange adapter. It drops straight into any standard cobot end effector mount.</w:t>
       </w:r>
     </w:p>
     <w:tbl>
@@ -25710,7 +25710,7 @@
           <w:sz w:val="22"/>
           <w:szCs w:val="22"/>
         </w:rPr>
-        <w:t xml:space="preserve">even for the IP68 XW540 (IP68 is rated for 1 m freshwater only; 30 m is 3.1 bar plus seawater corrosion). The flooded gripper itself has no shaft seal and no dry cavity; the sealing burden is entirely the actuator's.</w:t>
+        <w:t xml:space="preserve">even for the IP68 XW540 (IP68 is rated for 1 m freshwater only; 30 m is 3.1 bar plus seawater corrosion). The flooded gripper itself has no shaft seal and no dry cavity, so the sealing job falls entirely on the actuator.</w:t>
       </w:r>
     </w:p>
     <w:p>
@@ -25746,7 +25746,7 @@
           <w:sz w:val="22"/>
           <w:szCs w:val="22"/>
         </w:rPr>
-        <w:t xml:space="preserve">Without it, a strong servo's stall torque shears the printed teeth. The current limit is the grip-force command and the gear-protection ceiling at the same time.</w:t>
+        <w:t xml:space="preserve">Without it, a strong servo's stall torque shears the printed teeth. The current limit is both the grip-force command and the gear-protection ceiling at once.</w:t>
       </w:r>
     </w:p>
     <w:p>
@@ -25779,7 +25779,7 @@
     </w:p>
     <w:p>
       <w:pPr>
-        <w:spacing w:after="100" w:before="0" w:line="300"/>
+        <w:spacing w:after="150" w:before="0" w:line="330"/>
       </w:pPr>
       <w:r>
         <w:rPr>
@@ -27763,7 +27763,7 @@
     </w:p>
     <w:p>
       <w:pPr>
-        <w:spacing w:after="100" w:before="0" w:line="300"/>
+        <w:spacing w:after="150" w:before="0" w:line="330"/>
       </w:pPr>
       <w:r>
         <w:rPr>
@@ -27781,7 +27781,7 @@
     </w:p>
     <w:p>
       <w:pPr>
-        <w:spacing w:after="60" w:before="0" w:line="300"/>
+        <w:spacing w:after="60" w:before="0" w:line="330"/>
       </w:pPr>
       <w:r>
         <w:rPr>
@@ -27795,7 +27795,7 @@
     </w:p>
     <w:p>
       <w:pPr>
-        <w:spacing w:after="60" w:before="0" w:line="300"/>
+        <w:spacing w:after="60" w:before="0" w:line="330"/>
       </w:pPr>
       <w:r>
         <w:rPr>
@@ -27809,7 +27809,7 @@
     </w:p>
     <w:p>
       <w:pPr>
-        <w:spacing w:after="60" w:before="0" w:line="300"/>
+        <w:spacing w:after="60" w:before="0" w:line="330"/>
       </w:pPr>
       <w:r>
         <w:rPr>
@@ -27823,7 +27823,7 @@
     </w:p>
     <w:p>
       <w:pPr>
-        <w:spacing w:after="60" w:before="0" w:line="300"/>
+        <w:spacing w:after="60" w:before="0" w:line="330"/>
       </w:pPr>
       <w:r>
         <w:rPr>
@@ -27837,7 +27837,7 @@
     </w:p>
     <w:p>
       <w:pPr>
-        <w:spacing w:after="60" w:before="0" w:line="300"/>
+        <w:spacing w:after="60" w:before="0" w:line="330"/>
       </w:pPr>
       <w:r>
         <w:rPr>
@@ -27851,7 +27851,7 @@
     </w:p>
     <w:p>
       <w:pPr>
-        <w:spacing w:after="200" w:before="0" w:line="300"/>
+        <w:spacing w:after="200" w:before="0" w:line="330"/>
       </w:pPr>
       <w:r>
         <w:rPr>
@@ -27893,7 +27893,7 @@
     </w:p>
     <w:p>
       <w:pPr>
-        <w:spacing w:after="100" w:before="0" w:line="300"/>
+        <w:spacing w:after="150" w:before="0" w:line="330"/>
       </w:pPr>
       <w:r>
         <w:rPr>
@@ -27906,7 +27906,7 @@
           <w:sz w:val="22"/>
           <w:szCs w:val="22"/>
         </w:rPr>
-        <w:t xml:space="preserve">At Woodside's request we name where SoftSense currently sits on the NASA Technology Readiness Level scale and what would advance it. We also state the operating boundaries explicitly so a customer knows what we are and are not promising.</w:t>
+        <w:t xml:space="preserve">At Woodside's request we say where SoftSense sits today on the NASA Technology Readiness Level scale and what would move it forward. We also spell out the operating boundaries so a customer knows what we are and aren't promising.</w:t>
       </w:r>
     </w:p>
     <w:p>
@@ -28664,7 +28664,7 @@
     </w:p>
     <w:p>
       <w:pPr>
-        <w:spacing w:after="100" w:before="0" w:line="300"/>
+        <w:spacing w:after="150" w:before="0" w:line="330"/>
       </w:pPr>
       <w:r>
         <w:rPr>
@@ -28677,7 +28677,7 @@
           <w:sz w:val="22"/>
           <w:szCs w:val="22"/>
         </w:rPr>
-        <w:t xml:space="preserve">Current placement: TRL 3 to 4. The valley of death (TRL 3 to 7) that Woodside warned us about is the gap we are crossing now. The bench plan in §13 is the explicit crossing strategy.</w:t>
+        <w:t xml:space="preserve">Where we sit now: TRL 3 to 4. The valley of death (TRL 3 to 7) that Woodside warned us about is the gap we're crossing right now. The bench plan in §13 is how we cross it.</w:t>
       </w:r>
     </w:p>
     <w:p>
@@ -29366,7 +29366,7 @@
     </w:p>
     <w:p>
       <w:pPr>
-        <w:spacing w:after="100" w:before="0" w:line="300"/>
+        <w:spacing w:after="150" w:before="0" w:line="330"/>
       </w:pPr>
       <w:r>
         <w:rPr>
@@ -29379,7 +29379,7 @@
           <w:sz w:val="22"/>
           <w:szCs w:val="22"/>
         </w:rPr>
-        <w:t xml:space="preserve">We tested the scaled prototype against four artefact-analog objects chosen for shape diversity: a bone, an anchor, a vase, and a treasure chest. The bone and the anchor are both long; the anchor has natural grip features (holes), the bone has none. The chest and the vase are both stout; the chest has rectangular grooves for easy grip, the vase is smooth and only has the head to grip.</w:t>
+        <w:t xml:space="preserve">We tested the scaled prototype against four artefact-analog objects we picked for their range of shapes: a bone, an anchor, a vase, and a treasure chest. The bone and the anchor are both long. The anchor has natural grip features (holes), while the bone has none. The chest and the vase are both stout. The chest has rectangular grooves that are easy to grip, and the vase is smooth with only the head to grab onto.</w:t>
       </w:r>
     </w:p>
     <w:p>
@@ -30119,7 +30119,7 @@
     </w:p>
     <w:p>
       <w:pPr>
-        <w:spacing w:after="100" w:before="0" w:line="300"/>
+        <w:spacing w:after="150" w:before="0" w:line="330"/>
       </w:pPr>
       <w:r>
         <w:rPr>
@@ -30132,12 +30132,12 @@
           <w:sz w:val="22"/>
           <w:szCs w:val="22"/>
         </w:rPr>
-        <w:t xml:space="preserve">The 4-finger configuration outperforms 2-finger on smooth or round geometry (vase) and on poor-grip-feature geometry (bone), and ties on regular-feature geometry (anchor, chest). That is the case for soft pads with sensors: when the artefact has natural features for a rigid jaw to bite, you cannot do much better than 3 attempts. When the artefact is smooth or featureless, the 4-pad layout wraps it and the 2-jaw layout slips off it. The bone is the cleanest example: 2 attempts versus 4.</w:t>
-      </w:r>
-    </w:p>
-    <w:p>
-      <w:pPr>
-        <w:spacing w:after="100" w:before="0" w:line="300"/>
+        <w:t xml:space="preserve">The 4-finger configuration beats 2-finger on smooth or round shapes (vase) and on shapes with poor grip features (bone), and it ties on regular-feature shapes (anchor, chest). That's how it goes for soft pads with sensors: when the artefact has natural features for a rigid jaw to bite, you can't really do better than 3 attempts. When the artefact is smooth or featureless, the 4-pad layout wraps it and the 2-jaw layout slips off it. The bone is the clearest example: 2 attempts versus 4.</w:t>
+      </w:r>
+    </w:p>
+    <w:p>
+      <w:pPr>
+        <w:spacing w:after="150" w:before="0" w:line="330"/>
       </w:pPr>
       <w:r>
         <w:rPr>
@@ -30150,7 +30150,7 @@
           <w:sz w:val="22"/>
           <w:szCs w:val="22"/>
         </w:rPr>
-        <w:t xml:space="preserve">The pressure values span an order of magnitude, from 26 gf (bone) to 411 gf (vase). That is direct empirical support for the per-artefact preset architecture in innovation 2: a single global pressure threshold would either crush the bone (if set high enough to lift the vase) or fail to lift the vase (if set low enough to spare the bone). Different shapes need different presets, and the per-pad sensor system can deliver them.</w:t>
+        <w:t xml:space="preserve">The pressure values span an order of magnitude, from 26 gf (bone) to 411 gf (vase). That's direct empirical support for the per-artefact preset architecture in innovation 2: a single global pressure threshold would either crush the bone (if set high enough to lift the vase) or fail to lift the vase (if set low enough to spare the bone). Different shapes need different presets, and the per-pad sensor system can deliver them.</w:t>
       </w:r>
     </w:p>
     <w:p>
@@ -30183,7 +30183,7 @@
     </w:p>
     <w:p>
       <w:pPr>
-        <w:spacing w:after="100" w:before="0" w:line="300"/>
+        <w:spacing w:after="150" w:before="0" w:line="330"/>
       </w:pPr>
       <w:r>
         <w:rPr>
@@ -30971,7 +30971,7 @@
     </w:p>
     <w:p>
       <w:pPr>
-        <w:spacing w:after="100" w:before="0" w:line="300"/>
+        <w:spacing w:after="150" w:before="0" w:line="330"/>
       </w:pPr>
       <w:r>
         <w:rPr>
@@ -31006,7 +31006,7 @@
     </w:p>
     <w:p>
       <w:pPr>
-        <w:spacing w:after="100" w:before="0" w:line="300"/>
+        <w:spacing w:after="150" w:before="0" w:line="330"/>
       </w:pPr>
       <w:r>
         <w:rPr>
@@ -31041,7 +31041,7 @@
     </w:p>
     <w:p>
       <w:pPr>
-        <w:spacing w:after="100" w:before="0" w:line="300"/>
+        <w:spacing w:after="150" w:before="0" w:line="330"/>
       </w:pPr>
       <w:r>
         <w:rPr>
@@ -31054,7 +31054,7 @@
           <w:sz w:val="22"/>
           <w:szCs w:val="22"/>
         </w:rPr>
-        <w:t xml:space="preserve">Open channels in flight or scheduled: Australian National Maritime Museum, International Marine Contractors Association (IMCA), Schilling Robotics / TechnipFMC (Titan 4 manufacturer), UWA Engineering (Mechanical, Mechatronics, Oceans Graduate School), Curtin Underwater Sensing and Robotics Lab, CSIRO Oceans and Atmosphere, Australian Institute of Marine Science (AIMS), NOAA Ocean Exploration, OpenROV / Sofar Ocean, Monterey Bay Aquarium Research Institute (MBARI). Each was selected for a specific gap in our knowledge base: industrial gripper failure modes, marine-conservation sample handling, deep-sea exploration practice, or low-cost ROV community engineering.</w:t>
+        <w:t xml:space="preserve">Channels we have open, either in flight or scheduled: Australian National Maritime Museum, International Marine Contractors Association (IMCA), Schilling Robotics / TechnipFMC (Titan 4 manufacturer), UWA Engineering (Mechanical, Mechatronics, Oceans Graduate School), Curtin Underwater Sensing and Robotics Lab, CSIRO Oceans and Atmosphere, Australian Institute of Marine Science (AIMS), NOAA Ocean Exploration, OpenROV / Sofar Ocean, Monterey Bay Aquarium Research Institute (MBARI). We picked each one for a specific gap in our knowledge base: industrial gripper failure modes, marine-conservation sample handling, deep-sea exploration practice, or low-cost ROV community engineering.</w:t>
       </w:r>
     </w:p>
     <w:p>
@@ -31087,7 +31087,7 @@
     </w:p>
     <w:p>
       <w:pPr>
-        <w:spacing w:after="100" w:before="0" w:line="300"/>
+        <w:spacing w:after="150" w:before="0" w:line="330"/>
       </w:pPr>
       <w:r>
         <w:rPr>
@@ -31100,7 +31100,7 @@
           <w:sz w:val="22"/>
           <w:szCs w:val="22"/>
         </w:rPr>
-        <w:t xml:space="preserve">The gripper this document describes is deliberately small. At full open the fingertips part by about 124 millimetres, and the drivetrain delivers well under a newton per finger. That is the right size for the FLL bench and the scaled test objects, but it is too small and too gentle to recover a real amphora, anchor fluke, or ballast stone off the seafloor. Every archaeologist we showed it to asked the same question: can you make it bigger? The answer is yes, and the way we built it means bigger is one parameter, not a redesign.</w:t>
+        <w:t xml:space="preserve">The gripper this document describes is small on purpose. At full open the fingertips part by about 124 millimetres, and the drivetrain delivers well under a newton per finger. That's the right size for the FLL bench and the scaled test objects, but it's too small and too gentle to recover a real amphora, anchor fluke, or ballast stone off the seafloor. Every archaeologist we showed it to asked the same question: can you make it bigger? The answer is yes, and the way we built it means bigger is one parameter, not a redesign.</w:t>
       </w:r>
     </w:p>
     <w:p>
@@ -31122,7 +31122,7 @@
     </w:p>
     <w:p>
       <w:pPr>
-        <w:spacing w:after="100" w:before="0" w:line="300"/>
+        <w:spacing w:after="150" w:before="0" w:line="330"/>
       </w:pPr>
       <w:r>
         <w:rPr>
@@ -31135,12 +31135,12 @@
           <w:sz w:val="22"/>
           <w:szCs w:val="22"/>
         </w:rPr>
-        <w:t xml:space="preserve">A single environment variable, GRIPPER_SCALE, multiplies every linear dimension of the model by a factor k. We built and re-simulated two larger sizes from it, 1.5× and 2.0×. The word that matters is self-similar: the linkage, the gears, the finger walls, the enclosure, the input shaft, the mounting flange, and the snap clips all scale together. Because the lengths, the radii, and the wall thicknesses grow by the same factor, every ratio and every angle is preserved — this is true mechanical similitude. We verified it: the finger rotation is identical at −20° at all three sizes, and the jaw opening scales exactly with k.</w:t>
-      </w:r>
-    </w:p>
-    <w:p>
-      <w:pPr>
-        <w:spacing w:after="100" w:before="0" w:line="300"/>
+        <w:t xml:space="preserve">A single environment variable, GRIPPER_SCALE, multiplies every linear dimension of the model by a factor k. We built and re-simulated two larger sizes from it, 1.5× and 2.0×. The word that matters is self-similar: the linkage, the gears, the finger walls, the enclosure, the input shaft, the mounting flange, and the snap clips all scale together. Because the lengths, the radii, and the wall thicknesses grow by the same factor, every ratio and every angle is preserved. This is true mechanical similitude. We checked it: the finger rotation is identical at −20° at all three sizes, and the jaw opening scales exactly with k.</w:t>
+      </w:r>
+    </w:p>
+    <w:p>
+      <w:pPr>
+        <w:spacing w:after="150" w:before="0" w:line="330"/>
       </w:pPr>
       <w:r>
         <w:rPr>
@@ -31153,7 +31153,7 @@
           <w:sz w:val="22"/>
           <w:szCs w:val="22"/>
         </w:rPr>
-        <w:t xml:space="preserve">A few things are deliberately held constant, because they are set by physics or by the printer rather than by the size of the part. The print and running clearances stay at about 0.3 millimetres, because they are governed by the 0.4 mm nozzle, not the part. The fastener sizes stay put — an M4 bolt is an M4 at any scale; only the positions of the bolt holes move. The flood and drain hole radii are sized by bubble and surface-tension physics, so they hold while their positions scale. And at a scale factor of 1.0 the scaled model reproduces the shipped gripper byte for byte, so the original design is preserved as the reference.</w:t>
+        <w:t xml:space="preserve">A few things are held constant on purpose, because they're set by physics or by the printer rather than by the size of the part. The print and running clearances stay at about 0.3 millimetres, because they're governed by the 0.4 mm nozzle, not the part. The fastener sizes stay put. An M4 bolt is an M4 at any scale, and only the positions of the bolt holes move. The flood and drain hole radii are sized by bubble and surface-tension physics, so they hold while their positions scale. And at a scale factor of 1.0 the scaled model reproduces the shipped gripper byte for byte, so the original design is preserved as the reference.</w:t>
       </w:r>
     </w:p>
     <w:p>
@@ -31175,7 +31175,7 @@
     </w:p>
     <w:p>
       <w:pPr>
-        <w:spacing w:after="100" w:before="0" w:line="300"/>
+        <w:spacing w:after="150" w:before="0" w:line="330"/>
       </w:pPr>
       <w:r>
         <w:rPr>
@@ -31188,7 +31188,7 @@
           <w:sz w:val="22"/>
           <w:szCs w:val="22"/>
         </w:rPr>
-        <w:t xml:space="preserve">Here is what the two larger sizes actually measure, read straight from the scaled CAD. All parts still fit the 256 mm bed of the Bambu P1S at both sizes.</w:t>
+        <w:t xml:space="preserve">Here's what the two larger sizes actually measure, read straight from the scaled CAD. All parts still fit the 256 mm bed of the Bambu P1S at both sizes.</w:t>
       </w:r>
     </w:p>
     <w:tbl>
@@ -32171,7 +32171,7 @@
     </w:p>
     <w:p>
       <w:pPr>
-        <w:spacing w:after="100" w:before="0" w:line="300"/>
+        <w:spacing w:after="150" w:before="0" w:line="330"/>
       </w:pPr>
       <w:r>
         <w:rPr>
@@ -32184,12 +32184,12 @@
           <w:sz w:val="22"/>
           <w:szCs w:val="22"/>
         </w:rPr>
-        <w:t xml:space="preserve">This is the part that makes the scale-up worth doing rather than just enlarging a drawing. The Fin Ray finger is a compliant blade with thin internal walls. An earlier study scaled the blade on its own and held the wall thicknesses fixed — and found that above about 1.1× the finger went floppy. The walls were now too thin relative to the bigger blade, so the finger bent instead of squeezing, and its universal grasp score collapsed from 0.65 at 1× to 0.44 at 1.5× and 0.37 at 2×. That is the failure mode this document’s earlier finger-scale figures (0.7×, 1.0×, 1.6×) were warning about.</w:t>
-      </w:r>
-    </w:p>
-    <w:p>
-      <w:pPr>
-        <w:spacing w:after="100" w:before="0" w:line="300"/>
+        <w:t xml:space="preserve">This is the part that makes the scale-up worth doing rather than just enlarging a drawing. The Fin Ray finger is a compliant blade with thin internal walls. An earlier study scaled the blade on its own and held the wall thicknesses fixed, and it found that above about 1.1× the finger went floppy. The walls were now too thin relative to the bigger blade, so the finger bent instead of squeezing, and its universal grasp score collapsed from 0.65 at 1× to 0.44 at 1.5× and 0.37 at 2×. That's the failure mode this document's earlier finger-scale figures (0.7×, 1.0×, 1.6×) were warning about.</w:t>
+      </w:r>
+    </w:p>
+    <w:p>
+      <w:pPr>
+        <w:spacing w:after="150" w:before="0" w:line="330"/>
       </w:pPr>
       <w:r>
         <w:rPr>
@@ -32202,12 +32202,12 @@
           <w:sz w:val="22"/>
           <w:szCs w:val="22"/>
         </w:rPr>
-        <w:t xml:space="preserve">Self-similar scaling fixes exactly that, because the walls scale with the blade. The wall-to-blade stiffness ratio stays constant, so the bigger finger is as stiff relative to its size as the validated 1× finger. On a matched modulus the universal grasp score now holds flat — 0.63, 0.60, 0.62 across the three sizes — and the finger reaches the 12 N stress-probe at every size. On the softer measured Bambu modulus the score edges up rather than down as the finger grows, because the larger finger develops more absolute grip at the same proportional closure. Either way, the floppy-finger failure of naïve scaling is gone.</w:t>
-      </w:r>
-    </w:p>
-    <w:p>
-      <w:pPr>
-        <w:spacing w:after="100" w:before="0" w:line="300"/>
+        <w:t xml:space="preserve">Self-similar scaling fixes exactly that, because the walls scale with the blade. The wall-to-blade stiffness ratio stays constant, so the bigger finger is as stiff relative to its size as the validated 1× finger. On a matched modulus the universal grasp score now holds flat, at 0.63, 0.60, 0.62 across the three sizes, and the finger reaches the 12 N stress-probe at every size. On the softer measured Bambu modulus the score edges up rather than down as the finger grows, because the larger finger develops more absolute grip at the same proportional closure. Either way, the floppy-finger failure of naïve scaling is gone.</w:t>
+      </w:r>
+    </w:p>
+    <w:p>
+      <w:pPr>
+        <w:spacing w:after="150" w:before="0" w:line="330"/>
       </w:pPr>
       <w:r>
         <w:rPr>
@@ -32220,7 +32220,7 @@
           <w:sz w:val="22"/>
           <w:szCs w:val="22"/>
         </w:rPr>
-        <w:t xml:space="preserve">We are precise about what this does and does not fix. It fixes the under-grip, floppy failure mode; it does not change the conformance ceiling. A passive single-piece finger still cannot curl tightly around a small round object at any scale — that is an architecture limit, not a size limit. And the von Mises safety margin dips a little as the finger grows, from about 9× at 1× to about 5× at 2× on flat objects, but it stays comfortably above yield.</w:t>
+        <w:t xml:space="preserve">We're precise about what this does and doesn't fix. It fixes the under-grip, floppy failure mode, but it doesn't change the conformance ceiling. A passive single-piece finger still can't curl tightly around a small round object at any scale. That's an architecture limit, not a size limit. And the von Mises safety margin dips a little as the finger grows, from about 9× at 1× to about 5× at 2× on flat objects, but it stays comfortably above yield.</w:t>
       </w:r>
     </w:p>
     <w:p>
@@ -32242,7 +32242,7 @@
     </w:p>
     <w:p>
       <w:pPr>
-        <w:spacing w:after="100" w:before="0" w:line="300"/>
+        <w:spacing w:after="150" w:before="0" w:line="330"/>
       </w:pPr>
       <w:r>
         <w:rPr>
@@ -32255,7 +32255,7 @@
           <w:sz w:val="22"/>
           <w:szCs w:val="22"/>
         </w:rPr>
-        <w:t xml:space="preserve">Scaling changes the structural and force numbers by clean power laws, and we confirmed them to three significant figures on the self-similar gear FEA. The gear ceiling T_safe grows with the cube of scale; the deliverable per-finger force grows with the square of scale; the mechanical advantage falls as 1/k; and the gear ratio and efficiency are scale-invariant because the tooth counts and angles are held.</w:t>
+        <w:t xml:space="preserve">Scaling changes the structural and force numbers by clean power laws, and we confirmed them to three significant figures on the self-similar gear FEA. The gear ceiling T_safe grows with the cube of scale, the deliverable per-finger force grows with the square of scale, the mechanical advantage falls as 1/k, and the gear ratio and efficiency are scale-invariant because the tooth counts and angles are held.</w:t>
       </w:r>
     </w:p>
     <w:tbl>
@@ -32953,7 +32953,7 @@
     </w:tbl>
     <w:p>
       <w:pPr>
-        <w:spacing w:after="100" w:before="0" w:line="300"/>
+        <w:spacing w:after="150" w:before="0" w:line="330"/>
       </w:pPr>
       <w:r>
         <w:rPr>
@@ -32966,7 +32966,7 @@
           <w:sz w:val="22"/>
           <w:szCs w:val="22"/>
         </w:rPr>
-        <w:t xml:space="preserve">The reading is honest but bounded. The selected servos still clear the gear ceiling by between 28× and 725× at every size, so the gripper stays gear-limited and the firmware current limit remains its protection — exactly as at 1×. Force grows about four-fold at 2×, but off a sub-newton base, so a 248 mm jaw that can reach around an amphora still only squeezes it with around a newton. If the real need is squeezing strength, scaling is only half the answer. The other half is the proposed gear re-size in §8, which raises T_safe by ten to thirty times independent of size; combined with 2× scaling it would put the per-finger force into the multi-newton range. That is the next design decision, and we have deliberately left it as a decision rather than folding it in here.</w:t>
+        <w:t xml:space="preserve">The reading is honest but bounded. The selected servos still clear the gear ceiling by between 28× and 725× at every size, so the gripper stays gear-limited and the firmware current limit remains its protection, exactly as at 1×. Force grows about four-fold at 2×, but off a sub-newton base, so a 248 mm jaw that can reach around an amphora still only squeezes it with around a newton. If the real need is squeezing strength, scaling is only half the answer. The other half is the proposed gear re-size in §8, which raises T_safe by ten to thirty times independent of size. Combined with 2× scaling it would put the per-finger force into the multi-newton range. That's the next design decision, and we've deliberately left it as a decision rather than folding it in here.</w:t>
       </w:r>
     </w:p>
     <w:p>
@@ -32988,7 +32988,7 @@
     </w:p>
     <w:p>
       <w:pPr>
-        <w:spacing w:after="100" w:before="0" w:line="300"/>
+        <w:spacing w:after="150" w:before="0" w:line="330"/>
       </w:pPr>
       <w:r>
         <w:rPr>
@@ -33001,12 +33001,12 @@
           <w:sz w:val="22"/>
           <w:szCs w:val="22"/>
         </w:rPr>
-        <w:t xml:space="preserve">The underwater crush result is scale-invariant, which is what similitude predicts. The von Mises field and the material-yield depth do not move with size — peak von Mises is about 12.6 MPa at 100 m and the through-Z material yields near 177 m at every scale; only the displacement scales with k. A flooded finger stays at essentially zero von Mises at any size and any practical depth.</w:t>
-      </w:r>
-    </w:p>
-    <w:p>
-      <w:pPr>
-        <w:spacing w:after="100" w:before="0" w:line="300"/>
+        <w:t xml:space="preserve">The underwater crush result is scale-invariant, which is what similitude predicts. The von Mises field and the material-yield depth don't move with size. Peak von Mises is about 12.6 MPa at 100 m and the through-Z material yields near 177 m at every scale, and only the displacement scales with k. A flooded finger stays at essentially zero von Mises at any size and any practical depth.</w:t>
+      </w:r>
+    </w:p>
+    <w:p>
+      <w:pPr>
+        <w:spacing w:after="150" w:before="0" w:line="330"/>
       </w:pPr>
       <w:r>
         <w:rPr>
@@ -33019,7 +33019,7 @@
           <w:sz w:val="22"/>
           <w:szCs w:val="22"/>
         </w:rPr>
-        <w:t xml:space="preserve">The wet grip is more nuanced, and our own re-analysis corrected an over-simple first assumption. The cited-physics core of the grip model — the elastomer-friction and drainage terms — is scale-invariant to within half a percent, because the crosshatch channels grow to 0.81 mm at 1.5× and 1.08 mm at 2.0×, both well above the roughly 0.3 mm where wet drainage saturates. But the full surrogate score softens by about 12 % at 1.5× and 22 % at 2.0×, because the bigger posts mean fewer skin-breaking edges per unit area at a fixed print resolution. That is a real if low-confidence effect rather than an artefact; the ranking and the printability are preserved, and a finer-relative texture could be reintroduced at 2× to recover the edge density if a future build wants it.</w:t>
+        <w:t xml:space="preserve">The wet grip is more nuanced, and our own re-analysis corrected an over-simple first assumption. The cited-physics core of the grip model, the elastomer-friction and drainage terms, is scale-invariant to within half a percent, because the crosshatch channels grow to 0.81 mm at 1.5× and 1.08 mm at 2.0×, both well above the roughly 0.3 mm where wet drainage saturates. But the full surrogate score softens by about 12 % at 1.5× and 22 % at 2.0×, because the bigger posts mean fewer skin-breaking edges per unit area at a fixed print resolution. That's a real if low-confidence effect rather than an artefact. The ranking and the printability are preserved, and a finer-relative texture could be reintroduced at 2× to recover the edge density if a future build wants it.</w:t>
       </w:r>
     </w:p>
     <w:p>
@@ -33072,7 +33072,7 @@
           <w:sz w:val="22"/>
           <w:szCs w:val="22"/>
         </w:rPr>
-        <w:t xml:space="preserve">The snap-pin and cover-clip insertion force scales with the square of scale — roughly 2.25× at 1.5× and about 4× at 2× — even though the bending strain is scale-invariant, so the clips do not over-strain, they just take more push. At 1.5× the parts are still hand-pressable; at 2× expect to need a clamp or a small arbor press to seat the snap pins and click the cover home.</w:t>
+        <w:t xml:space="preserve">The snap-pin and cover-clip insertion force scales with the square of scale, roughly 2.25× at 1.5× and about 4× at 2×, even though the bending strain is scale-invariant, so the clips don't over-strain, they just take more push. At 1.5× the parts are still hand-pressable. At 2× expect to need a clamp or a small arbor press to seat the snap pins and click the cover home.</w:t>
       </w:r>
     </w:p>
     <w:p>
@@ -33131,7 +33131,7 @@
           <w:sz w:val="22"/>
           <w:szCs w:val="22"/>
         </w:rPr>
-        <w:t xml:space="preserve">The materials and the build sequence do not change. </w:t>
+        <w:t xml:space="preserve">The materials and the build sequence don't change. </w:t>
       </w:r>
       <w:r>
         <w:rPr>
@@ -33144,7 +33144,7 @@
           <w:sz w:val="22"/>
           <w:szCs w:val="22"/>
         </w:rPr>
-        <w:t xml:space="preserve">Same PA-class rigid parts, PETG snap pins, and TPU fingers; same orientations; and the input shaft still installs from below, pinion first. A larger gripper is a bigger print, not a different assembly.</w:t>
+        <w:t xml:space="preserve">Same PA-class rigid parts, PETG snap pins, and TPU fingers, same orientations, and the input shaft still installs from below, pinion first. A larger gripper is a bigger print, not a different assembly.</w:t>
       </w:r>
     </w:p>
     <w:p>
@@ -33200,12 +33200,12 @@
           <w:sz w:val="18"/>
           <w:szCs w:val="18"/>
         </w:rPr>
-        <w:t xml:space="preserve">Figure 17.1   The shipped 1× gripper beside the 2.0× self-similar build, both in the open pose. Every linear dimension — linkage, gears, finger walls, enclosure — scales by the same factor, so the geometry, the gear timing, and the wrap behaviour are preserved while the jaw opening grows from 124 mm to 248 mm at the fingertips.</w:t>
-      </w:r>
-    </w:p>
-    <w:p>
-      <w:pPr>
-        <w:spacing w:after="100" w:before="0" w:line="300"/>
+        <w:t xml:space="preserve">Figure 17.1   The shipped 1× gripper beside the 2.0× self-similar build, both in the open pose. Every linear dimension, including linkage, gears, finger walls, and enclosure, scales by the same factor, so the geometry, the gear timing, and the wrap behaviour are preserved while the jaw opening grows from 124 mm to 248 mm at the fingertips.</w:t>
+      </w:r>
+    </w:p>
+    <w:p>
+      <w:pPr>
+        <w:spacing w:after="150" w:before="0" w:line="330"/>
       </w:pPr>
       <w:r>
         <w:rPr>
@@ -33218,7 +33218,7 @@
           <w:sz w:val="22"/>
           <w:szCs w:val="22"/>
         </w:rPr>
-        <w:t xml:space="preserve">One caveat on provenance. These re-runs were done locally at screen fidelity, because the high-resolution simulation node was unavailable for the campaign. The comparative rankings are sound — the self-similar 1× run reproduces the shipped finger’s score, which anchors the comparison — but a publication-grade re-run on the render node is the follow-up, and a fresh blade-only control at the larger sizes would make the stiff-versus-floppy contrast fully airtight. We flag it rather than bury it.</w:t>
+        <w:t xml:space="preserve">One caveat on provenance. These re-runs were done locally at screen fidelity, because the high-resolution simulation node was unavailable for the campaign. The comparative rankings are sound, since the self-similar 1× run reproduces the shipped finger's score, which anchors the comparison, but a publication-grade re-run on the render node is the follow-up, and a fresh blade-only control at the larger sizes would make the stiff-versus-floppy contrast fully airtight. We flag it rather than bury it.</w:t>
       </w:r>
     </w:p>
     <w:p>
@@ -33281,7 +33281,7 @@
           <w:sz w:val="22"/>
           <w:szCs w:val="22"/>
         </w:rPr>
-        <w:t xml:space="preserve">The four innovations are individually understood, the bench test set (bone, anchor, vase, chest) confirms the 4-finger plus pressure-sensor architecture beats 2 finger on smooth and featureless objects, and the per-artefact pressure preset is supported by the order-of-magnitude spread in grip force across the test set (26 to 411 gf).</w:t>
+        <w:t xml:space="preserve">We understand each of the four innovations on its own. The bench test set (bone, anchor, vase, chest) shows the 4-finger plus pressure-sensor setup does better than 2 finger on smooth, featureless objects, and the per-artefact pressure preset makes sense because grip force spreads across an order of magnitude over the test set (26 to 411 gf).</w:t>
       </w:r>
     </w:p>
     <w:p>
@@ -33304,7 +33304,7 @@
           <w:sz w:val="22"/>
           <w:szCs w:val="22"/>
         </w:rPr>
-        <w:t xml:space="preserve">The Fin Ray finger wraps universally and gently at the 12 N stress-probe load with peak stress around 2.7 MPa, ten times below TPU strength under both 2D and 3D FEA formulations. The implied margin at the operating force is roughly 100 to 300 times.</w:t>
+        <w:t xml:space="preserve">The Fin Ray finger wraps around things gently and works on a wide range of shapes at the 12 N stress-probe load, with peak stress near 2.7 MPa. That's ten times below TPU strength in both the 2D and 3D FEA. At the operating force the margin works out to roughly 100 to 300 times.</w:t>
       </w:r>
     </w:p>
     <w:p>
@@ -33327,7 +33327,7 @@
           <w:sz w:val="22"/>
           <w:szCs w:val="22"/>
         </w:rPr>
-        <w:t xml:space="preserve">The crosshatch grip texture is the best tileable, printable, no-speculation winner across the 7-condition wet object battery, and that choice is robust to 50 % coefficient perturbation. Tier-2 FEA confirms the contact-mechanics sub-models and the post-root durability margin (14 to 24 times).</w:t>
+        <w:t xml:space="preserve">The crosshatch grip texture is the best tileable, printable, no-speculation choice across the 7-condition wet object battery, and that result holds up under a 50 % coefficient perturbation. Tier-2 FEA backs up the contact-mechanics sub-models and the post-root durability margin (14 to 24 times).</w:t>
       </w:r>
     </w:p>
     <w:p>
@@ -33373,7 +33373,7 @@
           <w:sz w:val="22"/>
           <w:szCs w:val="22"/>
         </w:rPr>
-        <w:t xml:space="preserve">The drivetrain torque-force chain and the 122.7° travel are exact kinematics. The actuator selection ranking and its 50 % robustness across depth tiers are documented; the actuator class flips with depth (smart serial servo at T1 and T2, magnetic-coupling pod at T3).</w:t>
+        <w:t xml:space="preserve">The drivetrain torque-force chain and the 122.7° travel are exact kinematics. We've documented the actuator selection ranking and how well it holds up under 50 % perturbation across depth tiers, and the actuator class flips with depth: a smart serial servo at T1 and T2, and a magnetic-coupling pod at T3.</w:t>
       </w:r>
     </w:p>
     <w:p>
@@ -33396,7 +33396,7 @@
           <w:sz w:val="22"/>
           <w:szCs w:val="22"/>
         </w:rPr>
-        <w:t xml:space="preserve">The printed crown-pinion is the binding structural limit at T_safe ≈ 0.013 to 0.034 N·m on the shipped gears. The motor current limit is its firmware-enforced protection.</w:t>
+        <w:t xml:space="preserve">The printed crown-pinion is the structural limit that binds first, at T_safe ≈ 0.013 to 0.034 N·m on the shipped gears. The motor current limit is the firmware-enforced protection for it.</w:t>
       </w:r>
     </w:p>
     <w:p>
@@ -33419,7 +33419,7 @@
           <w:sz w:val="22"/>
           <w:szCs w:val="22"/>
         </w:rPr>
-        <w:t xml:space="preserve">The gripper is single-shell everywhere (no enclosed void), so it floods and drains in any orientation. Net buoyancy is gently negative in seawater (no ballast needed).</w:t>
+        <w:t xml:space="preserve">The gripper is single-shell everywhere, with no enclosed void, so it floods and drains whatever way you hold it. Net buoyancy is gently negative in seawater, so no ballast is needed.</w:t>
       </w:r>
     </w:p>
     <w:p>
@@ -33455,7 +33455,7 @@
           <w:sz w:val="22"/>
           <w:szCs w:val="22"/>
         </w:rPr>
-        <w:t xml:space="preserve">One parameter scales the whole gripper; the bigger finger stays stiff because the walls scale with the blade, and the gear ceiling, the tip force, and the mechanical advantage follow clean k³, k², and 1/k power laws. The gripper stays gear-limited at every size. Established in software at screen fidelity; the high-resolution re-run is the open item.</w:t>
+        <w:t xml:space="preserve">One parameter scales the whole gripper. The bigger finger stays stiff because the walls scale with the blade, and the gear ceiling, the tip force, and the mechanical advantage follow clean k³, k², and 1/k power laws. The gripper stays gear-limited at every size. We've established this in software at screen fidelity, and the high-resolution re-run is the open item.</w:t>
       </w:r>
     </w:p>
     <w:p>
@@ -33518,7 +33518,7 @@
           <w:sz w:val="22"/>
           <w:szCs w:val="22"/>
         </w:rPr>
-        <w:t xml:space="preserve">Absolute depth rating (set by the actuator canister, not the gripper itself).</w:t>
+        <w:t xml:space="preserve">Absolute depth rating, which the actuator canister sets, not the gripper itself.</w:t>
       </w:r>
     </w:p>
     <w:p>
@@ -33541,7 +33541,7 @@
           <w:sz w:val="22"/>
           <w:szCs w:val="22"/>
         </w:rPr>
-        <w:t xml:space="preserve">Long-term wet service (TPU swelling, biofilm growth in the grip channels, edge abrasion).</w:t>
+        <w:t xml:space="preserve">Long-term wet service: TPU swelling, biofilm growth in the grip channels, and edge abrasion.</w:t>
       </w:r>
     </w:p>
     <w:p>
@@ -33564,7 +33564,7 @@
           <w:sz w:val="22"/>
           <w:szCs w:val="22"/>
         </w:rPr>
-        <w:t xml:space="preserve">Whether the proposed gear re-size's clearance is buildable in the current housing envelope.</w:t>
+        <w:t xml:space="preserve">Whether the clearance on the proposed gear re-size is buildable inside the current housing envelope.</w:t>
       </w:r>
     </w:p>
     <w:p>
@@ -33587,7 +33587,7 @@
           <w:sz w:val="22"/>
           <w:szCs w:val="22"/>
         </w:rPr>
-        <w:t xml:space="preserve">Current-to-force calibration accuracy on real hardware (the calibration rig in §7.7 is built but not yet validated against a load cell).</w:t>
+        <w:t xml:space="preserve">Current-to-force calibration accuracy on real hardware. The calibration rig in §7.7 is built, but we haven't validated it against a load cell yet.</w:t>
       </w:r>
     </w:p>
     <w:p>
@@ -33610,7 +33610,7 @@
           <w:sz w:val="22"/>
           <w:szCs w:val="22"/>
         </w:rPr>
-        <w:t xml:space="preserve">The hyperbaric pressure response of the pressure sensors at 30 m simulated depth.</w:t>
+        <w:t xml:space="preserve">How the pressure sensors respond to hyperbaric pressure at 30 m simulated depth.</w:t>
       </w:r>
     </w:p>
     <w:p>
@@ -33650,7 +33650,7 @@
           <w:sz w:val="22"/>
           <w:szCs w:val="22"/>
         </w:rPr>
-        <w:t xml:space="preserve">Complete the bench plan (§13): current-to-force calibration, snap-fit coupon, T_safe coupon, soak test, hyperbaric test, fatigue test.</w:t>
+        <w:t xml:space="preserve">Finish the bench plan (§13): current-to-force calibration, snap-fit coupon, T_safe coupon, soak test, hyperbaric test, and fatigue test.</w:t>
       </w:r>
     </w:p>
     <w:p>
@@ -33673,7 +33673,7 @@
           <w:sz w:val="22"/>
           <w:szCs w:val="22"/>
         </w:rPr>
-        <w:t xml:space="preserve">Validate the proposed gear re-size in CAD (CROWN_RC 11, module 1.83, 12/6 teeth, face 8) and re-run check_drivetrain.py. If it clears, ship it. The per-finger force band rises from 0.35 to 0.73 N up to 4.2 to 8.7 N.</w:t>
+        <w:t xml:space="preserve">Validate the proposed gear re-size in CAD (CROWN_RC 11, module 1.83, 12/6 teeth, face 8) and re-run check_drivetrain.py. If it clears, we ship it. The per-finger force band rises from 0.35 to 0.73 N up to 4.2 to 8.7 N.</w:t>
       </w:r>
     </w:p>
     <w:p>
@@ -33696,7 +33696,7 @@
           <w:sz w:val="22"/>
           <w:szCs w:val="22"/>
         </w:rPr>
-        <w:t xml:space="preserve">Pool dive on a BlueROV2 chassis with the BR2 bottom-Newton adapter. Recover an instrumented test artefact from a 5 m sand-bottom site.</w:t>
+        <w:t xml:space="preserve">Do a pool dive on a BlueROV2 chassis with the BR2 bottom-Newton adapter. Recover an instrumented test artefact from a 5 m sand-bottom site.</w:t>
       </w:r>
     </w:p>
     <w:p>
@@ -33719,7 +33719,7 @@
           <w:sz w:val="22"/>
           <w:szCs w:val="22"/>
         </w:rPr>
-        <w:t xml:space="preserve">Korea Open Invitational, Seoul, July 2026. Present SoftSense, the simulation campaign behind it, and the bench-validated calibration curve from the actuator-as-sensor work.</w:t>
+        <w:t xml:space="preserve">Korea Open Invitational, Seoul, July 2026. We'll present SoftSense, the simulation campaign behind it, and the bench-validated calibration curve from the actuator-as-sensor work.</w:t>
       </w:r>
     </w:p>
     <w:p>
@@ -33742,7 +33742,7 @@
           <w:sz w:val="22"/>
           <w:szCs w:val="22"/>
         </w:rPr>
-        <w:t xml:space="preserve">Re-run the scale-up at full resolution and choose a deployment size. </w:t>
+        <w:t xml:space="preserve">Re-run the scale-up at full resolution and pick a deployment size. </w:t>
       </w:r>
       <w:r>
         <w:rPr>
@@ -33755,7 +33755,7 @@
           <w:sz w:val="22"/>
           <w:szCs w:val="22"/>
         </w:rPr>
-        <w:t xml:space="preserve">Repeat the 1.5× and 2.0× FEA on the render node with a fresh blade-only control, and decide a production size with the proposed gear re-size folded in, so reach and squeezing strength are settled together.</w:t>
+        <w:t xml:space="preserve">Repeat the 1.5× and 2.0× FEA on the render node with a fresh blade-only control, then settle on a production size with the proposed gear re-size folded in, so reach and squeezing strength get decided together.</w:t>
       </w:r>
     </w:p>
     <w:p>
@@ -33811,7 +33811,7 @@
     </w:p>
     <w:p>
       <w:pPr>
-        <w:spacing w:after="100" w:before="0" w:line="300"/>
+        <w:spacing w:after="150" w:before="0" w:line="330"/>
       </w:pPr>
       <w:r>
         <w:rPr>
@@ -33824,7 +33824,7 @@
           <w:sz w:val="22"/>
           <w:szCs w:val="22"/>
         </w:rPr>
-        <w:t xml:space="preserve">Every coefficient and ordering in this report traces to a published source or a reproducible simulation. The literature behind the grip-texture model:</w:t>
+        <w:t xml:space="preserve">Every coefficient and ordering in this report traces back to a published source or a reproducible simulation. Here's the literature behind the grip-texture model:</w:t>
       </w:r>
     </w:p>
     <w:p>
@@ -33932,7 +33932,7 @@
           <w:sz w:val="22"/>
           <w:szCs w:val="22"/>
         </w:rPr>
-        <w:t xml:space="preserve">(2006 to 2013). Tree-frog hexagonal wet adhesion; the hexpad ordering precedent.</w:t>
+        <w:t xml:space="preserve">(2006 to 2013). Tree-frog hexagonal wet adhesion; the precedent for the hexpad ordering.</w:t>
       </w:r>
     </w:p>
     <w:p>
@@ -34063,7 +34063,7 @@
           <w:sz w:val="22"/>
           <w:szCs w:val="22"/>
         </w:rPr>
-        <w:t>Bambu TPU 95A HF Technical Data Sheet V1.0: ISO 527 printed-specimen Young’s modulus 9.8 / 7.4 MPa and tensile strength 27.3 / 22.3 MPa (in-plane / through-Z), elongation above 650 %, density 1.22, water absorption 1.08 %, nozzle 220 to 240 °C, bed 30 to 35 °C, dry 70 °C for 8 h, max volumetric flow about 12 mm³/s.</w:t>
+        <w:t xml:space="preserve">Bambu TPU 95A HF Technical Data Sheet V1.0: ISO 527 printed-specimen Young’s modulus 9.8 / 7.4 MPa and tensile strength 27.3 / 22.3 MPa (in-plane / through-Z), elongation above 650 %, density 1.22, water absorption 1.08 %, nozzle 220 to 240 °C, bed 30 to 35 °C, dry 70 °C for 8 h, and max volumetric flow about 12 mm³/s.</w:t>
       </w:r>
     </w:p>
     <w:p>
@@ -34673,7 +34673,7 @@
           <w:sz w:val="22"/>
           <w:szCs w:val="22"/>
         </w:rPr>
-        <w:t xml:space="preserve">for STL audit (watertight, winding, body count, volume, degenerate-face check).</w:t>
+        <w:t xml:space="preserve">for STL audit (watertight, winding, body count, volume, and degenerate-face check).</w:t>
       </w:r>
     </w:p>
     <w:p>
@@ -34795,7 +34795,7 @@
           <w:sz w:val="22"/>
           <w:szCs w:val="22"/>
         </w:rPr>
-        <w:t xml:space="preserve">Onshape CAD: cad.onshape.com/documents/47a3be0d6a2fdc65e8e54697 (live, every revision logged)</w:t>
+        <w:t xml:space="preserve">Onshape CAD: cad.onshape.com/documents/47a3be0d6a2fdc65e8e54697 (live, with every revision logged)</w:t>
       </w:r>
     </w:p>
     <w:sectPr>

</xml_diff>